<commit_message>
added question validation llm prompt
</commit_message>
<xml_diff>
--- a/Project_details.docx
+++ b/Project_details.docx
@@ -655,8 +655,8 @@
         <w:tblLook w:val="04A0" w:firstRow="1" w:lastRow="0" w:firstColumn="1" w:lastColumn="0" w:noHBand="0" w:noVBand="1"/>
       </w:tblPr>
       <w:tblGrid>
-        <w:gridCol w:w="5580"/>
-        <w:gridCol w:w="4886"/>
+        <w:gridCol w:w="5989"/>
+        <w:gridCol w:w="5197"/>
       </w:tblGrid>
       <w:tr>
         <w:trPr>
@@ -1011,79 +1011,8 @@
                 <w:szCs w:val="20"/>
                 <w:lang w:eastAsia="en-IN"/>
               </w:rPr>
-              <w:t xml:space="preserve">src/corpus/clean_text.py --input </w:t>
+              <w:t>src/corpus/clean_text.py --input data_random/cleaned_text --output data_random/cleaned_text_final</w:t>
             </w:r>
-            <w:proofErr w:type="spellStart"/>
-            <w:r>
-              <w:rPr>
-                <w:rFonts w:ascii="Courier New" w:eastAsia="Times New Roman" w:hAnsi="Courier New" w:cs="Courier New"/>
-                <w:sz w:val="20"/>
-                <w:szCs w:val="20"/>
-                <w:lang w:eastAsia="en-IN"/>
-              </w:rPr>
-              <w:t>data_random</w:t>
-            </w:r>
-            <w:proofErr w:type="spellEnd"/>
-            <w:r>
-              <w:rPr>
-                <w:rFonts w:ascii="Courier New" w:eastAsia="Times New Roman" w:hAnsi="Courier New" w:cs="Courier New"/>
-                <w:sz w:val="20"/>
-                <w:szCs w:val="20"/>
-                <w:lang w:eastAsia="en-IN"/>
-              </w:rPr>
-              <w:t>/</w:t>
-            </w:r>
-            <w:proofErr w:type="spellStart"/>
-            <w:r>
-              <w:rPr>
-                <w:rFonts w:ascii="Courier New" w:eastAsia="Times New Roman" w:hAnsi="Courier New" w:cs="Courier New"/>
-                <w:sz w:val="20"/>
-                <w:szCs w:val="20"/>
-                <w:lang w:eastAsia="en-IN"/>
-              </w:rPr>
-              <w:t>cleaned_text</w:t>
-            </w:r>
-            <w:proofErr w:type="spellEnd"/>
-            <w:r>
-              <w:rPr>
-                <w:rFonts w:ascii="Courier New" w:eastAsia="Times New Roman" w:hAnsi="Courier New" w:cs="Courier New"/>
-                <w:sz w:val="20"/>
-                <w:szCs w:val="20"/>
-                <w:lang w:eastAsia="en-IN"/>
-              </w:rPr>
-              <w:t xml:space="preserve"> --output </w:t>
-            </w:r>
-            <w:proofErr w:type="spellStart"/>
-            <w:r>
-              <w:rPr>
-                <w:rFonts w:ascii="Courier New" w:eastAsia="Times New Roman" w:hAnsi="Courier New" w:cs="Courier New"/>
-                <w:sz w:val="20"/>
-                <w:szCs w:val="20"/>
-                <w:lang w:eastAsia="en-IN"/>
-              </w:rPr>
-              <w:t>data_random</w:t>
-            </w:r>
-            <w:proofErr w:type="spellEnd"/>
-            <w:r>
-              <w:rPr>
-                <w:rFonts w:ascii="Courier New" w:eastAsia="Times New Roman" w:hAnsi="Courier New" w:cs="Courier New"/>
-                <w:sz w:val="20"/>
-                <w:szCs w:val="20"/>
-                <w:lang w:eastAsia="en-IN"/>
-              </w:rPr>
-              <w:t>/</w:t>
-            </w:r>
-            <w:proofErr w:type="spellStart"/>
-            <w:r>
-              <w:rPr>
-                <w:rFonts w:ascii="Courier New" w:eastAsia="Times New Roman" w:hAnsi="Courier New" w:cs="Courier New"/>
-                <w:sz w:val="20"/>
-                <w:szCs w:val="20"/>
-                <w:lang w:eastAsia="en-IN"/>
-              </w:rPr>
-              <w:t>cleaned_text_final</w:t>
-            </w:r>
-            <w:proofErr w:type="spellEnd"/>
           </w:p>
         </w:tc>
         <w:tc>
@@ -1141,39 +1070,8 @@
                 <w:szCs w:val="20"/>
                 <w:lang w:eastAsia="en-IN"/>
               </w:rPr>
-              <w:t>src/corpus/clean_text.py --input data/</w:t>
+              <w:t>src/corpus/clean_text.py --input data/cleaned_text --output data/cleaned_text_final</w:t>
             </w:r>
-            <w:proofErr w:type="spellStart"/>
-            <w:r>
-              <w:rPr>
-                <w:rFonts w:ascii="Courier New" w:eastAsia="Times New Roman" w:hAnsi="Courier New" w:cs="Courier New"/>
-                <w:sz w:val="20"/>
-                <w:szCs w:val="20"/>
-                <w:lang w:eastAsia="en-IN"/>
-              </w:rPr>
-              <w:t>cleaned_text</w:t>
-            </w:r>
-            <w:proofErr w:type="spellEnd"/>
-            <w:r>
-              <w:rPr>
-                <w:rFonts w:ascii="Courier New" w:eastAsia="Times New Roman" w:hAnsi="Courier New" w:cs="Courier New"/>
-                <w:sz w:val="20"/>
-                <w:szCs w:val="20"/>
-                <w:lang w:eastAsia="en-IN"/>
-              </w:rPr>
-              <w:t xml:space="preserve"> --output data/</w:t>
-            </w:r>
-            <w:proofErr w:type="spellStart"/>
-            <w:r>
-              <w:rPr>
-                <w:rFonts w:ascii="Courier New" w:eastAsia="Times New Roman" w:hAnsi="Courier New" w:cs="Courier New"/>
-                <w:sz w:val="20"/>
-                <w:szCs w:val="20"/>
-                <w:lang w:eastAsia="en-IN"/>
-              </w:rPr>
-              <w:t>cleaned_text_final</w:t>
-            </w:r>
-            <w:proofErr w:type="spellEnd"/>
           </w:p>
         </w:tc>
         <w:tc>
@@ -1267,19 +1165,8 @@
                 <w:szCs w:val="20"/>
                 <w:lang w:eastAsia="en-IN"/>
               </w:rPr>
-              <w:t>.</w:t>
+              <w:t>.jsonl</w:t>
             </w:r>
-            <w:proofErr w:type="spellStart"/>
-            <w:r>
-              <w:rPr>
-                <w:rFonts w:ascii="Courier New" w:eastAsia="Times New Roman" w:hAnsi="Courier New" w:cs="Courier New"/>
-                <w:sz w:val="20"/>
-                <w:szCs w:val="20"/>
-                <w:lang w:eastAsia="en-IN"/>
-              </w:rPr>
-              <w:t>jsonl</w:t>
-            </w:r>
-            <w:proofErr w:type="spellEnd"/>
             <w:r>
               <w:rPr>
                 <w:rFonts w:ascii="Times New Roman" w:eastAsia="Times New Roman" w:hAnsi="Times New Roman" w:cs="Times New Roman"/>
@@ -1432,19 +1319,8 @@
                 <w:szCs w:val="20"/>
                 <w:lang w:eastAsia="en-IN"/>
               </w:rPr>
-              <w:t>data/</w:t>
+              <w:t>data/embeddings_merged.jsonl</w:t>
             </w:r>
-            <w:proofErr w:type="spellStart"/>
-            <w:r>
-              <w:rPr>
-                <w:rFonts w:ascii="Courier New" w:eastAsia="Times New Roman" w:hAnsi="Courier New" w:cs="Courier New"/>
-                <w:sz w:val="20"/>
-                <w:szCs w:val="20"/>
-                <w:lang w:eastAsia="en-IN"/>
-              </w:rPr>
-              <w:t>embeddings_merged.jsonl</w:t>
-            </w:r>
-            <w:proofErr w:type="spellEnd"/>
           </w:p>
         </w:tc>
       </w:tr>
@@ -1513,7 +1389,6 @@
           <w:szCs w:val="24"/>
           <w:lang w:eastAsia="en-IN"/>
         </w:rPr>
-        <w:lastRenderedPageBreak/>
         <w:t xml:space="preserve">The retrieval system combines </w:t>
       </w:r>
       <w:r>
@@ -1599,6 +1474,7 @@
           <w:szCs w:val="27"/>
           <w:lang w:eastAsia="en-IN"/>
         </w:rPr>
+        <w:lastRenderedPageBreak/>
         <w:t>Retrieval &amp; Generation</w:t>
       </w:r>
     </w:p>
@@ -2062,7 +1938,6 @@
                 <w:lang w:eastAsia="en-IN"/>
               </w:rPr>
             </w:pPr>
-            <w:proofErr w:type="spellStart"/>
             <w:r>
               <w:rPr>
                 <w:rFonts w:ascii="Courier New" w:eastAsia="Times New Roman" w:hAnsi="Courier New" w:cs="Courier New"/>
@@ -2070,17 +1945,7 @@
                 <w:szCs w:val="20"/>
                 <w:lang w:eastAsia="en-IN"/>
               </w:rPr>
-              <w:t>streamlit</w:t>
-            </w:r>
-            <w:proofErr w:type="spellEnd"/>
-            <w:r>
-              <w:rPr>
-                <w:rFonts w:ascii="Courier New" w:eastAsia="Times New Roman" w:hAnsi="Courier New" w:cs="Courier New"/>
-                <w:sz w:val="20"/>
-                <w:szCs w:val="20"/>
-                <w:lang w:eastAsia="en-IN"/>
-              </w:rPr>
-              <w:t xml:space="preserve"> run app/app.py</w:t>
+              <w:t>streamlit run app/app.py</w:t>
             </w:r>
           </w:p>
         </w:tc>
@@ -2239,7 +2104,7 @@
       </w:tblPr>
       <w:tblGrid>
         <w:gridCol w:w="4516"/>
-        <w:gridCol w:w="5950"/>
+        <w:gridCol w:w="6670"/>
       </w:tblGrid>
       <w:tr>
         <w:trPr>
@@ -2753,27 +2618,10 @@
     </w:p>
     <w:p>
       <w:pPr>
-        <w:spacing w:before="100" w:beforeAutospacing="1" w:after="100" w:afterAutospacing="1" w:line="240" w:lineRule="auto"/>
-        <w:outlineLvl w:val="1"/>
-        <w:rPr>
-          <w:rFonts w:ascii="Times New Roman" w:eastAsia="Times New Roman" w:hAnsi="Times New Roman" w:cs="Times New Roman"/>
-          <w:b/>
-          <w:bCs/>
-          <w:sz w:val="36"/>
-          <w:szCs w:val="36"/>
-          <w:lang w:eastAsia="en-IN"/>
-        </w:rPr>
-      </w:pPr>
-      <w:r>
-        <w:rPr>
-          <w:rFonts w:ascii="Times New Roman" w:eastAsia="Times New Roman" w:hAnsi="Times New Roman" w:cs="Times New Roman"/>
-          <w:b/>
-          <w:bCs/>
-          <w:sz w:val="36"/>
-          <w:szCs w:val="36"/>
-          <w:lang w:eastAsia="en-IN"/>
-        </w:rPr>
-        <w:t>User Interface</w:t>
+        <w:pStyle w:val="Heading2"/>
+      </w:pPr>
+      <w:r>
+        <w:t>Local Web Application User Interface Initialization</w:t>
       </w:r>
     </w:p>
     <w:p>
@@ -2818,21 +2666,7 @@
         <w:rPr>
           <w:lang w:eastAsia="en-IN"/>
         </w:rPr>
-        <w:t xml:space="preserve">At </w:t>
-      </w:r>
-      <w:proofErr w:type="spellStart"/>
-      <w:r>
-        <w:rPr>
-          <w:lang w:eastAsia="en-IN"/>
-        </w:rPr>
-        <w:t>vscode</w:t>
-      </w:r>
-      <w:proofErr w:type="spellEnd"/>
-      <w:r>
-        <w:rPr>
-          <w:lang w:eastAsia="en-IN"/>
-        </w:rPr>
-        <w:t xml:space="preserve"> prompt change directory to  path within </w:t>
+        <w:t xml:space="preserve">At vscode prompt change directory to  path within </w:t>
       </w:r>
       <w:r>
         <w:rPr>
@@ -2856,30 +2690,8 @@
         <w:rPr>
           <w:lang w:eastAsia="en-IN"/>
         </w:rPr>
-        <w:t xml:space="preserve">Ensure </w:t>
-      </w:r>
-      <w:proofErr w:type="spellStart"/>
-      <w:r>
-        <w:rPr>
-          <w:lang w:eastAsia="en-IN"/>
-        </w:rPr>
-        <w:t>streamlit</w:t>
-      </w:r>
-      <w:proofErr w:type="spellEnd"/>
-      <w:r>
-        <w:rPr>
-          <w:lang w:eastAsia="en-IN"/>
-        </w:rPr>
-        <w:t xml:space="preserve"> package is installed, if not run !pip install </w:t>
-      </w:r>
-      <w:proofErr w:type="spellStart"/>
-      <w:r>
-        <w:rPr>
-          <w:lang w:eastAsia="en-IN"/>
-        </w:rPr>
-        <w:t>streamlit</w:t>
-      </w:r>
-      <w:proofErr w:type="spellEnd"/>
+        <w:t>Ensure streamlit package is installed, if not run !pip install streamlit</w:t>
+      </w:r>
     </w:p>
     <w:tbl>
       <w:tblPr>
@@ -2927,7 +2739,6 @@
               </w:rPr>
               <w:t xml:space="preserve">Run command : </w:t>
             </w:r>
-            <w:proofErr w:type="spellStart"/>
             <w:r>
               <w:rPr>
                 <w:rFonts w:ascii="Courier New" w:eastAsia="Times New Roman" w:hAnsi="Courier New" w:cs="Courier New"/>
@@ -2935,17 +2746,7 @@
                 <w:szCs w:val="20"/>
                 <w:lang w:eastAsia="en-IN"/>
               </w:rPr>
-              <w:t>streamlit</w:t>
-            </w:r>
-            <w:proofErr w:type="spellEnd"/>
-            <w:r>
-              <w:rPr>
-                <w:rFonts w:ascii="Courier New" w:eastAsia="Times New Roman" w:hAnsi="Courier New" w:cs="Courier New"/>
-                <w:sz w:val="20"/>
-                <w:szCs w:val="20"/>
-                <w:lang w:eastAsia="en-IN"/>
-              </w:rPr>
-              <w:t xml:space="preserve"> run app/app.py</w:t>
+              <w:t>streamlit run app/app.py</w:t>
             </w:r>
           </w:p>
         </w:tc>
@@ -3347,21 +3148,7 @@
         <w:rPr>
           <w:lang w:val="en-US"/>
         </w:rPr>
-        <w:t xml:space="preserve">     This works by encoding both the predicted answer and the gold answer into dense vector representations using the </w:t>
-      </w:r>
-      <w:proofErr w:type="spellStart"/>
-      <w:r>
-        <w:rPr>
-          <w:lang w:val="en-US"/>
-        </w:rPr>
-        <w:t>SentenceTransformer</w:t>
-      </w:r>
-      <w:proofErr w:type="spellEnd"/>
-      <w:r>
-        <w:rPr>
-          <w:lang w:val="en-US"/>
-        </w:rPr>
-        <w:t xml:space="preserve"> model, and then computing the cosine similarity between these two vectors.</w:t>
+        <w:t>     This works by encoding both the predicted answer and the gold answer into dense vector representations using the SentenceTransformer model, and then computing the cosine similarity between these two vectors.</w:t>
       </w:r>
     </w:p>
     <w:p>
@@ -3426,21 +3213,7 @@
         <w:rPr>
           <w:lang w:val="en-US"/>
         </w:rPr>
-        <w:t xml:space="preserve">    :param gold: ground truth from a set of questions with known answers. Questions are </w:t>
-      </w:r>
-      <w:proofErr w:type="spellStart"/>
-      <w:r>
-        <w:rPr>
-          <w:lang w:val="en-US"/>
-        </w:rPr>
-        <w:t>generatred</w:t>
-      </w:r>
-      <w:proofErr w:type="spellEnd"/>
-      <w:r>
-        <w:rPr>
-          <w:lang w:val="en-US"/>
-        </w:rPr>
-        <w:t xml:space="preserve"> using SLM (Google Flan-T5-Base) supplying random retrieved chunks as context</w:t>
+        <w:t>    :param gold: ground truth from a set of questions with known answers. Questions are generatred using SLM (Google Flan-T5-Base) supplying random retrieved chunks as context</w:t>
       </w:r>
     </w:p>
     <w:p>
@@ -3663,21 +3436,7 @@
         <w:rPr>
           <w:lang w:val="en-US"/>
         </w:rPr>
-        <w:t xml:space="preserve">    Advantage over </w:t>
-      </w:r>
-      <w:proofErr w:type="spellStart"/>
-      <w:r>
-        <w:rPr>
-          <w:lang w:val="en-US"/>
-        </w:rPr>
-        <w:t>precision@k</w:t>
-      </w:r>
-      <w:proofErr w:type="spellEnd"/>
-      <w:r>
-        <w:rPr>
-          <w:lang w:val="en-US"/>
-        </w:rPr>
-        <w:t xml:space="preserve"> is that it gives more weight to chunks that are more relevant (have higher token overlap) rather than treating all supporting chunks equally.</w:t>
+        <w:t>    Advantage over precision@k is that it gives more weight to chunks that are more relevant (have higher token overlap) rather than treating all supporting chunks equally.</w:t>
       </w:r>
       <w:r>
         <w:rPr>
@@ -3728,48 +3487,20 @@
         <w:rPr>
           <w:lang w:val="en-US"/>
         </w:rPr>
-        <w:t xml:space="preserve">    # 1. remove </w:t>
-      </w:r>
-      <w:proofErr w:type="spellStart"/>
-      <w:r>
-        <w:rPr>
-          <w:lang w:val="en-US"/>
-        </w:rPr>
-        <w:t>stopwords</w:t>
-      </w:r>
-      <w:proofErr w:type="spellEnd"/>
-      <w:r>
-        <w:rPr>
-          <w:lang w:val="en-US"/>
-        </w:rPr>
-        <w:t xml:space="preserve"> from answer and chunk text</w:t>
-      </w:r>
-    </w:p>
-    <w:p>
-      <w:pPr>
-        <w:rPr>
-          <w:lang w:val="en-US"/>
-        </w:rPr>
-      </w:pPr>
-      <w:r>
-        <w:rPr>
-          <w:lang w:val="en-US"/>
-        </w:rPr>
-        <w:t xml:space="preserve">    # 2. use </w:t>
-      </w:r>
-      <w:proofErr w:type="spellStart"/>
-      <w:r>
-        <w:rPr>
-          <w:lang w:val="en-US"/>
-        </w:rPr>
-        <w:t>PorterStemmer</w:t>
-      </w:r>
-      <w:proofErr w:type="spellEnd"/>
-      <w:r>
-        <w:rPr>
-          <w:lang w:val="en-US"/>
-        </w:rPr>
-        <w:t xml:space="preserve"> to stem tokens</w:t>
+        <w:t>    # 1. remove stopwords from answer and chunk text</w:t>
+      </w:r>
+    </w:p>
+    <w:p>
+      <w:pPr>
+        <w:rPr>
+          <w:lang w:val="en-US"/>
+        </w:rPr>
+      </w:pPr>
+      <w:r>
+        <w:rPr>
+          <w:lang w:val="en-US"/>
+        </w:rPr>
+        <w:t>    # 2. use PorterStemmer to stem tokens</w:t>
       </w:r>
     </w:p>
     <w:p>
@@ -3816,18 +3547,8 @@
           <w:bCs/>
           <w:lang w:val="en-US"/>
         </w:rPr>
-        <w:t xml:space="preserve">. </w:t>
-      </w:r>
-      <w:proofErr w:type="spellStart"/>
-      <w:r>
-        <w:rPr>
-          <w:b/>
-          <w:bCs/>
-          <w:lang w:val="en-US"/>
-        </w:rPr>
-        <w:t>precision@k</w:t>
-      </w:r>
-      <w:proofErr w:type="spellEnd"/>
+        <w:t>. precision@k</w:t>
+      </w:r>
       <w:r>
         <w:rPr>
           <w:lang w:val="en-US"/>
@@ -3877,48 +3598,20 @@
         <w:rPr>
           <w:lang w:val="en-US"/>
         </w:rPr>
-        <w:t xml:space="preserve">    :param </w:t>
-      </w:r>
-      <w:proofErr w:type="spellStart"/>
-      <w:r>
-        <w:rPr>
-          <w:lang w:val="en-US"/>
-        </w:rPr>
-        <w:t>ranked_chunk_ids</w:t>
-      </w:r>
-      <w:proofErr w:type="spellEnd"/>
-      <w:r>
-        <w:rPr>
-          <w:lang w:val="en-US"/>
-        </w:rPr>
-        <w:t>: List of chunk IDs in descending order of relevance.</w:t>
-      </w:r>
-    </w:p>
-    <w:p>
-      <w:pPr>
-        <w:rPr>
-          <w:lang w:val="en-US"/>
-        </w:rPr>
-      </w:pPr>
-      <w:r>
-        <w:rPr>
-          <w:lang w:val="en-US"/>
-        </w:rPr>
-        <w:t xml:space="preserve">    :param </w:t>
-      </w:r>
-      <w:proofErr w:type="spellStart"/>
-      <w:r>
-        <w:rPr>
-          <w:lang w:val="en-US"/>
-        </w:rPr>
-        <w:t>supporting_chunk_ids</w:t>
-      </w:r>
-      <w:proofErr w:type="spellEnd"/>
-      <w:r>
-        <w:rPr>
-          <w:lang w:val="en-US"/>
-        </w:rPr>
-        <w:t>: Set of chunk IDs that support the answer.</w:t>
+        <w:t>    :param ranked_chunk_ids: List of chunk IDs in descending order of relevance.</w:t>
+      </w:r>
+    </w:p>
+    <w:p>
+      <w:pPr>
+        <w:rPr>
+          <w:lang w:val="en-US"/>
+        </w:rPr>
+      </w:pPr>
+      <w:r>
+        <w:rPr>
+          <w:lang w:val="en-US"/>
+        </w:rPr>
+        <w:t>    :param supporting_chunk_ids: Set of chunk IDs that support the answer.</w:t>
       </w:r>
     </w:p>
     <w:p>
@@ -4009,35 +3702,7 @@
         <w:rPr>
           <w:lang w:val="en-US"/>
         </w:rPr>
-        <w:t xml:space="preserve">For Retrieval quality , we use </w:t>
-      </w:r>
-      <w:proofErr w:type="spellStart"/>
-      <w:r>
-        <w:rPr>
-          <w:lang w:val="en-US"/>
-        </w:rPr>
-        <w:t>precision@k</w:t>
-      </w:r>
-      <w:proofErr w:type="spellEnd"/>
-      <w:r>
-        <w:rPr>
-          <w:lang w:val="en-US"/>
-        </w:rPr>
-        <w:t xml:space="preserve"> to understand the </w:t>
-      </w:r>
-      <w:proofErr w:type="spellStart"/>
-      <w:r>
-        <w:rPr>
-          <w:lang w:val="en-US"/>
-        </w:rPr>
-        <w:t>over all</w:t>
-      </w:r>
-      <w:proofErr w:type="spellEnd"/>
-      <w:r>
-        <w:rPr>
-          <w:lang w:val="en-US"/>
-        </w:rPr>
-        <w:t xml:space="preserve"> quality of retrieved k-chunks. The more chunks we retrieve and supply to SLM involves more cost in terms of time, resource and tokens used. Given different values of K we try to determine at what K precision tends to 1. Here it seems 3 -5 is a good number</w:t>
+        <w:t>For Retrieval quality , we use precision@k to understand the over all quality of retrieved k-chunks. The more chunks we retrieve and supply to SLM involves more cost in terms of time, resource and tokens used. Given different values of K we try to determine at what K precision tends to 1. Here it seems 3 -5 is a good number</w:t>
       </w:r>
     </w:p>
     <w:p>
@@ -4056,21 +3721,7 @@
         <w:rPr>
           <w:lang w:val="en-US"/>
         </w:rPr>
-        <w:t xml:space="preserve">, it does not account for the ranking, which </w:t>
-      </w:r>
-      <w:proofErr w:type="spellStart"/>
-      <w:r>
-        <w:rPr>
-          <w:lang w:val="en-US"/>
-        </w:rPr>
-        <w:t>NDCG@k</w:t>
-      </w:r>
-      <w:proofErr w:type="spellEnd"/>
-      <w:r>
-        <w:rPr>
-          <w:lang w:val="en-US"/>
-        </w:rPr>
-        <w:t xml:space="preserve"> does, this helped, when tweaking the RRF calculation especially for hybrid retrieval</w:t>
+        <w:t>, it does not account for the ranking, which NDCG@k does, this helped, when tweaking the RRF calculation especially for hybrid retrieval</w:t>
       </w:r>
     </w:p>
     <w:p>
@@ -4424,8 +4075,1709 @@
     </w:p>
     <w:p>
       <w:pPr>
+        <w:rPr>
+          <w:lang w:val="en-US"/>
+        </w:rPr>
+      </w:pPr>
+    </w:p>
+    <w:p>
+      <w:pPr>
+        <w:pStyle w:val="Heading2"/>
+      </w:pPr>
+      <w:r>
+        <w:t>Ablation:</w:t>
+      </w:r>
+    </w:p>
+    <w:p>
+      <w:r>
+        <w:t>We start with initial k = 10 for hybrid, dense and sparse, then try reducing k to get optimised retrieval with low latency. Arrive at k hybrid = 3, k dense and k sparse =</w:t>
+      </w:r>
+      <w:r>
+        <w:t>3</w:t>
+      </w:r>
+      <w:r>
+        <w:t xml:space="preserve">. Essentially top </w:t>
+      </w:r>
+      <w:r>
+        <w:t>3</w:t>
+      </w:r>
+      <w:r>
+        <w:t xml:space="preserve"> of dense and sparse are RRF ranked, and top 3 RRF ranked chunks are used to generate answers in the final hybrid solution</w:t>
+      </w:r>
+    </w:p>
+    <w:p>
+      <w:pPr>
         <w:pStyle w:val="Heading4"/>
       </w:pPr>
+      <w:r>
+        <w:t>Ablation result at k =10</w:t>
+      </w:r>
+      <w:r>
+        <w:drawing>
+          <wp:inline distT="0" distB="0" distL="0" distR="0" wp14:anchorId="7170338C" wp14:editId="1438220C">
+            <wp:extent cx="7103110" cy="506730"/>
+            <wp:effectExtent l="0" t="0" r="2540" b="7620"/>
+            <wp:docPr id="1742260363" name="Picture 1"/>
+            <wp:cNvGraphicFramePr>
+              <a:graphicFrameLocks xmlns:a="http://schemas.openxmlformats.org/drawingml/2006/main" noChangeAspect="1"/>
+            </wp:cNvGraphicFramePr>
+            <a:graphic xmlns:a="http://schemas.openxmlformats.org/drawingml/2006/main">
+              <a:graphicData uri="http://schemas.openxmlformats.org/drawingml/2006/picture">
+                <pic:pic xmlns:pic="http://schemas.openxmlformats.org/drawingml/2006/picture">
+                  <pic:nvPicPr>
+                    <pic:cNvPr id="1742260363" name=""/>
+                    <pic:cNvPicPr/>
+                  </pic:nvPicPr>
+                  <pic:blipFill>
+                    <a:blip r:embed="rId15"/>
+                    <a:stretch>
+                      <a:fillRect/>
+                    </a:stretch>
+                  </pic:blipFill>
+                  <pic:spPr>
+                    <a:xfrm>
+                      <a:off x="0" y="0"/>
+                      <a:ext cx="7103110" cy="506730"/>
+                    </a:xfrm>
+                    <a:prstGeom prst="rect">
+                      <a:avLst/>
+                    </a:prstGeom>
+                  </pic:spPr>
+                </pic:pic>
+              </a:graphicData>
+            </a:graphic>
+          </wp:inline>
+        </w:drawing>
+      </w:r>
+    </w:p>
+    <w:p>
+      <w:pPr>
+        <w:pStyle w:val="Heading4"/>
+      </w:pPr>
+      <w:r>
+        <w:t>Ablation result at k = 5</w:t>
+      </w:r>
+    </w:p>
+    <w:p/>
+    <w:p>
+      <w:r>
+        <w:lastRenderedPageBreak/>
+        <w:drawing>
+          <wp:inline distT="0" distB="0" distL="0" distR="0" wp14:anchorId="30B086A2" wp14:editId="3122C514">
+            <wp:extent cx="7103110" cy="428625"/>
+            <wp:effectExtent l="0" t="0" r="2540" b="9525"/>
+            <wp:docPr id="1332507263" name="Picture 1"/>
+            <wp:cNvGraphicFramePr>
+              <a:graphicFrameLocks xmlns:a="http://schemas.openxmlformats.org/drawingml/2006/main" noChangeAspect="1"/>
+            </wp:cNvGraphicFramePr>
+            <a:graphic xmlns:a="http://schemas.openxmlformats.org/drawingml/2006/main">
+              <a:graphicData uri="http://schemas.openxmlformats.org/drawingml/2006/picture">
+                <pic:pic xmlns:pic="http://schemas.openxmlformats.org/drawingml/2006/picture">
+                  <pic:nvPicPr>
+                    <pic:cNvPr id="1332507263" name=""/>
+                    <pic:cNvPicPr/>
+                  </pic:nvPicPr>
+                  <pic:blipFill>
+                    <a:blip r:embed="rId16"/>
+                    <a:stretch>
+                      <a:fillRect/>
+                    </a:stretch>
+                  </pic:blipFill>
+                  <pic:spPr>
+                    <a:xfrm>
+                      <a:off x="0" y="0"/>
+                      <a:ext cx="7103110" cy="428625"/>
+                    </a:xfrm>
+                    <a:prstGeom prst="rect">
+                      <a:avLst/>
+                    </a:prstGeom>
+                  </pic:spPr>
+                </pic:pic>
+              </a:graphicData>
+            </a:graphic>
+          </wp:inline>
+        </w:drawing>
+      </w:r>
+    </w:p>
+    <w:p>
+      <w:pPr>
+        <w:pStyle w:val="Heading4"/>
+      </w:pPr>
+      <w:r>
+        <w:t>Ablation result at k=3</w:t>
+      </w:r>
+    </w:p>
+    <w:p>
+      <w:r>
+        <w:t>For k hybrid =3 and k dense, k sparse at 3 as well, while MRR and NDCG values are similar</w:t>
+      </w:r>
+    </w:p>
+    <w:p>
+      <w:r>
+        <w:drawing>
+          <wp:inline distT="0" distB="0" distL="0" distR="0" wp14:anchorId="4EE3DDB3" wp14:editId="37BAA4FF">
+            <wp:extent cx="7103110" cy="447040"/>
+            <wp:effectExtent l="0" t="0" r="2540" b="0"/>
+            <wp:docPr id="621777607" name="Picture 1"/>
+            <wp:cNvGraphicFramePr>
+              <a:graphicFrameLocks xmlns:a="http://schemas.openxmlformats.org/drawingml/2006/main" noChangeAspect="1"/>
+            </wp:cNvGraphicFramePr>
+            <a:graphic xmlns:a="http://schemas.openxmlformats.org/drawingml/2006/main">
+              <a:graphicData uri="http://schemas.openxmlformats.org/drawingml/2006/picture">
+                <pic:pic xmlns:pic="http://schemas.openxmlformats.org/drawingml/2006/picture">
+                  <pic:nvPicPr>
+                    <pic:cNvPr id="621777607" name=""/>
+                    <pic:cNvPicPr/>
+                  </pic:nvPicPr>
+                  <pic:blipFill>
+                    <a:blip r:embed="rId17"/>
+                    <a:stretch>
+                      <a:fillRect/>
+                    </a:stretch>
+                  </pic:blipFill>
+                  <pic:spPr>
+                    <a:xfrm>
+                      <a:off x="0" y="0"/>
+                      <a:ext cx="7103110" cy="447040"/>
+                    </a:xfrm>
+                    <a:prstGeom prst="rect">
+                      <a:avLst/>
+                    </a:prstGeom>
+                  </pic:spPr>
+                </pic:pic>
+              </a:graphicData>
+            </a:graphic>
+          </wp:inline>
+        </w:drawing>
+      </w:r>
+    </w:p>
+    <w:p>
+      <w:r>
+        <w:t xml:space="preserve">If we keep k hybrid = 3, k sparse and k dense at </w:t>
+      </w:r>
+      <w:r>
+        <w:t>3</w:t>
+      </w:r>
+      <w:r>
+        <w:t xml:space="preserve"> , the semantic similarity and AnswerF1 does slightly better. So we use these values for our hybrid retrieval solution.</w:t>
+      </w:r>
+      <w:r>
+        <w:t xml:space="preserve"> Also precion@3 and NDCG@3 is the highest</w:t>
+      </w:r>
+    </w:p>
+    <w:p/>
+    <w:p>
+      <w:pPr>
+        <w:pStyle w:val="Heading2"/>
+      </w:pPr>
+      <w:r>
+        <w:t>Input Validation</w:t>
+      </w:r>
+    </w:p>
+    <w:p>
+      <w:r>
+        <w:t>Basic check for valid question/query input implemented.</w:t>
+      </w:r>
+    </w:p>
+    <w:p>
+      <w:r>
+        <w:t>1. Sematic check for keywords, question marks etc to detect basic issues</w:t>
+      </w:r>
+    </w:p>
+    <w:p>
+      <w:pPr>
+        <w:rPr>
+          <w:lang w:val="en-US"/>
+        </w:rPr>
+      </w:pPr>
+      <w:r>
+        <w:t xml:space="preserve">2. </w:t>
+      </w:r>
+      <w:r>
+        <w:t xml:space="preserve">qchecker based on </w:t>
+      </w:r>
+      <w:r>
+        <w:rPr>
+          <w:lang w:val="en-US"/>
+        </w:rPr>
+        <w:t>google/flan-t5-base"</w:t>
+      </w:r>
+      <w:r>
+        <w:rPr>
+          <w:lang w:val="en-US"/>
+        </w:rPr>
+        <w:t xml:space="preserve"> with following prompt:</w:t>
+      </w:r>
+    </w:p>
+    <w:p>
+      <w:pPr>
+        <w:shd w:val="clear" w:color="auto" w:fill="1F1F1F"/>
+        <w:spacing w:after="0" w:line="285" w:lineRule="atLeast"/>
+        <w:rPr>
+          <w:rFonts w:ascii="Consolas" w:eastAsia="Times New Roman" w:hAnsi="Consolas" w:cs="Times New Roman"/>
+          <w:color w:val="CCCCCC"/>
+          <w:sz w:val="21"/>
+          <w:szCs w:val="21"/>
+          <w:lang w:val="en-US"/>
+        </w:rPr>
+      </w:pPr>
+      <w:r>
+        <w:rPr>
+          <w:rFonts w:ascii="Consolas" w:eastAsia="Times New Roman" w:hAnsi="Consolas" w:cs="Times New Roman"/>
+          <w:color w:val="CCCCCC"/>
+          <w:sz w:val="21"/>
+          <w:szCs w:val="21"/>
+          <w:lang w:val="en-US"/>
+        </w:rPr>
+        <w:t> </w:t>
+      </w:r>
+      <w:r>
+        <w:rPr>
+          <w:rFonts w:ascii="Consolas" w:eastAsia="Times New Roman" w:hAnsi="Consolas" w:cs="Times New Roman"/>
+          <w:color w:val="CE9178"/>
+          <w:sz w:val="21"/>
+          <w:szCs w:val="21"/>
+          <w:lang w:val="en-US"/>
+        </w:rPr>
+        <w:t>"You are a STRICT classifier. Your job is to determine whether the text is a well</w:t>
+      </w:r>
+      <w:r>
+        <w:rPr>
+          <w:rFonts w:ascii="Consolas" w:eastAsia="Times New Roman" w:hAnsi="Consolas" w:cs="Times New Roman"/>
+          <w:color w:val="CE9178"/>
+          <w:sz w:val="21"/>
+          <w:szCs w:val="21"/>
+          <w:lang w:val="en-US"/>
+        </w:rPr>
+        <w:noBreakHyphen/>
+        <w:t>formed question.</w:t>
+      </w:r>
+      <w:r>
+        <w:rPr>
+          <w:rFonts w:ascii="Consolas" w:eastAsia="Times New Roman" w:hAnsi="Consolas" w:cs="Times New Roman"/>
+          <w:color w:val="D7BA7D"/>
+          <w:sz w:val="21"/>
+          <w:szCs w:val="21"/>
+          <w:lang w:val="en-US"/>
+        </w:rPr>
+        <w:t>\n\n</w:t>
+      </w:r>
+      <w:r>
+        <w:rPr>
+          <w:rFonts w:ascii="Consolas" w:eastAsia="Times New Roman" w:hAnsi="Consolas" w:cs="Times New Roman"/>
+          <w:color w:val="CE9178"/>
+          <w:sz w:val="21"/>
+          <w:szCs w:val="21"/>
+          <w:lang w:val="en-US"/>
+        </w:rPr>
+        <w:t>"</w:t>
+      </w:r>
+    </w:p>
+    <w:p>
+      <w:pPr>
+        <w:shd w:val="clear" w:color="auto" w:fill="1F1F1F"/>
+        <w:spacing w:after="0" w:line="285" w:lineRule="atLeast"/>
+        <w:rPr>
+          <w:rFonts w:ascii="Consolas" w:eastAsia="Times New Roman" w:hAnsi="Consolas" w:cs="Times New Roman"/>
+          <w:color w:val="CCCCCC"/>
+          <w:sz w:val="21"/>
+          <w:szCs w:val="21"/>
+          <w:lang w:val="en-US"/>
+        </w:rPr>
+      </w:pPr>
+      <w:r>
+        <w:rPr>
+          <w:rFonts w:ascii="Consolas" w:eastAsia="Times New Roman" w:hAnsi="Consolas" w:cs="Times New Roman"/>
+          <w:color w:val="CCCCCC"/>
+          <w:sz w:val="21"/>
+          <w:szCs w:val="21"/>
+          <w:lang w:val="en-US"/>
+        </w:rPr>
+        <w:t xml:space="preserve">        </w:t>
+      </w:r>
+      <w:r>
+        <w:rPr>
+          <w:rFonts w:ascii="Consolas" w:eastAsia="Times New Roman" w:hAnsi="Consolas" w:cs="Times New Roman"/>
+          <w:color w:val="CE9178"/>
+          <w:sz w:val="21"/>
+          <w:szCs w:val="21"/>
+          <w:lang w:val="en-US"/>
+        </w:rPr>
+        <w:t>"A well</w:t>
+      </w:r>
+      <w:r>
+        <w:rPr>
+          <w:rFonts w:ascii="Consolas" w:eastAsia="Times New Roman" w:hAnsi="Consolas" w:cs="Times New Roman"/>
+          <w:color w:val="CE9178"/>
+          <w:sz w:val="21"/>
+          <w:szCs w:val="21"/>
+          <w:lang w:val="en-US"/>
+        </w:rPr>
+        <w:noBreakHyphen/>
+        <w:t>formed question MUST:</w:t>
+      </w:r>
+      <w:r>
+        <w:rPr>
+          <w:rFonts w:ascii="Consolas" w:eastAsia="Times New Roman" w:hAnsi="Consolas" w:cs="Times New Roman"/>
+          <w:color w:val="D7BA7D"/>
+          <w:sz w:val="21"/>
+          <w:szCs w:val="21"/>
+          <w:lang w:val="en-US"/>
+        </w:rPr>
+        <w:t>\n</w:t>
+      </w:r>
+      <w:r>
+        <w:rPr>
+          <w:rFonts w:ascii="Consolas" w:eastAsia="Times New Roman" w:hAnsi="Consolas" w:cs="Times New Roman"/>
+          <w:color w:val="CE9178"/>
+          <w:sz w:val="21"/>
+          <w:szCs w:val="21"/>
+          <w:lang w:val="en-US"/>
+        </w:rPr>
+        <w:t>"</w:t>
+      </w:r>
+    </w:p>
+    <w:p>
+      <w:pPr>
+        <w:shd w:val="clear" w:color="auto" w:fill="1F1F1F"/>
+        <w:spacing w:after="0" w:line="285" w:lineRule="atLeast"/>
+        <w:rPr>
+          <w:rFonts w:ascii="Consolas" w:eastAsia="Times New Roman" w:hAnsi="Consolas" w:cs="Times New Roman"/>
+          <w:color w:val="CCCCCC"/>
+          <w:sz w:val="21"/>
+          <w:szCs w:val="21"/>
+          <w:lang w:val="en-US"/>
+        </w:rPr>
+      </w:pPr>
+      <w:r>
+        <w:rPr>
+          <w:rFonts w:ascii="Consolas" w:eastAsia="Times New Roman" w:hAnsi="Consolas" w:cs="Times New Roman"/>
+          <w:color w:val="CCCCCC"/>
+          <w:sz w:val="21"/>
+          <w:szCs w:val="21"/>
+          <w:lang w:val="en-US"/>
+        </w:rPr>
+        <w:t xml:space="preserve">        </w:t>
+      </w:r>
+      <w:r>
+        <w:rPr>
+          <w:rFonts w:ascii="Consolas" w:eastAsia="Times New Roman" w:hAnsi="Consolas" w:cs="Times New Roman"/>
+          <w:color w:val="CE9178"/>
+          <w:sz w:val="21"/>
+          <w:szCs w:val="21"/>
+          <w:lang w:val="en-US"/>
+        </w:rPr>
+        <w:t>"- Ask for information</w:t>
+      </w:r>
+      <w:r>
+        <w:rPr>
+          <w:rFonts w:ascii="Consolas" w:eastAsia="Times New Roman" w:hAnsi="Consolas" w:cs="Times New Roman"/>
+          <w:color w:val="D7BA7D"/>
+          <w:sz w:val="21"/>
+          <w:szCs w:val="21"/>
+          <w:lang w:val="en-US"/>
+        </w:rPr>
+        <w:t>\n</w:t>
+      </w:r>
+      <w:r>
+        <w:rPr>
+          <w:rFonts w:ascii="Consolas" w:eastAsia="Times New Roman" w:hAnsi="Consolas" w:cs="Times New Roman"/>
+          <w:color w:val="CE9178"/>
+          <w:sz w:val="21"/>
+          <w:szCs w:val="21"/>
+          <w:lang w:val="en-US"/>
+        </w:rPr>
+        <w:t>"</w:t>
+      </w:r>
+    </w:p>
+    <w:p>
+      <w:pPr>
+        <w:shd w:val="clear" w:color="auto" w:fill="1F1F1F"/>
+        <w:spacing w:after="0" w:line="285" w:lineRule="atLeast"/>
+        <w:rPr>
+          <w:rFonts w:ascii="Consolas" w:eastAsia="Times New Roman" w:hAnsi="Consolas" w:cs="Times New Roman"/>
+          <w:color w:val="CCCCCC"/>
+          <w:sz w:val="21"/>
+          <w:szCs w:val="21"/>
+          <w:lang w:val="en-US"/>
+        </w:rPr>
+      </w:pPr>
+      <w:r>
+        <w:rPr>
+          <w:rFonts w:ascii="Consolas" w:eastAsia="Times New Roman" w:hAnsi="Consolas" w:cs="Times New Roman"/>
+          <w:color w:val="CCCCCC"/>
+          <w:sz w:val="21"/>
+          <w:szCs w:val="21"/>
+          <w:lang w:val="en-US"/>
+        </w:rPr>
+        <w:t xml:space="preserve">        </w:t>
+      </w:r>
+      <w:r>
+        <w:rPr>
+          <w:rFonts w:ascii="Consolas" w:eastAsia="Times New Roman" w:hAnsi="Consolas" w:cs="Times New Roman"/>
+          <w:color w:val="CE9178"/>
+          <w:sz w:val="21"/>
+          <w:szCs w:val="21"/>
+          <w:lang w:val="en-US"/>
+        </w:rPr>
+        <w:t>"- Be interrogative in meaning</w:t>
+      </w:r>
+      <w:r>
+        <w:rPr>
+          <w:rFonts w:ascii="Consolas" w:eastAsia="Times New Roman" w:hAnsi="Consolas" w:cs="Times New Roman"/>
+          <w:color w:val="D7BA7D"/>
+          <w:sz w:val="21"/>
+          <w:szCs w:val="21"/>
+          <w:lang w:val="en-US"/>
+        </w:rPr>
+        <w:t>\n</w:t>
+      </w:r>
+      <w:r>
+        <w:rPr>
+          <w:rFonts w:ascii="Consolas" w:eastAsia="Times New Roman" w:hAnsi="Consolas" w:cs="Times New Roman"/>
+          <w:color w:val="CE9178"/>
+          <w:sz w:val="21"/>
+          <w:szCs w:val="21"/>
+          <w:lang w:val="en-US"/>
+        </w:rPr>
+        <w:t>"</w:t>
+      </w:r>
+    </w:p>
+    <w:p>
+      <w:pPr>
+        <w:shd w:val="clear" w:color="auto" w:fill="1F1F1F"/>
+        <w:spacing w:after="0" w:line="285" w:lineRule="atLeast"/>
+        <w:rPr>
+          <w:rFonts w:ascii="Consolas" w:eastAsia="Times New Roman" w:hAnsi="Consolas" w:cs="Times New Roman"/>
+          <w:color w:val="CCCCCC"/>
+          <w:sz w:val="21"/>
+          <w:szCs w:val="21"/>
+          <w:lang w:val="en-US"/>
+        </w:rPr>
+      </w:pPr>
+      <w:r>
+        <w:rPr>
+          <w:rFonts w:ascii="Consolas" w:eastAsia="Times New Roman" w:hAnsi="Consolas" w:cs="Times New Roman"/>
+          <w:color w:val="CCCCCC"/>
+          <w:sz w:val="21"/>
+          <w:szCs w:val="21"/>
+          <w:lang w:val="en-US"/>
+        </w:rPr>
+        <w:t xml:space="preserve">        </w:t>
+      </w:r>
+      <w:r>
+        <w:rPr>
+          <w:rFonts w:ascii="Consolas" w:eastAsia="Times New Roman" w:hAnsi="Consolas" w:cs="Times New Roman"/>
+          <w:color w:val="CE9178"/>
+          <w:sz w:val="21"/>
+          <w:szCs w:val="21"/>
+          <w:lang w:val="en-US"/>
+        </w:rPr>
+        <w:t>"- Not be a greeting, statement, or fragment</w:t>
+      </w:r>
+      <w:r>
+        <w:rPr>
+          <w:rFonts w:ascii="Consolas" w:eastAsia="Times New Roman" w:hAnsi="Consolas" w:cs="Times New Roman"/>
+          <w:color w:val="D7BA7D"/>
+          <w:sz w:val="21"/>
+          <w:szCs w:val="21"/>
+          <w:lang w:val="en-US"/>
+        </w:rPr>
+        <w:t>\n\n</w:t>
+      </w:r>
+      <w:r>
+        <w:rPr>
+          <w:rFonts w:ascii="Consolas" w:eastAsia="Times New Roman" w:hAnsi="Consolas" w:cs="Times New Roman"/>
+          <w:color w:val="CE9178"/>
+          <w:sz w:val="21"/>
+          <w:szCs w:val="21"/>
+          <w:lang w:val="en-US"/>
+        </w:rPr>
+        <w:t>"</w:t>
+      </w:r>
+    </w:p>
+    <w:p>
+      <w:pPr>
+        <w:shd w:val="clear" w:color="auto" w:fill="1F1F1F"/>
+        <w:spacing w:after="0" w:line="285" w:lineRule="atLeast"/>
+        <w:rPr>
+          <w:rFonts w:ascii="Consolas" w:eastAsia="Times New Roman" w:hAnsi="Consolas" w:cs="Times New Roman"/>
+          <w:color w:val="CCCCCC"/>
+          <w:sz w:val="21"/>
+          <w:szCs w:val="21"/>
+          <w:lang w:val="en-US"/>
+        </w:rPr>
+      </w:pPr>
+      <w:r>
+        <w:rPr>
+          <w:rFonts w:ascii="Consolas" w:eastAsia="Times New Roman" w:hAnsi="Consolas" w:cs="Times New Roman"/>
+          <w:color w:val="CCCCCC"/>
+          <w:sz w:val="21"/>
+          <w:szCs w:val="21"/>
+          <w:lang w:val="en-US"/>
+        </w:rPr>
+        <w:t xml:space="preserve">        </w:t>
+      </w:r>
+      <w:r>
+        <w:rPr>
+          <w:rFonts w:ascii="Consolas" w:eastAsia="Times New Roman" w:hAnsi="Consolas" w:cs="Times New Roman"/>
+          <w:color w:val="CE9178"/>
+          <w:sz w:val="21"/>
+          <w:szCs w:val="21"/>
+          <w:lang w:val="en-US"/>
+        </w:rPr>
+        <w:t>"- Start with a question word (e.g. what, why, how) or an auxiliary verb (e.g. is, can)</w:t>
+      </w:r>
+      <w:r>
+        <w:rPr>
+          <w:rFonts w:ascii="Consolas" w:eastAsia="Times New Roman" w:hAnsi="Consolas" w:cs="Times New Roman"/>
+          <w:color w:val="D7BA7D"/>
+          <w:sz w:val="21"/>
+          <w:szCs w:val="21"/>
+          <w:lang w:val="en-US"/>
+        </w:rPr>
+        <w:t>\n</w:t>
+      </w:r>
+      <w:r>
+        <w:rPr>
+          <w:rFonts w:ascii="Consolas" w:eastAsia="Times New Roman" w:hAnsi="Consolas" w:cs="Times New Roman"/>
+          <w:color w:val="CE9178"/>
+          <w:sz w:val="21"/>
+          <w:szCs w:val="21"/>
+          <w:lang w:val="en-US"/>
+        </w:rPr>
+        <w:t>"</w:t>
+      </w:r>
+    </w:p>
+    <w:p>
+      <w:pPr>
+        <w:shd w:val="clear" w:color="auto" w:fill="1F1F1F"/>
+        <w:spacing w:after="0" w:line="285" w:lineRule="atLeast"/>
+        <w:rPr>
+          <w:rFonts w:ascii="Consolas" w:eastAsia="Times New Roman" w:hAnsi="Consolas" w:cs="Times New Roman"/>
+          <w:color w:val="CCCCCC"/>
+          <w:sz w:val="21"/>
+          <w:szCs w:val="21"/>
+          <w:lang w:val="en-US"/>
+        </w:rPr>
+      </w:pPr>
+      <w:r>
+        <w:rPr>
+          <w:rFonts w:ascii="Consolas" w:eastAsia="Times New Roman" w:hAnsi="Consolas" w:cs="Times New Roman"/>
+          <w:color w:val="CCCCCC"/>
+          <w:sz w:val="21"/>
+          <w:szCs w:val="21"/>
+          <w:lang w:val="en-US"/>
+        </w:rPr>
+        <w:t xml:space="preserve">        </w:t>
+      </w:r>
+      <w:r>
+        <w:rPr>
+          <w:rFonts w:ascii="Consolas" w:eastAsia="Times New Roman" w:hAnsi="Consolas" w:cs="Times New Roman"/>
+          <w:color w:val="CE9178"/>
+          <w:sz w:val="21"/>
+          <w:szCs w:val="21"/>
+          <w:lang w:val="en-US"/>
+        </w:rPr>
+        <w:t>"- Starts with Explain, Define, Compare, or Contrast are also valid question starters.</w:t>
+      </w:r>
+      <w:r>
+        <w:rPr>
+          <w:rFonts w:ascii="Consolas" w:eastAsia="Times New Roman" w:hAnsi="Consolas" w:cs="Times New Roman"/>
+          <w:color w:val="D7BA7D"/>
+          <w:sz w:val="21"/>
+          <w:szCs w:val="21"/>
+          <w:lang w:val="en-US"/>
+        </w:rPr>
+        <w:t>\n\n</w:t>
+      </w:r>
+      <w:r>
+        <w:rPr>
+          <w:rFonts w:ascii="Consolas" w:eastAsia="Times New Roman" w:hAnsi="Consolas" w:cs="Times New Roman"/>
+          <w:color w:val="CE9178"/>
+          <w:sz w:val="21"/>
+          <w:szCs w:val="21"/>
+          <w:lang w:val="en-US"/>
+        </w:rPr>
+        <w:t>"</w:t>
+      </w:r>
+    </w:p>
+    <w:p>
+      <w:pPr>
+        <w:shd w:val="clear" w:color="auto" w:fill="1F1F1F"/>
+        <w:spacing w:after="0" w:line="285" w:lineRule="atLeast"/>
+        <w:rPr>
+          <w:rFonts w:ascii="Consolas" w:eastAsia="Times New Roman" w:hAnsi="Consolas" w:cs="Times New Roman"/>
+          <w:color w:val="CCCCCC"/>
+          <w:sz w:val="21"/>
+          <w:szCs w:val="21"/>
+          <w:lang w:val="en-US"/>
+        </w:rPr>
+      </w:pPr>
+      <w:r>
+        <w:rPr>
+          <w:rFonts w:ascii="Consolas" w:eastAsia="Times New Roman" w:hAnsi="Consolas" w:cs="Times New Roman"/>
+          <w:color w:val="CCCCCC"/>
+          <w:sz w:val="21"/>
+          <w:szCs w:val="21"/>
+          <w:lang w:val="en-US"/>
+        </w:rPr>
+        <w:t xml:space="preserve">        </w:t>
+      </w:r>
+      <w:r>
+        <w:rPr>
+          <w:rFonts w:ascii="Consolas" w:eastAsia="Times New Roman" w:hAnsi="Consolas" w:cs="Times New Roman"/>
+          <w:color w:val="CE9178"/>
+          <w:sz w:val="21"/>
+          <w:szCs w:val="21"/>
+          <w:lang w:val="en-US"/>
+        </w:rPr>
+        <w:t>"Examples of valid questions:</w:t>
+      </w:r>
+      <w:r>
+        <w:rPr>
+          <w:rFonts w:ascii="Consolas" w:eastAsia="Times New Roman" w:hAnsi="Consolas" w:cs="Times New Roman"/>
+          <w:color w:val="D7BA7D"/>
+          <w:sz w:val="21"/>
+          <w:szCs w:val="21"/>
+          <w:lang w:val="en-US"/>
+        </w:rPr>
+        <w:t>\n</w:t>
+      </w:r>
+      <w:r>
+        <w:rPr>
+          <w:rFonts w:ascii="Consolas" w:eastAsia="Times New Roman" w:hAnsi="Consolas" w:cs="Times New Roman"/>
+          <w:color w:val="CE9178"/>
+          <w:sz w:val="21"/>
+          <w:szCs w:val="21"/>
+          <w:lang w:val="en-US"/>
+        </w:rPr>
+        <w:t>"</w:t>
+      </w:r>
+    </w:p>
+    <w:p>
+      <w:pPr>
+        <w:shd w:val="clear" w:color="auto" w:fill="1F1F1F"/>
+        <w:spacing w:after="0" w:line="285" w:lineRule="atLeast"/>
+        <w:rPr>
+          <w:rFonts w:ascii="Consolas" w:eastAsia="Times New Roman" w:hAnsi="Consolas" w:cs="Times New Roman"/>
+          <w:color w:val="CCCCCC"/>
+          <w:sz w:val="21"/>
+          <w:szCs w:val="21"/>
+          <w:lang w:val="en-US"/>
+        </w:rPr>
+      </w:pPr>
+      <w:r>
+        <w:rPr>
+          <w:rFonts w:ascii="Consolas" w:eastAsia="Times New Roman" w:hAnsi="Consolas" w:cs="Times New Roman"/>
+          <w:color w:val="CCCCCC"/>
+          <w:sz w:val="21"/>
+          <w:szCs w:val="21"/>
+          <w:lang w:val="en-US"/>
+        </w:rPr>
+        <w:t xml:space="preserve">        </w:t>
+      </w:r>
+      <w:r>
+        <w:rPr>
+          <w:rFonts w:ascii="Consolas" w:eastAsia="Times New Roman" w:hAnsi="Consolas" w:cs="Times New Roman"/>
+          <w:color w:val="CE9178"/>
+          <w:sz w:val="21"/>
+          <w:szCs w:val="21"/>
+          <w:lang w:val="en-US"/>
+        </w:rPr>
+        <w:t>"- What is hybrid RAG?</w:t>
+      </w:r>
+      <w:r>
+        <w:rPr>
+          <w:rFonts w:ascii="Consolas" w:eastAsia="Times New Roman" w:hAnsi="Consolas" w:cs="Times New Roman"/>
+          <w:color w:val="D7BA7D"/>
+          <w:sz w:val="21"/>
+          <w:szCs w:val="21"/>
+          <w:lang w:val="en-US"/>
+        </w:rPr>
+        <w:t>\n</w:t>
+      </w:r>
+      <w:r>
+        <w:rPr>
+          <w:rFonts w:ascii="Consolas" w:eastAsia="Times New Roman" w:hAnsi="Consolas" w:cs="Times New Roman"/>
+          <w:color w:val="CE9178"/>
+          <w:sz w:val="21"/>
+          <w:szCs w:val="21"/>
+          <w:lang w:val="en-US"/>
+        </w:rPr>
+        <w:t>"</w:t>
+      </w:r>
+    </w:p>
+    <w:p>
+      <w:pPr>
+        <w:shd w:val="clear" w:color="auto" w:fill="1F1F1F"/>
+        <w:spacing w:after="0" w:line="285" w:lineRule="atLeast"/>
+        <w:rPr>
+          <w:rFonts w:ascii="Consolas" w:eastAsia="Times New Roman" w:hAnsi="Consolas" w:cs="Times New Roman"/>
+          <w:color w:val="CCCCCC"/>
+          <w:sz w:val="21"/>
+          <w:szCs w:val="21"/>
+          <w:lang w:val="en-US"/>
+        </w:rPr>
+      </w:pPr>
+      <w:r>
+        <w:rPr>
+          <w:rFonts w:ascii="Consolas" w:eastAsia="Times New Roman" w:hAnsi="Consolas" w:cs="Times New Roman"/>
+          <w:color w:val="CCCCCC"/>
+          <w:sz w:val="21"/>
+          <w:szCs w:val="21"/>
+          <w:lang w:val="en-US"/>
+        </w:rPr>
+        <w:t xml:space="preserve">        </w:t>
+      </w:r>
+      <w:r>
+        <w:rPr>
+          <w:rFonts w:ascii="Consolas" w:eastAsia="Times New Roman" w:hAnsi="Consolas" w:cs="Times New Roman"/>
+          <w:color w:val="CE9178"/>
+          <w:sz w:val="21"/>
+          <w:szCs w:val="21"/>
+          <w:lang w:val="en-US"/>
+        </w:rPr>
+        <w:t>"- How does BM25 scoring work?</w:t>
+      </w:r>
+      <w:r>
+        <w:rPr>
+          <w:rFonts w:ascii="Consolas" w:eastAsia="Times New Roman" w:hAnsi="Consolas" w:cs="Times New Roman"/>
+          <w:color w:val="D7BA7D"/>
+          <w:sz w:val="21"/>
+          <w:szCs w:val="21"/>
+          <w:lang w:val="en-US"/>
+        </w:rPr>
+        <w:t>\n\n</w:t>
+      </w:r>
+      <w:r>
+        <w:rPr>
+          <w:rFonts w:ascii="Consolas" w:eastAsia="Times New Roman" w:hAnsi="Consolas" w:cs="Times New Roman"/>
+          <w:color w:val="CE9178"/>
+          <w:sz w:val="21"/>
+          <w:szCs w:val="21"/>
+          <w:lang w:val="en-US"/>
+        </w:rPr>
+        <w:t>"</w:t>
+      </w:r>
+    </w:p>
+    <w:p>
+      <w:pPr>
+        <w:shd w:val="clear" w:color="auto" w:fill="1F1F1F"/>
+        <w:spacing w:after="0" w:line="285" w:lineRule="atLeast"/>
+        <w:rPr>
+          <w:rFonts w:ascii="Consolas" w:eastAsia="Times New Roman" w:hAnsi="Consolas" w:cs="Times New Roman"/>
+          <w:color w:val="CCCCCC"/>
+          <w:sz w:val="21"/>
+          <w:szCs w:val="21"/>
+          <w:lang w:val="en-US"/>
+        </w:rPr>
+      </w:pPr>
+      <w:r>
+        <w:rPr>
+          <w:rFonts w:ascii="Consolas" w:eastAsia="Times New Roman" w:hAnsi="Consolas" w:cs="Times New Roman"/>
+          <w:color w:val="CCCCCC"/>
+          <w:sz w:val="21"/>
+          <w:szCs w:val="21"/>
+          <w:lang w:val="en-US"/>
+        </w:rPr>
+        <w:t xml:space="preserve">        </w:t>
+      </w:r>
+      <w:r>
+        <w:rPr>
+          <w:rFonts w:ascii="Consolas" w:eastAsia="Times New Roman" w:hAnsi="Consolas" w:cs="Times New Roman"/>
+          <w:color w:val="CE9178"/>
+          <w:sz w:val="21"/>
+          <w:szCs w:val="21"/>
+          <w:lang w:val="en-US"/>
+        </w:rPr>
+        <w:t>"- Explain the concept of dense retrieval.</w:t>
+      </w:r>
+      <w:r>
+        <w:rPr>
+          <w:rFonts w:ascii="Consolas" w:eastAsia="Times New Roman" w:hAnsi="Consolas" w:cs="Times New Roman"/>
+          <w:color w:val="D7BA7D"/>
+          <w:sz w:val="21"/>
+          <w:szCs w:val="21"/>
+          <w:lang w:val="en-US"/>
+        </w:rPr>
+        <w:t>\n</w:t>
+      </w:r>
+      <w:r>
+        <w:rPr>
+          <w:rFonts w:ascii="Consolas" w:eastAsia="Times New Roman" w:hAnsi="Consolas" w:cs="Times New Roman"/>
+          <w:color w:val="CE9178"/>
+          <w:sz w:val="21"/>
+          <w:szCs w:val="21"/>
+          <w:lang w:val="en-US"/>
+        </w:rPr>
+        <w:t>"</w:t>
+      </w:r>
+      <w:r>
+        <w:rPr>
+          <w:rFonts w:ascii="Consolas" w:eastAsia="Times New Roman" w:hAnsi="Consolas" w:cs="Times New Roman"/>
+          <w:color w:val="CCCCCC"/>
+          <w:sz w:val="21"/>
+          <w:szCs w:val="21"/>
+          <w:lang w:val="en-US"/>
+        </w:rPr>
+        <w:t xml:space="preserve"> \</w:t>
+      </w:r>
+    </w:p>
+    <w:p>
+      <w:pPr>
+        <w:shd w:val="clear" w:color="auto" w:fill="1F1F1F"/>
+        <w:spacing w:after="0" w:line="285" w:lineRule="atLeast"/>
+        <w:rPr>
+          <w:rFonts w:ascii="Consolas" w:eastAsia="Times New Roman" w:hAnsi="Consolas" w:cs="Times New Roman"/>
+          <w:color w:val="CCCCCC"/>
+          <w:sz w:val="21"/>
+          <w:szCs w:val="21"/>
+          <w:lang w:val="en-US"/>
+        </w:rPr>
+      </w:pPr>
+      <w:r>
+        <w:rPr>
+          <w:rFonts w:ascii="Consolas" w:eastAsia="Times New Roman" w:hAnsi="Consolas" w:cs="Times New Roman"/>
+          <w:color w:val="CCCCCC"/>
+          <w:sz w:val="21"/>
+          <w:szCs w:val="21"/>
+          <w:lang w:val="en-US"/>
+        </w:rPr>
+        <w:t xml:space="preserve">        </w:t>
+      </w:r>
+      <w:r>
+        <w:rPr>
+          <w:rFonts w:ascii="Consolas" w:eastAsia="Times New Roman" w:hAnsi="Consolas" w:cs="Times New Roman"/>
+          <w:color w:val="CE9178"/>
+          <w:sz w:val="21"/>
+          <w:szCs w:val="21"/>
+          <w:lang w:val="en-US"/>
+        </w:rPr>
+        <w:t>"- Define the term 'tokenization' in NLP.</w:t>
+      </w:r>
+      <w:r>
+        <w:rPr>
+          <w:rFonts w:ascii="Consolas" w:eastAsia="Times New Roman" w:hAnsi="Consolas" w:cs="Times New Roman"/>
+          <w:color w:val="D7BA7D"/>
+          <w:sz w:val="21"/>
+          <w:szCs w:val="21"/>
+          <w:lang w:val="en-US"/>
+        </w:rPr>
+        <w:t>\n</w:t>
+      </w:r>
+      <w:r>
+        <w:rPr>
+          <w:rFonts w:ascii="Consolas" w:eastAsia="Times New Roman" w:hAnsi="Consolas" w:cs="Times New Roman"/>
+          <w:color w:val="CE9178"/>
+          <w:sz w:val="21"/>
+          <w:szCs w:val="21"/>
+          <w:lang w:val="en-US"/>
+        </w:rPr>
+        <w:t>"</w:t>
+      </w:r>
+      <w:r>
+        <w:rPr>
+          <w:rFonts w:ascii="Consolas" w:eastAsia="Times New Roman" w:hAnsi="Consolas" w:cs="Times New Roman"/>
+          <w:color w:val="CCCCCC"/>
+          <w:sz w:val="21"/>
+          <w:szCs w:val="21"/>
+          <w:lang w:val="en-US"/>
+        </w:rPr>
+        <w:t xml:space="preserve"> \</w:t>
+      </w:r>
+    </w:p>
+    <w:p>
+      <w:pPr>
+        <w:shd w:val="clear" w:color="auto" w:fill="1F1F1F"/>
+        <w:spacing w:after="0" w:line="285" w:lineRule="atLeast"/>
+        <w:rPr>
+          <w:rFonts w:ascii="Consolas" w:eastAsia="Times New Roman" w:hAnsi="Consolas" w:cs="Times New Roman"/>
+          <w:color w:val="CCCCCC"/>
+          <w:sz w:val="21"/>
+          <w:szCs w:val="21"/>
+          <w:lang w:val="en-US"/>
+        </w:rPr>
+      </w:pPr>
+      <w:r>
+        <w:rPr>
+          <w:rFonts w:ascii="Consolas" w:eastAsia="Times New Roman" w:hAnsi="Consolas" w:cs="Times New Roman"/>
+          <w:color w:val="CCCCCC"/>
+          <w:sz w:val="21"/>
+          <w:szCs w:val="21"/>
+          <w:lang w:val="en-US"/>
+        </w:rPr>
+        <w:t xml:space="preserve">        </w:t>
+      </w:r>
+      <w:r>
+        <w:rPr>
+          <w:rFonts w:ascii="Consolas" w:eastAsia="Times New Roman" w:hAnsi="Consolas" w:cs="Times New Roman"/>
+          <w:color w:val="CE9178"/>
+          <w:sz w:val="21"/>
+          <w:szCs w:val="21"/>
+          <w:lang w:val="en-US"/>
+        </w:rPr>
+        <w:t>"- Compare and contrast dense and sparse retrieval methods.</w:t>
+      </w:r>
+      <w:r>
+        <w:rPr>
+          <w:rFonts w:ascii="Consolas" w:eastAsia="Times New Roman" w:hAnsi="Consolas" w:cs="Times New Roman"/>
+          <w:color w:val="D7BA7D"/>
+          <w:sz w:val="21"/>
+          <w:szCs w:val="21"/>
+          <w:lang w:val="en-US"/>
+        </w:rPr>
+        <w:t>\n\n</w:t>
+      </w:r>
+      <w:r>
+        <w:rPr>
+          <w:rFonts w:ascii="Consolas" w:eastAsia="Times New Roman" w:hAnsi="Consolas" w:cs="Times New Roman"/>
+          <w:color w:val="CE9178"/>
+          <w:sz w:val="21"/>
+          <w:szCs w:val="21"/>
+          <w:lang w:val="en-US"/>
+        </w:rPr>
+        <w:t>"</w:t>
+      </w:r>
+    </w:p>
+    <w:p>
+      <w:pPr>
+        <w:shd w:val="clear" w:color="auto" w:fill="1F1F1F"/>
+        <w:spacing w:after="0" w:line="285" w:lineRule="atLeast"/>
+        <w:rPr>
+          <w:rFonts w:ascii="Consolas" w:eastAsia="Times New Roman" w:hAnsi="Consolas" w:cs="Times New Roman"/>
+          <w:color w:val="CCCCCC"/>
+          <w:sz w:val="21"/>
+          <w:szCs w:val="21"/>
+          <w:lang w:val="en-US"/>
+        </w:rPr>
+      </w:pPr>
+      <w:r>
+        <w:rPr>
+          <w:rFonts w:ascii="Consolas" w:eastAsia="Times New Roman" w:hAnsi="Consolas" w:cs="Times New Roman"/>
+          <w:color w:val="CCCCCC"/>
+          <w:sz w:val="21"/>
+          <w:szCs w:val="21"/>
+          <w:lang w:val="en-US"/>
+        </w:rPr>
+        <w:t xml:space="preserve">        </w:t>
+      </w:r>
+      <w:r>
+        <w:rPr>
+          <w:rFonts w:ascii="Consolas" w:eastAsia="Times New Roman" w:hAnsi="Consolas" w:cs="Times New Roman"/>
+          <w:color w:val="CE9178"/>
+          <w:sz w:val="21"/>
+          <w:szCs w:val="21"/>
+          <w:lang w:val="en-US"/>
+        </w:rPr>
+        <w:t>"Examples of invalid questions:</w:t>
+      </w:r>
+      <w:r>
+        <w:rPr>
+          <w:rFonts w:ascii="Consolas" w:eastAsia="Times New Roman" w:hAnsi="Consolas" w:cs="Times New Roman"/>
+          <w:color w:val="D7BA7D"/>
+          <w:sz w:val="21"/>
+          <w:szCs w:val="21"/>
+          <w:lang w:val="en-US"/>
+        </w:rPr>
+        <w:t>\n</w:t>
+      </w:r>
+      <w:r>
+        <w:rPr>
+          <w:rFonts w:ascii="Consolas" w:eastAsia="Times New Roman" w:hAnsi="Consolas" w:cs="Times New Roman"/>
+          <w:color w:val="CE9178"/>
+          <w:sz w:val="21"/>
+          <w:szCs w:val="21"/>
+          <w:lang w:val="en-US"/>
+        </w:rPr>
+        <w:t>"</w:t>
+      </w:r>
+    </w:p>
+    <w:p>
+      <w:pPr>
+        <w:shd w:val="clear" w:color="auto" w:fill="1F1F1F"/>
+        <w:spacing w:after="0" w:line="285" w:lineRule="atLeast"/>
+        <w:rPr>
+          <w:rFonts w:ascii="Consolas" w:eastAsia="Times New Roman" w:hAnsi="Consolas" w:cs="Times New Roman"/>
+          <w:color w:val="CCCCCC"/>
+          <w:sz w:val="21"/>
+          <w:szCs w:val="21"/>
+          <w:lang w:val="en-US"/>
+        </w:rPr>
+      </w:pPr>
+      <w:r>
+        <w:rPr>
+          <w:rFonts w:ascii="Consolas" w:eastAsia="Times New Roman" w:hAnsi="Consolas" w:cs="Times New Roman"/>
+          <w:color w:val="CCCCCC"/>
+          <w:sz w:val="21"/>
+          <w:szCs w:val="21"/>
+          <w:lang w:val="en-US"/>
+        </w:rPr>
+        <w:t xml:space="preserve">        </w:t>
+      </w:r>
+      <w:r>
+        <w:rPr>
+          <w:rFonts w:ascii="Consolas" w:eastAsia="Times New Roman" w:hAnsi="Consolas" w:cs="Times New Roman"/>
+          <w:color w:val="CE9178"/>
+          <w:sz w:val="21"/>
+          <w:szCs w:val="21"/>
+          <w:lang w:val="en-US"/>
+        </w:rPr>
+        <w:t>"- Hello world ?</w:t>
+      </w:r>
+      <w:r>
+        <w:rPr>
+          <w:rFonts w:ascii="Consolas" w:eastAsia="Times New Roman" w:hAnsi="Consolas" w:cs="Times New Roman"/>
+          <w:color w:val="D7BA7D"/>
+          <w:sz w:val="21"/>
+          <w:szCs w:val="21"/>
+          <w:lang w:val="en-US"/>
+        </w:rPr>
+        <w:t>\n</w:t>
+      </w:r>
+      <w:r>
+        <w:rPr>
+          <w:rFonts w:ascii="Consolas" w:eastAsia="Times New Roman" w:hAnsi="Consolas" w:cs="Times New Roman"/>
+          <w:color w:val="CE9178"/>
+          <w:sz w:val="21"/>
+          <w:szCs w:val="21"/>
+          <w:lang w:val="en-US"/>
+        </w:rPr>
+        <w:t>"</w:t>
+      </w:r>
+    </w:p>
+    <w:p>
+      <w:pPr>
+        <w:shd w:val="clear" w:color="auto" w:fill="1F1F1F"/>
+        <w:spacing w:after="0" w:line="285" w:lineRule="atLeast"/>
+        <w:rPr>
+          <w:rFonts w:ascii="Consolas" w:eastAsia="Times New Roman" w:hAnsi="Consolas" w:cs="Times New Roman"/>
+          <w:color w:val="CCCCCC"/>
+          <w:sz w:val="21"/>
+          <w:szCs w:val="21"/>
+          <w:lang w:val="en-US"/>
+        </w:rPr>
+      </w:pPr>
+      <w:r>
+        <w:rPr>
+          <w:rFonts w:ascii="Consolas" w:eastAsia="Times New Roman" w:hAnsi="Consolas" w:cs="Times New Roman"/>
+          <w:color w:val="CCCCCC"/>
+          <w:sz w:val="21"/>
+          <w:szCs w:val="21"/>
+          <w:lang w:val="en-US"/>
+        </w:rPr>
+        <w:t xml:space="preserve">        </w:t>
+      </w:r>
+      <w:r>
+        <w:rPr>
+          <w:rFonts w:ascii="Consolas" w:eastAsia="Times New Roman" w:hAnsi="Consolas" w:cs="Times New Roman"/>
+          <w:color w:val="CE9178"/>
+          <w:sz w:val="21"/>
+          <w:szCs w:val="21"/>
+          <w:lang w:val="en-US"/>
+        </w:rPr>
+        <w:t>"- The quick brown fox</w:t>
+      </w:r>
+      <w:r>
+        <w:rPr>
+          <w:rFonts w:ascii="Consolas" w:eastAsia="Times New Roman" w:hAnsi="Consolas" w:cs="Times New Roman"/>
+          <w:color w:val="D7BA7D"/>
+          <w:sz w:val="21"/>
+          <w:szCs w:val="21"/>
+          <w:lang w:val="en-US"/>
+        </w:rPr>
+        <w:t>\n</w:t>
+      </w:r>
+      <w:r>
+        <w:rPr>
+          <w:rFonts w:ascii="Consolas" w:eastAsia="Times New Roman" w:hAnsi="Consolas" w:cs="Times New Roman"/>
+          <w:color w:val="CE9178"/>
+          <w:sz w:val="21"/>
+          <w:szCs w:val="21"/>
+          <w:lang w:val="en-US"/>
+        </w:rPr>
+        <w:t>"</w:t>
+      </w:r>
+    </w:p>
+    <w:p>
+      <w:pPr>
+        <w:shd w:val="clear" w:color="auto" w:fill="1F1F1F"/>
+        <w:spacing w:after="0" w:line="285" w:lineRule="atLeast"/>
+        <w:rPr>
+          <w:rFonts w:ascii="Consolas" w:eastAsia="Times New Roman" w:hAnsi="Consolas" w:cs="Times New Roman"/>
+          <w:color w:val="CCCCCC"/>
+          <w:sz w:val="21"/>
+          <w:szCs w:val="21"/>
+          <w:lang w:val="en-US"/>
+        </w:rPr>
+      </w:pPr>
+      <w:r>
+        <w:rPr>
+          <w:rFonts w:ascii="Consolas" w:eastAsia="Times New Roman" w:hAnsi="Consolas" w:cs="Times New Roman"/>
+          <w:color w:val="CCCCCC"/>
+          <w:sz w:val="21"/>
+          <w:szCs w:val="21"/>
+          <w:lang w:val="en-US"/>
+        </w:rPr>
+        <w:t xml:space="preserve">        </w:t>
+      </w:r>
+      <w:r>
+        <w:rPr>
+          <w:rFonts w:ascii="Consolas" w:eastAsia="Times New Roman" w:hAnsi="Consolas" w:cs="Times New Roman"/>
+          <w:color w:val="CE9178"/>
+          <w:sz w:val="21"/>
+          <w:szCs w:val="21"/>
+          <w:lang w:val="en-US"/>
+        </w:rPr>
+        <w:t>"- How are you doing today?</w:t>
+      </w:r>
+      <w:r>
+        <w:rPr>
+          <w:rFonts w:ascii="Consolas" w:eastAsia="Times New Roman" w:hAnsi="Consolas" w:cs="Times New Roman"/>
+          <w:color w:val="D7BA7D"/>
+          <w:sz w:val="21"/>
+          <w:szCs w:val="21"/>
+          <w:lang w:val="en-US"/>
+        </w:rPr>
+        <w:t>\n</w:t>
+      </w:r>
+      <w:r>
+        <w:rPr>
+          <w:rFonts w:ascii="Consolas" w:eastAsia="Times New Roman" w:hAnsi="Consolas" w:cs="Times New Roman"/>
+          <w:color w:val="CE9178"/>
+          <w:sz w:val="21"/>
+          <w:szCs w:val="21"/>
+          <w:lang w:val="en-US"/>
+        </w:rPr>
+        <w:t>"</w:t>
+      </w:r>
+    </w:p>
+    <w:p>
+      <w:pPr>
+        <w:shd w:val="clear" w:color="auto" w:fill="1F1F1F"/>
+        <w:spacing w:after="0" w:line="285" w:lineRule="atLeast"/>
+        <w:rPr>
+          <w:rFonts w:ascii="Consolas" w:eastAsia="Times New Roman" w:hAnsi="Consolas" w:cs="Times New Roman"/>
+          <w:color w:val="CCCCCC"/>
+          <w:sz w:val="21"/>
+          <w:szCs w:val="21"/>
+          <w:lang w:val="en-US"/>
+        </w:rPr>
+      </w:pPr>
+      <w:r>
+        <w:rPr>
+          <w:rFonts w:ascii="Consolas" w:eastAsia="Times New Roman" w:hAnsi="Consolas" w:cs="Times New Roman"/>
+          <w:color w:val="CCCCCC"/>
+          <w:sz w:val="21"/>
+          <w:szCs w:val="21"/>
+          <w:lang w:val="en-US"/>
+        </w:rPr>
+        <w:t xml:space="preserve">        </w:t>
+      </w:r>
+      <w:r>
+        <w:rPr>
+          <w:rFonts w:ascii="Consolas" w:eastAsia="Times New Roman" w:hAnsi="Consolas" w:cs="Times New Roman"/>
+          <w:color w:val="CE9178"/>
+          <w:sz w:val="21"/>
+          <w:szCs w:val="21"/>
+          <w:lang w:val="en-US"/>
+        </w:rPr>
+        <w:t>"- Greetings, how are you?</w:t>
+      </w:r>
+      <w:r>
+        <w:rPr>
+          <w:rFonts w:ascii="Consolas" w:eastAsia="Times New Roman" w:hAnsi="Consolas" w:cs="Times New Roman"/>
+          <w:color w:val="D7BA7D"/>
+          <w:sz w:val="21"/>
+          <w:szCs w:val="21"/>
+          <w:lang w:val="en-US"/>
+        </w:rPr>
+        <w:t>\n</w:t>
+      </w:r>
+      <w:r>
+        <w:rPr>
+          <w:rFonts w:ascii="Consolas" w:eastAsia="Times New Roman" w:hAnsi="Consolas" w:cs="Times New Roman"/>
+          <w:color w:val="CE9178"/>
+          <w:sz w:val="21"/>
+          <w:szCs w:val="21"/>
+          <w:lang w:val="en-US"/>
+        </w:rPr>
+        <w:t>"</w:t>
+      </w:r>
+    </w:p>
+    <w:p>
+      <w:pPr>
+        <w:shd w:val="clear" w:color="auto" w:fill="1F1F1F"/>
+        <w:spacing w:after="0" w:line="285" w:lineRule="atLeast"/>
+        <w:rPr>
+          <w:rFonts w:ascii="Consolas" w:eastAsia="Times New Roman" w:hAnsi="Consolas" w:cs="Times New Roman"/>
+          <w:color w:val="CCCCCC"/>
+          <w:sz w:val="21"/>
+          <w:szCs w:val="21"/>
+          <w:lang w:val="en-US"/>
+        </w:rPr>
+      </w:pPr>
+      <w:r>
+        <w:rPr>
+          <w:rFonts w:ascii="Consolas" w:eastAsia="Times New Roman" w:hAnsi="Consolas" w:cs="Times New Roman"/>
+          <w:color w:val="CCCCCC"/>
+          <w:sz w:val="21"/>
+          <w:szCs w:val="21"/>
+          <w:lang w:val="en-US"/>
+        </w:rPr>
+        <w:t xml:space="preserve">        </w:t>
+      </w:r>
+      <w:r>
+        <w:rPr>
+          <w:rFonts w:ascii="Consolas" w:eastAsia="Times New Roman" w:hAnsi="Consolas" w:cs="Times New Roman"/>
+          <w:color w:val="CE9178"/>
+          <w:sz w:val="21"/>
+          <w:szCs w:val="21"/>
+          <w:lang w:val="en-US"/>
+        </w:rPr>
+        <w:t>"- Hello, can you help me?</w:t>
+      </w:r>
+      <w:r>
+        <w:rPr>
+          <w:rFonts w:ascii="Consolas" w:eastAsia="Times New Roman" w:hAnsi="Consolas" w:cs="Times New Roman"/>
+          <w:color w:val="D7BA7D"/>
+          <w:sz w:val="21"/>
+          <w:szCs w:val="21"/>
+          <w:lang w:val="en-US"/>
+        </w:rPr>
+        <w:t>\n\n</w:t>
+      </w:r>
+      <w:r>
+        <w:rPr>
+          <w:rFonts w:ascii="Consolas" w:eastAsia="Times New Roman" w:hAnsi="Consolas" w:cs="Times New Roman"/>
+          <w:color w:val="CE9178"/>
+          <w:sz w:val="21"/>
+          <w:szCs w:val="21"/>
+          <w:lang w:val="en-US"/>
+        </w:rPr>
+        <w:t>"</w:t>
+      </w:r>
+    </w:p>
+    <w:p>
+      <w:pPr>
+        <w:shd w:val="clear" w:color="auto" w:fill="1F1F1F"/>
+        <w:spacing w:after="0" w:line="285" w:lineRule="atLeast"/>
+        <w:rPr>
+          <w:rFonts w:ascii="Consolas" w:eastAsia="Times New Roman" w:hAnsi="Consolas" w:cs="Times New Roman"/>
+          <w:color w:val="CCCCCC"/>
+          <w:sz w:val="21"/>
+          <w:szCs w:val="21"/>
+          <w:lang w:val="en-US"/>
+        </w:rPr>
+      </w:pPr>
+      <w:r>
+        <w:rPr>
+          <w:rFonts w:ascii="Consolas" w:eastAsia="Times New Roman" w:hAnsi="Consolas" w:cs="Times New Roman"/>
+          <w:color w:val="CCCCCC"/>
+          <w:sz w:val="21"/>
+          <w:szCs w:val="21"/>
+          <w:lang w:val="en-US"/>
+        </w:rPr>
+        <w:t xml:space="preserve">        </w:t>
+      </w:r>
+      <w:r>
+        <w:rPr>
+          <w:rFonts w:ascii="Consolas" w:eastAsia="Times New Roman" w:hAnsi="Consolas" w:cs="Times New Roman"/>
+          <w:color w:val="CE9178"/>
+          <w:sz w:val="21"/>
+          <w:szCs w:val="21"/>
+          <w:lang w:val="en-US"/>
+        </w:rPr>
+        <w:t>"STRICTLY Respond with ONLY YES or NO.</w:t>
+      </w:r>
+      <w:r>
+        <w:rPr>
+          <w:rFonts w:ascii="Consolas" w:eastAsia="Times New Roman" w:hAnsi="Consolas" w:cs="Times New Roman"/>
+          <w:color w:val="D7BA7D"/>
+          <w:sz w:val="21"/>
+          <w:szCs w:val="21"/>
+          <w:lang w:val="en-US"/>
+        </w:rPr>
+        <w:t>\n\n</w:t>
+      </w:r>
+      <w:r>
+        <w:rPr>
+          <w:rFonts w:ascii="Consolas" w:eastAsia="Times New Roman" w:hAnsi="Consolas" w:cs="Times New Roman"/>
+          <w:color w:val="CE9178"/>
+          <w:sz w:val="21"/>
+          <w:szCs w:val="21"/>
+          <w:lang w:val="en-US"/>
+        </w:rPr>
+        <w:t>"</w:t>
+      </w:r>
+    </w:p>
+    <w:p>
+      <w:pPr>
+        <w:shd w:val="clear" w:color="auto" w:fill="1F1F1F"/>
+        <w:spacing w:after="0" w:line="285" w:lineRule="atLeast"/>
+        <w:rPr>
+          <w:rFonts w:ascii="Consolas" w:eastAsia="Times New Roman" w:hAnsi="Consolas" w:cs="Times New Roman"/>
+          <w:color w:val="CCCCCC"/>
+          <w:sz w:val="21"/>
+          <w:szCs w:val="21"/>
+          <w:lang w:val="en-US"/>
+        </w:rPr>
+      </w:pPr>
+      <w:r>
+        <w:rPr>
+          <w:rFonts w:ascii="Consolas" w:eastAsia="Times New Roman" w:hAnsi="Consolas" w:cs="Times New Roman"/>
+          <w:color w:val="CCCCCC"/>
+          <w:sz w:val="21"/>
+          <w:szCs w:val="21"/>
+          <w:lang w:val="en-US"/>
+        </w:rPr>
+        <w:t xml:space="preserve">        </w:t>
+      </w:r>
+      <w:r>
+        <w:rPr>
+          <w:rFonts w:ascii="Consolas" w:eastAsia="Times New Roman" w:hAnsi="Consolas" w:cs="Times New Roman"/>
+          <w:color w:val="569CD6"/>
+          <w:sz w:val="21"/>
+          <w:szCs w:val="21"/>
+          <w:lang w:val="en-US"/>
+        </w:rPr>
+        <w:t>f</w:t>
+      </w:r>
+      <w:r>
+        <w:rPr>
+          <w:rFonts w:ascii="Consolas" w:eastAsia="Times New Roman" w:hAnsi="Consolas" w:cs="Times New Roman"/>
+          <w:color w:val="CE9178"/>
+          <w:sz w:val="21"/>
+          <w:szCs w:val="21"/>
+          <w:lang w:val="en-US"/>
+        </w:rPr>
+        <w:t xml:space="preserve">"Text: </w:t>
+      </w:r>
+      <w:r>
+        <w:rPr>
+          <w:rFonts w:ascii="Consolas" w:eastAsia="Times New Roman" w:hAnsi="Consolas" w:cs="Times New Roman"/>
+          <w:color w:val="569CD6"/>
+          <w:sz w:val="21"/>
+          <w:szCs w:val="21"/>
+          <w:lang w:val="en-US"/>
+        </w:rPr>
+        <w:t>{</w:t>
+      </w:r>
+      <w:r>
+        <w:rPr>
+          <w:rFonts w:ascii="Consolas" w:eastAsia="Times New Roman" w:hAnsi="Consolas" w:cs="Times New Roman"/>
+          <w:color w:val="9CDCFE"/>
+          <w:sz w:val="21"/>
+          <w:szCs w:val="21"/>
+          <w:lang w:val="en-US"/>
+        </w:rPr>
+        <w:t>query</w:t>
+      </w:r>
+      <w:r>
+        <w:rPr>
+          <w:rFonts w:ascii="Consolas" w:eastAsia="Times New Roman" w:hAnsi="Consolas" w:cs="Times New Roman"/>
+          <w:color w:val="569CD6"/>
+          <w:sz w:val="21"/>
+          <w:szCs w:val="21"/>
+          <w:lang w:val="en-US"/>
+        </w:rPr>
+        <w:t>}</w:t>
+      </w:r>
+      <w:r>
+        <w:rPr>
+          <w:rFonts w:ascii="Consolas" w:eastAsia="Times New Roman" w:hAnsi="Consolas" w:cs="Times New Roman"/>
+          <w:color w:val="CE9178"/>
+          <w:sz w:val="21"/>
+          <w:szCs w:val="21"/>
+          <w:lang w:val="en-US"/>
+        </w:rPr>
+        <w:t>"</w:t>
+      </w:r>
+    </w:p>
+    <w:p>
+      <w:pPr>
+        <w:rPr>
+          <w:lang w:val="en-US"/>
+        </w:rPr>
+      </w:pPr>
+    </w:p>
+    <w:p>
+      <w:pPr>
+        <w:rPr>
+          <w:lang w:val="en-US"/>
+        </w:rPr>
+      </w:pPr>
+      <w:r>
+        <w:rPr>
+          <w:lang w:val="en-US"/>
+        </w:rPr>
+        <w:drawing>
+          <wp:inline distT="0" distB="0" distL="0" distR="0" wp14:anchorId="57C0D017" wp14:editId="7AA38646">
+            <wp:extent cx="6673888" cy="536594"/>
+            <wp:effectExtent l="0" t="0" r="0" b="0"/>
+            <wp:docPr id="1906136213" name="Picture 1"/>
+            <wp:cNvGraphicFramePr>
+              <a:graphicFrameLocks xmlns:a="http://schemas.openxmlformats.org/drawingml/2006/main" noChangeAspect="1"/>
+            </wp:cNvGraphicFramePr>
+            <a:graphic xmlns:a="http://schemas.openxmlformats.org/drawingml/2006/main">
+              <a:graphicData uri="http://schemas.openxmlformats.org/drawingml/2006/picture">
+                <pic:pic xmlns:pic="http://schemas.openxmlformats.org/drawingml/2006/picture">
+                  <pic:nvPicPr>
+                    <pic:cNvPr id="1906136213" name=""/>
+                    <pic:cNvPicPr/>
+                  </pic:nvPicPr>
+                  <pic:blipFill>
+                    <a:blip r:embed="rId18"/>
+                    <a:stretch>
+                      <a:fillRect/>
+                    </a:stretch>
+                  </pic:blipFill>
+                  <pic:spPr>
+                    <a:xfrm>
+                      <a:off x="0" y="0"/>
+                      <a:ext cx="6752259" cy="542895"/>
+                    </a:xfrm>
+                    <a:prstGeom prst="rect">
+                      <a:avLst/>
+                    </a:prstGeom>
+                  </pic:spPr>
+                </pic:pic>
+              </a:graphicData>
+            </a:graphic>
+          </wp:inline>
+        </w:drawing>
+      </w:r>
+    </w:p>
+    <w:p>
+      <w:pPr>
+        <w:rPr>
+          <w:lang w:val="en-US"/>
+        </w:rPr>
+      </w:pPr>
+    </w:p>
+    <w:p>
+      <w:pPr>
+        <w:rPr>
+          <w:lang w:val="en-US"/>
+        </w:rPr>
+      </w:pPr>
+      <w:r>
+        <w:rPr>
+          <w:lang w:val="en-US"/>
+        </w:rPr>
+        <w:t>Incase for some valid questions the LM responds no, then add to the valid prompt. Also from testing if some invalid questions are not detected, adding them in the INVALID example prompt helps the LM identify it as invalid</w:t>
+      </w:r>
+    </w:p>
+    <w:p>
+      <w:pPr>
+        <w:rPr>
+          <w:lang w:val="en-US"/>
+        </w:rPr>
+      </w:pPr>
+      <w:r>
+        <w:rPr>
+          <w:lang w:val="en-US"/>
+        </w:rPr>
+        <w:lastRenderedPageBreak/>
+        <w:drawing>
+          <wp:inline distT="0" distB="0" distL="0" distR="0" wp14:anchorId="65C1FD76" wp14:editId="26A1B826">
+            <wp:extent cx="6476391" cy="432561"/>
+            <wp:effectExtent l="0" t="0" r="635" b="5715"/>
+            <wp:docPr id="1764266166" name="Picture 1"/>
+            <wp:cNvGraphicFramePr>
+              <a:graphicFrameLocks xmlns:a="http://schemas.openxmlformats.org/drawingml/2006/main" noChangeAspect="1"/>
+            </wp:cNvGraphicFramePr>
+            <a:graphic xmlns:a="http://schemas.openxmlformats.org/drawingml/2006/main">
+              <a:graphicData uri="http://schemas.openxmlformats.org/drawingml/2006/picture">
+                <pic:pic xmlns:pic="http://schemas.openxmlformats.org/drawingml/2006/picture">
+                  <pic:nvPicPr>
+                    <pic:cNvPr id="1764266166" name=""/>
+                    <pic:cNvPicPr/>
+                  </pic:nvPicPr>
+                  <pic:blipFill>
+                    <a:blip r:embed="rId19"/>
+                    <a:stretch>
+                      <a:fillRect/>
+                    </a:stretch>
+                  </pic:blipFill>
+                  <pic:spPr>
+                    <a:xfrm>
+                      <a:off x="0" y="0"/>
+                      <a:ext cx="6546302" cy="437230"/>
+                    </a:xfrm>
+                    <a:prstGeom prst="rect">
+                      <a:avLst/>
+                    </a:prstGeom>
+                  </pic:spPr>
+                </pic:pic>
+              </a:graphicData>
+            </a:graphic>
+          </wp:inline>
+        </w:drawing>
+      </w:r>
+    </w:p>
+    <w:p>
+      <w:r>
+        <w:drawing>
+          <wp:inline distT="0" distB="0" distL="0" distR="0" wp14:anchorId="7489DA79" wp14:editId="678F495E">
+            <wp:extent cx="5429290" cy="2781320"/>
+            <wp:effectExtent l="0" t="0" r="0" b="0"/>
+            <wp:docPr id="645624566" name="Picture 1"/>
+            <wp:cNvGraphicFramePr>
+              <a:graphicFrameLocks xmlns:a="http://schemas.openxmlformats.org/drawingml/2006/main" noChangeAspect="1"/>
+            </wp:cNvGraphicFramePr>
+            <a:graphic xmlns:a="http://schemas.openxmlformats.org/drawingml/2006/main">
+              <a:graphicData uri="http://schemas.openxmlformats.org/drawingml/2006/picture">
+                <pic:pic xmlns:pic="http://schemas.openxmlformats.org/drawingml/2006/picture">
+                  <pic:nvPicPr>
+                    <pic:cNvPr id="645624566" name=""/>
+                    <pic:cNvPicPr/>
+                  </pic:nvPicPr>
+                  <pic:blipFill>
+                    <a:blip r:embed="rId20"/>
+                    <a:stretch>
+                      <a:fillRect/>
+                    </a:stretch>
+                  </pic:blipFill>
+                  <pic:spPr>
+                    <a:xfrm>
+                      <a:off x="0" y="0"/>
+                      <a:ext cx="5429290" cy="2781320"/>
+                    </a:xfrm>
+                    <a:prstGeom prst="rect">
+                      <a:avLst/>
+                    </a:prstGeom>
+                  </pic:spPr>
+                </pic:pic>
+              </a:graphicData>
+            </a:graphic>
+          </wp:inline>
+        </w:drawing>
+      </w:r>
+    </w:p>
+    <w:p>
+      <w:pPr>
+        <w:pStyle w:val="Heading2"/>
+      </w:pPr>
+      <w:r>
+        <w:drawing>
+          <wp:inline distT="0" distB="0" distL="0" distR="0" wp14:anchorId="68E96CA1" wp14:editId="5DF9581E">
+            <wp:extent cx="5762667" cy="2924196"/>
+            <wp:effectExtent l="0" t="0" r="9525" b="9525"/>
+            <wp:docPr id="1384223103" name="Picture 1"/>
+            <wp:cNvGraphicFramePr>
+              <a:graphicFrameLocks xmlns:a="http://schemas.openxmlformats.org/drawingml/2006/main" noChangeAspect="1"/>
+            </wp:cNvGraphicFramePr>
+            <a:graphic xmlns:a="http://schemas.openxmlformats.org/drawingml/2006/main">
+              <a:graphicData uri="http://schemas.openxmlformats.org/drawingml/2006/picture">
+                <pic:pic xmlns:pic="http://schemas.openxmlformats.org/drawingml/2006/picture">
+                  <pic:nvPicPr>
+                    <pic:cNvPr id="1384223103" name=""/>
+                    <pic:cNvPicPr/>
+                  </pic:nvPicPr>
+                  <pic:blipFill>
+                    <a:blip r:embed="rId21"/>
+                    <a:stretch>
+                      <a:fillRect/>
+                    </a:stretch>
+                  </pic:blipFill>
+                  <pic:spPr>
+                    <a:xfrm>
+                      <a:off x="0" y="0"/>
+                      <a:ext cx="5762667" cy="2924196"/>
+                    </a:xfrm>
+                    <a:prstGeom prst="rect">
+                      <a:avLst/>
+                    </a:prstGeom>
+                  </pic:spPr>
+                </pic:pic>
+              </a:graphicData>
+            </a:graphic>
+          </wp:inline>
+        </w:drawing>
+      </w:r>
+    </w:p>
+    <w:p>
+      <w:pPr>
+        <w:pStyle w:val="Heading2"/>
+      </w:pPr>
+      <w:r>
+        <w:drawing>
+          <wp:inline distT="0" distB="0" distL="0" distR="0" wp14:anchorId="4EA78666" wp14:editId="0BDBCA14">
+            <wp:extent cx="5448340" cy="2724170"/>
+            <wp:effectExtent l="0" t="0" r="0" b="0"/>
+            <wp:docPr id="1722881365" name="Picture 1"/>
+            <wp:cNvGraphicFramePr>
+              <a:graphicFrameLocks xmlns:a="http://schemas.openxmlformats.org/drawingml/2006/main" noChangeAspect="1"/>
+            </wp:cNvGraphicFramePr>
+            <a:graphic xmlns:a="http://schemas.openxmlformats.org/drawingml/2006/main">
+              <a:graphicData uri="http://schemas.openxmlformats.org/drawingml/2006/picture">
+                <pic:pic xmlns:pic="http://schemas.openxmlformats.org/drawingml/2006/picture">
+                  <pic:nvPicPr>
+                    <pic:cNvPr id="1722881365" name=""/>
+                    <pic:cNvPicPr/>
+                  </pic:nvPicPr>
+                  <pic:blipFill>
+                    <a:blip r:embed="rId22"/>
+                    <a:stretch>
+                      <a:fillRect/>
+                    </a:stretch>
+                  </pic:blipFill>
+                  <pic:spPr>
+                    <a:xfrm>
+                      <a:off x="0" y="0"/>
+                      <a:ext cx="5448340" cy="2724170"/>
+                    </a:xfrm>
+                    <a:prstGeom prst="rect">
+                      <a:avLst/>
+                    </a:prstGeom>
+                  </pic:spPr>
+                </pic:pic>
+              </a:graphicData>
+            </a:graphic>
+          </wp:inline>
+        </w:drawing>
+      </w:r>
+    </w:p>
+    <w:p>
+      <w:r>
+        <w:lastRenderedPageBreak/>
+        <w:drawing>
+          <wp:inline distT="0" distB="0" distL="0" distR="0" wp14:anchorId="40B9C08E" wp14:editId="311CE758">
+            <wp:extent cx="6467522" cy="4524408"/>
+            <wp:effectExtent l="0" t="0" r="9525" b="9525"/>
+            <wp:docPr id="1765587046" name="Picture 1"/>
+            <wp:cNvGraphicFramePr>
+              <a:graphicFrameLocks xmlns:a="http://schemas.openxmlformats.org/drawingml/2006/main" noChangeAspect="1"/>
+            </wp:cNvGraphicFramePr>
+            <a:graphic xmlns:a="http://schemas.openxmlformats.org/drawingml/2006/main">
+              <a:graphicData uri="http://schemas.openxmlformats.org/drawingml/2006/picture">
+                <pic:pic xmlns:pic="http://schemas.openxmlformats.org/drawingml/2006/picture">
+                  <pic:nvPicPr>
+                    <pic:cNvPr id="1765587046" name=""/>
+                    <pic:cNvPicPr/>
+                  </pic:nvPicPr>
+                  <pic:blipFill>
+                    <a:blip r:embed="rId23"/>
+                    <a:stretch>
+                      <a:fillRect/>
+                    </a:stretch>
+                  </pic:blipFill>
+                  <pic:spPr>
+                    <a:xfrm>
+                      <a:off x="0" y="0"/>
+                      <a:ext cx="6467522" cy="4524408"/>
+                    </a:xfrm>
+                    <a:prstGeom prst="rect">
+                      <a:avLst/>
+                    </a:prstGeom>
+                  </pic:spPr>
+                </pic:pic>
+              </a:graphicData>
+            </a:graphic>
+          </wp:inline>
+        </w:drawing>
+      </w:r>
     </w:p>
     <w:p>
       <w:pPr>
@@ -4469,27 +5821,7 @@
           <w:szCs w:val="24"/>
           <w:lang w:eastAsia="en-IN"/>
         </w:rPr>
-        <w:t xml:space="preserve">An end-to-end flow ran on a python notebook. Refer to </w:t>
-      </w:r>
-      <w:proofErr w:type="spellStart"/>
-      <w:r>
-        <w:rPr>
-          <w:rFonts w:ascii="Times New Roman" w:eastAsia="Times New Roman" w:hAnsi="Times New Roman" w:cs="Times New Roman"/>
-          <w:sz w:val="24"/>
-          <w:szCs w:val="24"/>
-          <w:lang w:eastAsia="en-IN"/>
-        </w:rPr>
-        <w:t>python_notebook.pynb</w:t>
-      </w:r>
-      <w:proofErr w:type="spellEnd"/>
-      <w:r>
-        <w:rPr>
-          <w:rFonts w:ascii="Times New Roman" w:eastAsia="Times New Roman" w:hAnsi="Times New Roman" w:cs="Times New Roman"/>
-          <w:sz w:val="24"/>
-          <w:szCs w:val="24"/>
-          <w:lang w:eastAsia="en-IN"/>
-        </w:rPr>
-        <w:t xml:space="preserve">. </w:t>
+        <w:t xml:space="preserve">An end-to-end flow ran on a python notebook. Refer to python_notebook.pynb. </w:t>
       </w:r>
     </w:p>
     <w:p>
@@ -4510,32 +5842,12 @@
           <w:szCs w:val="24"/>
           <w:lang w:eastAsia="en-IN"/>
         </w:rPr>
-        <w:t xml:space="preserve">A pdf for the same python notebook is also there for reference. Refer to </w:t>
-      </w:r>
-      <w:proofErr w:type="spellStart"/>
-      <w:r>
-        <w:rPr>
-          <w:rFonts w:ascii="Times New Roman" w:eastAsia="Times New Roman" w:hAnsi="Times New Roman" w:cs="Times New Roman"/>
-          <w:sz w:val="24"/>
-          <w:szCs w:val="24"/>
-          <w:lang w:eastAsia="en-IN"/>
-        </w:rPr>
-        <w:t>python_notebook</w:t>
-      </w:r>
-      <w:proofErr w:type="spellEnd"/>
-      <w:r>
-        <w:rPr>
-          <w:rFonts w:ascii="Times New Roman" w:eastAsia="Times New Roman" w:hAnsi="Times New Roman" w:cs="Times New Roman"/>
-          <w:sz w:val="24"/>
-          <w:szCs w:val="24"/>
-          <w:lang w:eastAsia="en-IN"/>
-        </w:rPr>
-        <w:t xml:space="preserve"> pdf.pdf</w:t>
+        <w:t>A pdf for the same python notebook is also there for reference. Refer to python_notebook pdf.pdf</w:t>
       </w:r>
     </w:p>
     <w:sectPr>
       <w:pgSz w:w="11906" w:h="16838"/>
-      <w:pgMar w:top="720" w:right="720" w:bottom="720" w:left="720" w:header="708" w:footer="708" w:gutter="0"/>
+      <w:pgMar w:top="720" w:right="360" w:bottom="720" w:left="360" w:header="706" w:footer="706" w:gutter="0"/>
       <w:cols w:space="708"/>
       <w:docGrid w:linePitch="360"/>
     </w:sectPr>
@@ -5348,7 +6660,6 @@
   <w:style w:type="character" w:default="1" w:styleId="DefaultParagraphFont">
     <w:name w:val="Default Paragraph Font"/>
     <w:uiPriority w:val="1"/>
-    <w:semiHidden/>
     <w:unhideWhenUsed/>
   </w:style>
   <w:style w:type="table" w:default="1" w:styleId="TableNormal">

</xml_diff>

<commit_message>
clean up and architecture diagram
</commit_message>
<xml_diff>
--- a/Project_details.docx
+++ b/Project_details.docx
@@ -2624,6 +2624,70 @@
         </w:rPr>
         <w:t>).</w:t>
       </w:r>
+      <w:r>
+        <w:rPr>
+          <w:rFonts w:ascii="Times New Roman" w:eastAsia="Times New Roman" w:hAnsi="Times New Roman" w:cs="Times New Roman"/>
+          <w:sz w:val="24"/>
+          <w:szCs w:val="24"/>
+          <w:lang w:eastAsia="en-IN"/>
+        </w:rPr>
+        <w:t xml:space="preserve"> Also in readme.md</w:t>
+      </w:r>
+    </w:p>
+    <w:p>
+      <w:pPr>
+        <w:spacing w:before="100" w:beforeAutospacing="1" w:after="100" w:afterAutospacing="1" w:line="240" w:lineRule="auto"/>
+        <w:rPr>
+          <w:rFonts w:ascii="Times New Roman" w:eastAsia="Times New Roman" w:hAnsi="Times New Roman" w:cs="Times New Roman"/>
+          <w:sz w:val="24"/>
+          <w:szCs w:val="24"/>
+          <w:lang w:eastAsia="en-IN"/>
+        </w:rPr>
+      </w:pPr>
+      <w:r>
+        <w:rPr>
+          <w:rFonts w:ascii="Times New Roman" w:eastAsia="Times New Roman" w:hAnsi="Times New Roman" w:cs="Times New Roman"/>
+          <w:sz w:val="24"/>
+          <w:szCs w:val="24"/>
+          <w:lang w:eastAsia="en-IN"/>
+        </w:rPr>
+        <w:lastRenderedPageBreak/>
+        <w:drawing>
+          <wp:inline distT="0" distB="0" distL="0" distR="0" wp14:anchorId="1F445248" wp14:editId="1B154A1B">
+            <wp:extent cx="5524540" cy="6905675"/>
+            <wp:effectExtent l="0" t="0" r="0" b="9525"/>
+            <wp:docPr id="1440250818" name="Picture 1"/>
+            <wp:cNvGraphicFramePr>
+              <a:graphicFrameLocks xmlns:a="http://schemas.openxmlformats.org/drawingml/2006/main" noChangeAspect="1"/>
+            </wp:cNvGraphicFramePr>
+            <a:graphic xmlns:a="http://schemas.openxmlformats.org/drawingml/2006/main">
+              <a:graphicData uri="http://schemas.openxmlformats.org/drawingml/2006/picture">
+                <pic:pic xmlns:pic="http://schemas.openxmlformats.org/drawingml/2006/picture">
+                  <pic:nvPicPr>
+                    <pic:cNvPr id="1440250818" name=""/>
+                    <pic:cNvPicPr/>
+                  </pic:nvPicPr>
+                  <pic:blipFill>
+                    <a:blip r:embed="rId5"/>
+                    <a:stretch>
+                      <a:fillRect/>
+                    </a:stretch>
+                  </pic:blipFill>
+                  <pic:spPr>
+                    <a:xfrm>
+                      <a:off x="0" y="0"/>
+                      <a:ext cx="5524540" cy="6905675"/>
+                    </a:xfrm>
+                    <a:prstGeom prst="rect">
+                      <a:avLst/>
+                    </a:prstGeom>
+                  </pic:spPr>
+                </pic:pic>
+              </a:graphicData>
+            </a:graphic>
+          </wp:inline>
+        </w:drawing>
+      </w:r>
     </w:p>
     <w:p>
       <w:pPr>
@@ -2650,7 +2714,7 @@
         </w:rPr>
         <w:t xml:space="preserve">Clone </w:t>
       </w:r>
-      <w:hyperlink r:id="rId5" w:history="1">
+      <w:hyperlink r:id="rId6" w:history="1">
         <w:r>
           <w:rPr>
             <w:rStyle w:val="Hyperlink"/>
@@ -2823,7 +2887,7 @@
                     <pic:cNvPicPr/>
                   </pic:nvPicPr>
                   <pic:blipFill>
-                    <a:blip r:embed="rId6"/>
+                    <a:blip r:embed="rId7"/>
                     <a:stretch>
                       <a:fillRect/>
                     </a:stretch>
@@ -2857,6 +2921,7 @@
       <w:r>
         <w:rPr>
           <w:rFonts w:ascii="Times New Roman" w:eastAsia="Times New Roman" w:hAnsi="Times New Roman" w:cs="Times New Roman"/>
+          <w:noProof/>
           <w:sz w:val="24"/>
           <w:szCs w:val="24"/>
           <w:lang w:eastAsia="en-IN"/>
@@ -2878,7 +2943,7 @@
                     <pic:cNvPicPr/>
                   </pic:nvPicPr>
                   <pic:blipFill>
-                    <a:blip r:embed="rId7"/>
+                    <a:blip r:embed="rId8"/>
                     <a:stretch>
                       <a:fillRect/>
                     </a:stretch>
@@ -2912,6 +2977,7 @@
       <w:r>
         <w:rPr>
           <w:rFonts w:ascii="Times New Roman" w:eastAsia="Times New Roman" w:hAnsi="Times New Roman" w:cs="Times New Roman"/>
+          <w:noProof/>
           <w:sz w:val="24"/>
           <w:szCs w:val="24"/>
           <w:lang w:eastAsia="en-IN"/>
@@ -2933,7 +2999,7 @@
                     <pic:cNvPicPr/>
                   </pic:nvPicPr>
                   <pic:blipFill>
-                    <a:blip r:embed="rId8"/>
+                    <a:blip r:embed="rId9"/>
                     <a:stretch>
                       <a:fillRect/>
                     </a:stretch>
@@ -2988,7 +3054,7 @@
                     <pic:cNvPicPr/>
                   </pic:nvPicPr>
                   <pic:blipFill>
-                    <a:blip r:embed="rId9"/>
+                    <a:blip r:embed="rId10"/>
                     <a:stretch>
                       <a:fillRect/>
                     </a:stretch>
@@ -3043,7 +3109,7 @@
                     <pic:cNvPicPr/>
                   </pic:nvPicPr>
                   <pic:blipFill>
-                    <a:blip r:embed="rId10"/>
+                    <a:blip r:embed="rId11"/>
                     <a:stretch>
                       <a:fillRect/>
                     </a:stretch>
@@ -3748,6 +3814,7 @@
       </w:pPr>
       <w:r>
         <w:rPr>
+          <w:noProof/>
           <w:lang w:val="en-US"/>
         </w:rPr>
         <w:lastRenderedPageBreak/>
@@ -3767,7 +3834,7 @@
                     <pic:cNvPicPr/>
                   </pic:nvPicPr>
                   <pic:blipFill>
-                    <a:blip r:embed="rId11"/>
+                    <a:blip r:embed="rId12"/>
                     <a:stretch>
                       <a:fillRect/>
                     </a:stretch>
@@ -3860,6 +3927,7 @@
       </w:pPr>
       <w:r>
         <w:rPr>
+          <w:noProof/>
           <w:lang w:val="en-US"/>
         </w:rPr>
         <w:drawing>
@@ -3878,7 +3946,7 @@
                     <pic:cNvPicPr/>
                   </pic:nvPicPr>
                   <pic:blipFill>
-                    <a:blip r:embed="rId12"/>
+                    <a:blip r:embed="rId13"/>
                     <a:stretch>
                       <a:fillRect/>
                     </a:stretch>
@@ -3974,6 +4042,7 @@
       </w:pPr>
       <w:r>
         <w:rPr>
+          <w:noProof/>
           <w:lang w:val="en-US"/>
         </w:rPr>
         <w:lastRenderedPageBreak/>
@@ -3993,7 +4062,7 @@
                     <pic:cNvPicPr/>
                   </pic:nvPicPr>
                   <pic:blipFill>
-                    <a:blip r:embed="rId13"/>
+                    <a:blip r:embed="rId14"/>
                     <a:stretch>
                       <a:fillRect/>
                     </a:stretch>
@@ -4029,6 +4098,7 @@
       </w:pPr>
       <w:r>
         <w:rPr>
+          <w:noProof/>
           <w:lang w:val="en-US"/>
         </w:rPr>
         <w:drawing>
@@ -4047,7 +4117,7 @@
                     <pic:cNvPicPr/>
                   </pic:nvPicPr>
                   <pic:blipFill>
-                    <a:blip r:embed="rId14"/>
+                    <a:blip r:embed="rId15"/>
                     <a:stretch>
                       <a:fillRect/>
                     </a:stretch>
@@ -4122,6 +4192,9 @@
         <w:t>Ablation result at k =10</w:t>
       </w:r>
       <w:r>
+        <w:rPr>
+          <w:noProof/>
+        </w:rPr>
         <w:drawing>
           <wp:inline distT="0" distB="0" distL="0" distR="0" wp14:anchorId="7170338C" wp14:editId="1438220C">
             <wp:extent cx="7103110" cy="506730"/>
@@ -4138,7 +4211,7 @@
                     <pic:cNvPicPr/>
                   </pic:nvPicPr>
                   <pic:blipFill>
-                    <a:blip r:embed="rId15"/>
+                    <a:blip r:embed="rId16"/>
                     <a:stretch>
                       <a:fillRect/>
                     </a:stretch>
@@ -4170,6 +4243,9 @@
     <w:p/>
     <w:p>
       <w:r>
+        <w:rPr>
+          <w:noProof/>
+        </w:rPr>
         <w:lastRenderedPageBreak/>
         <w:drawing>
           <wp:inline distT="0" distB="0" distL="0" distR="0" wp14:anchorId="30B086A2" wp14:editId="3122C514">
@@ -4187,7 +4263,7 @@
                     <pic:cNvPicPr/>
                   </pic:nvPicPr>
                   <pic:blipFill>
-                    <a:blip r:embed="rId16"/>
+                    <a:blip r:embed="rId17"/>
                     <a:stretch>
                       <a:fillRect/>
                     </a:stretch>
@@ -4223,6 +4299,9 @@
     </w:p>
     <w:p>
       <w:r>
+        <w:rPr>
+          <w:noProof/>
+        </w:rPr>
         <w:drawing>
           <wp:inline distT="0" distB="0" distL="0" distR="0" wp14:anchorId="4EE3DDB3" wp14:editId="37BAA4FF">
             <wp:extent cx="7103110" cy="447040"/>
@@ -4239,7 +4318,7 @@
                     <pic:cNvPicPr/>
                   </pic:nvPicPr>
                   <pic:blipFill>
-                    <a:blip r:embed="rId17"/>
+                    <a:blip r:embed="rId18"/>
                     <a:stretch>
                       <a:fillRect/>
                     </a:stretch>
@@ -5531,6 +5610,7 @@
       </w:pPr>
       <w:r>
         <w:rPr>
+          <w:noProof/>
           <w:lang w:val="en-US"/>
         </w:rPr>
         <w:drawing>
@@ -5549,7 +5629,7 @@
                     <pic:cNvPicPr/>
                   </pic:nvPicPr>
                   <pic:blipFill>
-                    <a:blip r:embed="rId18"/>
+                    <a:blip r:embed="rId19"/>
                     <a:stretch>
                       <a:fillRect/>
                     </a:stretch>
@@ -5599,6 +5679,7 @@
       </w:pPr>
       <w:r>
         <w:rPr>
+          <w:noProof/>
           <w:lang w:val="en-US"/>
         </w:rPr>
         <w:drawing>
@@ -5617,7 +5698,7 @@
                     <pic:cNvPicPr/>
                   </pic:nvPicPr>
                   <pic:blipFill>
-                    <a:blip r:embed="rId19"/>
+                    <a:blip r:embed="rId20"/>
                     <a:stretch>
                       <a:fillRect/>
                     </a:stretch>
@@ -5646,6 +5727,7 @@
       </w:pPr>
       <w:r>
         <w:rPr>
+          <w:noProof/>
           <w:lang w:val="en-US"/>
         </w:rPr>
         <w:drawing>
@@ -5664,7 +5746,7 @@
                     <pic:cNvPicPr/>
                   </pic:nvPicPr>
                   <pic:blipFill>
-                    <a:blip r:embed="rId20"/>
+                    <a:blip r:embed="rId21"/>
                     <a:stretch>
                       <a:fillRect/>
                     </a:stretch>
@@ -5687,6 +5769,9 @@
     </w:p>
     <w:p>
       <w:r>
+        <w:rPr>
+          <w:noProof/>
+        </w:rPr>
         <w:drawing>
           <wp:inline distT="0" distB="0" distL="0" distR="0" wp14:anchorId="7489DA79" wp14:editId="678F495E">
             <wp:extent cx="5429290" cy="2781320"/>
@@ -5703,7 +5788,7 @@
                     <pic:cNvPicPr/>
                   </pic:nvPicPr>
                   <pic:blipFill>
-                    <a:blip r:embed="rId21"/>
+                    <a:blip r:embed="rId22"/>
                     <a:stretch>
                       <a:fillRect/>
                     </a:stretch>
@@ -5729,6 +5814,9 @@
         <w:pStyle w:val="Heading2"/>
       </w:pPr>
       <w:r>
+        <w:rPr>
+          <w:noProof/>
+        </w:rPr>
         <w:drawing>
           <wp:inline distT="0" distB="0" distL="0" distR="0" wp14:anchorId="68E96CA1" wp14:editId="5DF9581E">
             <wp:extent cx="5762667" cy="2924196"/>
@@ -5745,7 +5833,7 @@
                     <pic:cNvPicPr/>
                   </pic:nvPicPr>
                   <pic:blipFill>
-                    <a:blip r:embed="rId22"/>
+                    <a:blip r:embed="rId23"/>
                     <a:stretch>
                       <a:fillRect/>
                     </a:stretch>
@@ -5771,6 +5859,9 @@
         <w:pStyle w:val="Heading2"/>
       </w:pPr>
       <w:r>
+        <w:rPr>
+          <w:noProof/>
+        </w:rPr>
         <w:lastRenderedPageBreak/>
         <w:drawing>
           <wp:inline distT="0" distB="0" distL="0" distR="0" wp14:anchorId="4EA78666" wp14:editId="0BDBCA14">
@@ -5788,7 +5879,7 @@
                     <pic:cNvPicPr/>
                   </pic:nvPicPr>
                   <pic:blipFill>
-                    <a:blip r:embed="rId23"/>
+                    <a:blip r:embed="rId24"/>
                     <a:stretch>
                       <a:fillRect/>
                     </a:stretch>
@@ -5811,6 +5902,9 @@
     </w:p>
     <w:p>
       <w:r>
+        <w:rPr>
+          <w:noProof/>
+        </w:rPr>
         <w:drawing>
           <wp:inline distT="0" distB="0" distL="0" distR="0" wp14:anchorId="40B9C08E" wp14:editId="311CE758">
             <wp:extent cx="6467522" cy="4524408"/>
@@ -5827,7 +5921,7 @@
                     <pic:cNvPicPr/>
                   </pic:nvPicPr>
                   <pic:blipFill>
-                    <a:blip r:embed="rId24"/>
+                    <a:blip r:embed="rId25"/>
                     <a:stretch>
                       <a:fillRect/>
                     </a:stretch>
@@ -6729,6 +6823,7 @@
   <w:style w:type="character" w:default="1" w:styleId="DefaultParagraphFont">
     <w:name w:val="Default Paragraph Font"/>
     <w:uiPriority w:val="1"/>
+    <w:semiHidden/>
     <w:unhideWhenUsed/>
   </w:style>
   <w:style w:type="table" w:default="1" w:styleId="TableNormal">

</xml_diff>

<commit_message>
added LLM as judge
</commit_message>
<xml_diff>
--- a/Project_details.docx
+++ b/Project_details.docx
@@ -24,7 +24,31 @@
           <w:szCs w:val="36"/>
           <w:lang w:eastAsia="en-IN"/>
         </w:rPr>
-        <w:t>Assignment -  2 Conversational AI</w:t>
+        <w:t xml:space="preserve">Assignment </w:t>
+      </w:r>
+      <w:proofErr w:type="gramStart"/>
+      <w:r>
+        <w:rPr>
+          <w:rFonts w:ascii="Times New Roman" w:eastAsia="Times New Roman" w:hAnsi="Times New Roman" w:cs="Times New Roman"/>
+          <w:b/>
+          <w:bCs/>
+          <w:sz w:val="36"/>
+          <w:szCs w:val="36"/>
+          <w:lang w:eastAsia="en-IN"/>
+        </w:rPr>
+        <w:t>-  2</w:t>
+      </w:r>
+      <w:proofErr w:type="gramEnd"/>
+      <w:r>
+        <w:rPr>
+          <w:rFonts w:ascii="Times New Roman" w:eastAsia="Times New Roman" w:hAnsi="Times New Roman" w:cs="Times New Roman"/>
+          <w:b/>
+          <w:bCs/>
+          <w:sz w:val="36"/>
+          <w:szCs w:val="36"/>
+          <w:lang w:eastAsia="en-IN"/>
+        </w:rPr>
+        <w:t xml:space="preserve"> Conversational AI</w:t>
       </w:r>
     </w:p>
     <w:tbl>
@@ -168,7 +192,7 @@
                 <w:szCs w:val="24"/>
                 <w:lang w:eastAsia="en-IN"/>
               </w:rPr>
-              <w:t>Anirban Som</w:t>
+              <w:t>Tishya Banerjee</w:t>
             </w:r>
           </w:p>
         </w:tc>
@@ -194,7 +218,7 @@
                 <w:szCs w:val="24"/>
                 <w:lang w:eastAsia="en-IN"/>
               </w:rPr>
-              <w:t>2024aa05281</w:t>
+              <w:t>2024aa05169</w:t>
             </w:r>
           </w:p>
         </w:tc>
@@ -215,6 +239,24 @@
                 <w:lang w:eastAsia="en-IN"/>
               </w:rPr>
             </w:pPr>
+            <w:r>
+              <w:rPr>
+                <w:rFonts w:ascii="Times New Roman" w:eastAsia="Times New Roman" w:hAnsi="Times New Roman" w:cs="Times New Roman"/>
+                <w:sz w:val="24"/>
+                <w:szCs w:val="24"/>
+                <w:lang w:eastAsia="en-IN"/>
+              </w:rPr>
+              <w:t>Saurabh</w:t>
+            </w:r>
+            <w:r>
+              <w:rPr>
+                <w:rFonts w:ascii="Times New Roman" w:eastAsia="Times New Roman" w:hAnsi="Times New Roman" w:cs="Times New Roman"/>
+                <w:sz w:val="24"/>
+                <w:szCs w:val="24"/>
+                <w:lang w:eastAsia="en-IN"/>
+              </w:rPr>
+              <w:t xml:space="preserve"> Mishra</w:t>
+            </w:r>
           </w:p>
         </w:tc>
         <w:tc>
@@ -232,6 +274,15 @@
                 <w:lang w:eastAsia="en-IN"/>
               </w:rPr>
             </w:pPr>
+            <w:r>
+              <w:rPr>
+                <w:rFonts w:ascii="Times New Roman" w:eastAsia="Times New Roman" w:hAnsi="Times New Roman" w:cs="Times New Roman"/>
+                <w:sz w:val="24"/>
+                <w:szCs w:val="24"/>
+                <w:lang w:eastAsia="en-IN"/>
+              </w:rPr>
+              <w:t>2024AA05604</w:t>
+            </w:r>
           </w:p>
         </w:tc>
       </w:tr>
@@ -251,6 +302,15 @@
                 <w:lang w:eastAsia="en-IN"/>
               </w:rPr>
             </w:pPr>
+            <w:r>
+              <w:rPr>
+                <w:rFonts w:ascii="Times New Roman" w:eastAsia="Times New Roman" w:hAnsi="Times New Roman" w:cs="Times New Roman"/>
+                <w:sz w:val="24"/>
+                <w:szCs w:val="24"/>
+                <w:lang w:eastAsia="en-IN"/>
+              </w:rPr>
+              <w:t>Anirban Som</w:t>
+            </w:r>
           </w:p>
         </w:tc>
         <w:tc>
@@ -268,6 +328,15 @@
                 <w:lang w:eastAsia="en-IN"/>
               </w:rPr>
             </w:pPr>
+            <w:r>
+              <w:rPr>
+                <w:rFonts w:ascii="Times New Roman" w:eastAsia="Times New Roman" w:hAnsi="Times New Roman" w:cs="Times New Roman"/>
+                <w:sz w:val="24"/>
+                <w:szCs w:val="24"/>
+                <w:lang w:eastAsia="en-IN"/>
+              </w:rPr>
+              <w:t>2024AA05281</w:t>
+            </w:r>
           </w:p>
         </w:tc>
       </w:tr>
@@ -1038,8 +1107,79 @@
                 <w:szCs w:val="20"/>
                 <w:lang w:eastAsia="en-IN"/>
               </w:rPr>
-              <w:t>src/corpus/clean_text.py --input data_random/cleaned_text --output data_random/cleaned_text_final</w:t>
+              <w:t xml:space="preserve">src/corpus/clean_text.py --input </w:t>
             </w:r>
+            <w:proofErr w:type="spellStart"/>
+            <w:r>
+              <w:rPr>
+                <w:rFonts w:ascii="Courier New" w:eastAsia="Times New Roman" w:hAnsi="Courier New" w:cs="Courier New"/>
+                <w:sz w:val="20"/>
+                <w:szCs w:val="20"/>
+                <w:lang w:eastAsia="en-IN"/>
+              </w:rPr>
+              <w:t>data_random</w:t>
+            </w:r>
+            <w:proofErr w:type="spellEnd"/>
+            <w:r>
+              <w:rPr>
+                <w:rFonts w:ascii="Courier New" w:eastAsia="Times New Roman" w:hAnsi="Courier New" w:cs="Courier New"/>
+                <w:sz w:val="20"/>
+                <w:szCs w:val="20"/>
+                <w:lang w:eastAsia="en-IN"/>
+              </w:rPr>
+              <w:t>/</w:t>
+            </w:r>
+            <w:proofErr w:type="spellStart"/>
+            <w:r>
+              <w:rPr>
+                <w:rFonts w:ascii="Courier New" w:eastAsia="Times New Roman" w:hAnsi="Courier New" w:cs="Courier New"/>
+                <w:sz w:val="20"/>
+                <w:szCs w:val="20"/>
+                <w:lang w:eastAsia="en-IN"/>
+              </w:rPr>
+              <w:t>cleaned_text</w:t>
+            </w:r>
+            <w:proofErr w:type="spellEnd"/>
+            <w:r>
+              <w:rPr>
+                <w:rFonts w:ascii="Courier New" w:eastAsia="Times New Roman" w:hAnsi="Courier New" w:cs="Courier New"/>
+                <w:sz w:val="20"/>
+                <w:szCs w:val="20"/>
+                <w:lang w:eastAsia="en-IN"/>
+              </w:rPr>
+              <w:t xml:space="preserve"> --output </w:t>
+            </w:r>
+            <w:proofErr w:type="spellStart"/>
+            <w:r>
+              <w:rPr>
+                <w:rFonts w:ascii="Courier New" w:eastAsia="Times New Roman" w:hAnsi="Courier New" w:cs="Courier New"/>
+                <w:sz w:val="20"/>
+                <w:szCs w:val="20"/>
+                <w:lang w:eastAsia="en-IN"/>
+              </w:rPr>
+              <w:t>data_random</w:t>
+            </w:r>
+            <w:proofErr w:type="spellEnd"/>
+            <w:r>
+              <w:rPr>
+                <w:rFonts w:ascii="Courier New" w:eastAsia="Times New Roman" w:hAnsi="Courier New" w:cs="Courier New"/>
+                <w:sz w:val="20"/>
+                <w:szCs w:val="20"/>
+                <w:lang w:eastAsia="en-IN"/>
+              </w:rPr>
+              <w:t>/</w:t>
+            </w:r>
+            <w:proofErr w:type="spellStart"/>
+            <w:r>
+              <w:rPr>
+                <w:rFonts w:ascii="Courier New" w:eastAsia="Times New Roman" w:hAnsi="Courier New" w:cs="Courier New"/>
+                <w:sz w:val="20"/>
+                <w:szCs w:val="20"/>
+                <w:lang w:eastAsia="en-IN"/>
+              </w:rPr>
+              <w:t>cleaned_text_final</w:t>
+            </w:r>
+            <w:proofErr w:type="spellEnd"/>
           </w:p>
         </w:tc>
         <w:tc>
@@ -1097,8 +1237,39 @@
                 <w:szCs w:val="20"/>
                 <w:lang w:eastAsia="en-IN"/>
               </w:rPr>
-              <w:t>src/corpus/clean_text.py --input data/cleaned_text --output data/cleaned_text_final</w:t>
+              <w:t>src/corpus/clean_text.py --input data/</w:t>
             </w:r>
+            <w:proofErr w:type="spellStart"/>
+            <w:r>
+              <w:rPr>
+                <w:rFonts w:ascii="Courier New" w:eastAsia="Times New Roman" w:hAnsi="Courier New" w:cs="Courier New"/>
+                <w:sz w:val="20"/>
+                <w:szCs w:val="20"/>
+                <w:lang w:eastAsia="en-IN"/>
+              </w:rPr>
+              <w:t>cleaned_text</w:t>
+            </w:r>
+            <w:proofErr w:type="spellEnd"/>
+            <w:r>
+              <w:rPr>
+                <w:rFonts w:ascii="Courier New" w:eastAsia="Times New Roman" w:hAnsi="Courier New" w:cs="Courier New"/>
+                <w:sz w:val="20"/>
+                <w:szCs w:val="20"/>
+                <w:lang w:eastAsia="en-IN"/>
+              </w:rPr>
+              <w:t xml:space="preserve"> --output data/</w:t>
+            </w:r>
+            <w:proofErr w:type="spellStart"/>
+            <w:r>
+              <w:rPr>
+                <w:rFonts w:ascii="Courier New" w:eastAsia="Times New Roman" w:hAnsi="Courier New" w:cs="Courier New"/>
+                <w:sz w:val="20"/>
+                <w:szCs w:val="20"/>
+                <w:lang w:eastAsia="en-IN"/>
+              </w:rPr>
+              <w:t>cleaned_text_final</w:t>
+            </w:r>
+            <w:proofErr w:type="spellEnd"/>
           </w:p>
         </w:tc>
         <w:tc>
@@ -1183,7 +1354,17 @@
                 <w:szCs w:val="24"/>
                 <w:lang w:eastAsia="en-IN"/>
               </w:rPr>
-              <w:t xml:space="preserve">Generates dense embeddings and stores them in </w:t>
+              <w:t xml:space="preserve">Generates dense embeddings and stores them </w:t>
+            </w:r>
+            <w:proofErr w:type="gramStart"/>
+            <w:r>
+              <w:rPr>
+                <w:rFonts w:ascii="Times New Roman" w:eastAsia="Times New Roman" w:hAnsi="Times New Roman" w:cs="Times New Roman"/>
+                <w:sz w:val="24"/>
+                <w:szCs w:val="24"/>
+                <w:lang w:eastAsia="en-IN"/>
+              </w:rPr>
+              <w:t xml:space="preserve">in </w:t>
             </w:r>
             <w:r>
               <w:rPr>
@@ -1192,8 +1373,20 @@
                 <w:szCs w:val="20"/>
                 <w:lang w:eastAsia="en-IN"/>
               </w:rPr>
-              <w:t>.jsonl</w:t>
+              <w:t>.</w:t>
             </w:r>
+            <w:proofErr w:type="spellStart"/>
+            <w:r>
+              <w:rPr>
+                <w:rFonts w:ascii="Courier New" w:eastAsia="Times New Roman" w:hAnsi="Courier New" w:cs="Courier New"/>
+                <w:sz w:val="20"/>
+                <w:szCs w:val="20"/>
+                <w:lang w:eastAsia="en-IN"/>
+              </w:rPr>
+              <w:t>jsonl</w:t>
+            </w:r>
+            <w:proofErr w:type="spellEnd"/>
+            <w:proofErr w:type="gramEnd"/>
             <w:r>
               <w:rPr>
                 <w:rFonts w:ascii="Times New Roman" w:eastAsia="Times New Roman" w:hAnsi="Times New Roman" w:cs="Times New Roman"/>
@@ -1269,8 +1462,19 @@
                 <w:szCs w:val="20"/>
                 <w:lang w:eastAsia="en-IN"/>
               </w:rPr>
-              <w:t>bm25_index.json</w:t>
+              <w:t>bm25_</w:t>
             </w:r>
+            <w:proofErr w:type="gramStart"/>
+            <w:r>
+              <w:rPr>
+                <w:rFonts w:ascii="Courier New" w:eastAsia="Times New Roman" w:hAnsi="Courier New" w:cs="Courier New"/>
+                <w:sz w:val="20"/>
+                <w:szCs w:val="20"/>
+                <w:lang w:eastAsia="en-IN"/>
+              </w:rPr>
+              <w:t>index.json</w:t>
+            </w:r>
+            <w:proofErr w:type="gramEnd"/>
             <w:r>
               <w:rPr>
                 <w:rFonts w:ascii="Times New Roman" w:eastAsia="Times New Roman" w:hAnsi="Times New Roman" w:cs="Times New Roman"/>
@@ -1346,8 +1550,19 @@
                 <w:szCs w:val="20"/>
                 <w:lang w:eastAsia="en-IN"/>
               </w:rPr>
-              <w:t>data/embeddings_merged.jsonl</w:t>
+              <w:t>data/</w:t>
             </w:r>
+            <w:proofErr w:type="spellStart"/>
+            <w:r>
+              <w:rPr>
+                <w:rFonts w:ascii="Courier New" w:eastAsia="Times New Roman" w:hAnsi="Courier New" w:cs="Courier New"/>
+                <w:sz w:val="20"/>
+                <w:szCs w:val="20"/>
+                <w:lang w:eastAsia="en-IN"/>
+              </w:rPr>
+              <w:t>embeddings_merged.jsonl</w:t>
+            </w:r>
+            <w:proofErr w:type="spellEnd"/>
           </w:p>
         </w:tc>
       </w:tr>
@@ -1965,6 +2180,7 @@
                 <w:lang w:eastAsia="en-IN"/>
               </w:rPr>
             </w:pPr>
+            <w:proofErr w:type="spellStart"/>
             <w:r>
               <w:rPr>
                 <w:rFonts w:ascii="Courier New" w:eastAsia="Times New Roman" w:hAnsi="Courier New" w:cs="Courier New"/>
@@ -1972,7 +2188,17 @@
                 <w:szCs w:val="20"/>
                 <w:lang w:eastAsia="en-IN"/>
               </w:rPr>
-              <w:t>streamlit run app/app.py</w:t>
+              <w:t>streamlit</w:t>
+            </w:r>
+            <w:proofErr w:type="spellEnd"/>
+            <w:r>
+              <w:rPr>
+                <w:rFonts w:ascii="Courier New" w:eastAsia="Times New Roman" w:hAnsi="Courier New" w:cs="Courier New"/>
+                <w:sz w:val="20"/>
+                <w:szCs w:val="20"/>
+                <w:lang w:eastAsia="en-IN"/>
+              </w:rPr>
+              <w:t xml:space="preserve"> run app/app.py</w:t>
             </w:r>
           </w:p>
         </w:tc>
@@ -2531,7 +2757,27 @@
           <w:szCs w:val="24"/>
           <w:lang w:eastAsia="en-IN"/>
         </w:rPr>
-        <w:t xml:space="preserve"> Also in readme.md</w:t>
+        <w:t xml:space="preserve"> </w:t>
+      </w:r>
+      <w:proofErr w:type="gramStart"/>
+      <w:r>
+        <w:rPr>
+          <w:rFonts w:ascii="Times New Roman" w:eastAsia="Times New Roman" w:hAnsi="Times New Roman" w:cs="Times New Roman"/>
+          <w:sz w:val="24"/>
+          <w:szCs w:val="24"/>
+          <w:lang w:eastAsia="en-IN"/>
+        </w:rPr>
+        <w:t>Also</w:t>
+      </w:r>
+      <w:proofErr w:type="gramEnd"/>
+      <w:r>
+        <w:rPr>
+          <w:rFonts w:ascii="Times New Roman" w:eastAsia="Times New Roman" w:hAnsi="Times New Roman" w:cs="Times New Roman"/>
+          <w:sz w:val="24"/>
+          <w:szCs w:val="24"/>
+          <w:lang w:eastAsia="en-IN"/>
+        </w:rPr>
+        <w:t xml:space="preserve"> in readme.md</w:t>
       </w:r>
     </w:p>
     <w:p>
@@ -2640,7 +2886,35 @@
         <w:rPr>
           <w:lang w:eastAsia="en-IN"/>
         </w:rPr>
-        <w:t xml:space="preserve">At vscode prompt change directory to  path within </w:t>
+        <w:t xml:space="preserve">At </w:t>
+      </w:r>
+      <w:proofErr w:type="spellStart"/>
+      <w:r>
+        <w:rPr>
+          <w:lang w:eastAsia="en-IN"/>
+        </w:rPr>
+        <w:t>vscode</w:t>
+      </w:r>
+      <w:proofErr w:type="spellEnd"/>
+      <w:r>
+        <w:rPr>
+          <w:lang w:eastAsia="en-IN"/>
+        </w:rPr>
+        <w:t xml:space="preserve"> prompt change directory </w:t>
+      </w:r>
+      <w:proofErr w:type="gramStart"/>
+      <w:r>
+        <w:rPr>
+          <w:lang w:eastAsia="en-IN"/>
+        </w:rPr>
+        <w:t>to  path</w:t>
+      </w:r>
+      <w:proofErr w:type="gramEnd"/>
+      <w:r>
+        <w:rPr>
+          <w:lang w:eastAsia="en-IN"/>
+        </w:rPr>
+        <w:t xml:space="preserve"> within </w:t>
       </w:r>
       <w:r>
         <w:rPr>
@@ -2664,8 +2938,44 @@
         <w:rPr>
           <w:lang w:eastAsia="en-IN"/>
         </w:rPr>
-        <w:t>Ensure streamlit package is installed, if not run !pip install streamlit</w:t>
-      </w:r>
+        <w:t xml:space="preserve">Ensure </w:t>
+      </w:r>
+      <w:proofErr w:type="spellStart"/>
+      <w:r>
+        <w:rPr>
+          <w:lang w:eastAsia="en-IN"/>
+        </w:rPr>
+        <w:t>streamlit</w:t>
+      </w:r>
+      <w:proofErr w:type="spellEnd"/>
+      <w:r>
+        <w:rPr>
+          <w:lang w:eastAsia="en-IN"/>
+        </w:rPr>
+        <w:t xml:space="preserve"> package is installed, if not </w:t>
+      </w:r>
+      <w:proofErr w:type="gramStart"/>
+      <w:r>
+        <w:rPr>
+          <w:lang w:eastAsia="en-IN"/>
+        </w:rPr>
+        <w:t>run !pip</w:t>
+      </w:r>
+      <w:proofErr w:type="gramEnd"/>
+      <w:r>
+        <w:rPr>
+          <w:lang w:eastAsia="en-IN"/>
+        </w:rPr>
+        <w:t xml:space="preserve"> install </w:t>
+      </w:r>
+      <w:proofErr w:type="spellStart"/>
+      <w:r>
+        <w:rPr>
+          <w:lang w:eastAsia="en-IN"/>
+        </w:rPr>
+        <w:t>streamlit</w:t>
+      </w:r>
+      <w:proofErr w:type="spellEnd"/>
     </w:p>
     <w:tbl>
       <w:tblPr>
@@ -2711,8 +3021,9 @@
                 <w:szCs w:val="20"/>
                 <w:lang w:eastAsia="en-IN"/>
               </w:rPr>
-              <w:t xml:space="preserve">Run command : </w:t>
+              <w:t xml:space="preserve">Run </w:t>
             </w:r>
+            <w:proofErr w:type="gramStart"/>
             <w:r>
               <w:rPr>
                 <w:rFonts w:ascii="Courier New" w:eastAsia="Times New Roman" w:hAnsi="Courier New" w:cs="Courier New"/>
@@ -2720,7 +3031,37 @@
                 <w:szCs w:val="20"/>
                 <w:lang w:eastAsia="en-IN"/>
               </w:rPr>
-              <w:t>streamlit run app/app.py</w:t>
+              <w:t>command :</w:t>
+            </w:r>
+            <w:proofErr w:type="gramEnd"/>
+            <w:r>
+              <w:rPr>
+                <w:rFonts w:ascii="Courier New" w:eastAsia="Times New Roman" w:hAnsi="Courier New" w:cs="Courier New"/>
+                <w:sz w:val="20"/>
+                <w:szCs w:val="20"/>
+                <w:lang w:eastAsia="en-IN"/>
+              </w:rPr>
+              <w:t xml:space="preserve"> </w:t>
+            </w:r>
+            <w:proofErr w:type="spellStart"/>
+            <w:r>
+              <w:rPr>
+                <w:rFonts w:ascii="Courier New" w:eastAsia="Times New Roman" w:hAnsi="Courier New" w:cs="Courier New"/>
+                <w:sz w:val="20"/>
+                <w:szCs w:val="20"/>
+                <w:lang w:eastAsia="en-IN"/>
+              </w:rPr>
+              <w:t>streamlit</w:t>
+            </w:r>
+            <w:proofErr w:type="spellEnd"/>
+            <w:r>
+              <w:rPr>
+                <w:rFonts w:ascii="Courier New" w:eastAsia="Times New Roman" w:hAnsi="Courier New" w:cs="Courier New"/>
+                <w:sz w:val="20"/>
+                <w:szCs w:val="20"/>
+                <w:lang w:eastAsia="en-IN"/>
+              </w:rPr>
+              <w:t xml:space="preserve"> run app/app.py</w:t>
             </w:r>
           </w:p>
         </w:tc>
@@ -3058,491 +3399,368 @@
       </w:pPr>
       <w:r>
         <w:rPr>
-          <w:lang w:val="en-US"/>
-        </w:rPr>
-        <w:t>answer-level evaluation</w:t>
-      </w:r>
-      <w:r>
-        <w:rPr>
-          <w:lang w:val="en-US"/>
-        </w:rPr>
-        <w:t xml:space="preserve"> : Set of 100 questions generated with randomly selected chunks and ground truth answers generated by the same SLM (Google-FLAN)</w:t>
-      </w:r>
-    </w:p>
-    <w:p>
-      <w:pPr>
-        <w:pStyle w:val="Subtitle"/>
-      </w:pPr>
-    </w:p>
-    <w:p>
-      <w:pPr>
-        <w:rPr>
-          <w:lang w:val="en-US"/>
-        </w:rPr>
-      </w:pPr>
-      <w:r>
-        <w:rPr>
-          <w:lang w:val="en-US"/>
-        </w:rPr>
-        <w:t>1.</w:t>
-      </w:r>
-      <w:r>
-        <w:rPr>
           <w:b/>
           <w:bCs/>
           <w:lang w:val="en-US"/>
         </w:rPr>
-        <w:t>Semantic similarity</w:t>
-      </w:r>
-      <w:r>
-        <w:rPr>
-          <w:lang w:val="en-US"/>
-        </w:rPr>
-        <w:t xml:space="preserve"> between predicted and gold answer using cosine similarity of sentence embeddings from a pre-trained model (all-MiniLM-L6-v2). </w:t>
-      </w:r>
-    </w:p>
-    <w:p>
-      <w:pPr>
-        <w:rPr>
-          <w:lang w:val="en-US"/>
-        </w:rPr>
-      </w:pPr>
-      <w:r>
-        <w:rPr>
-          <w:lang w:val="en-US"/>
-        </w:rPr>
-        <w:t>    This captures the overall semantic closeness of the generated answer to the ground truth answer, beyond just token overlap. It can recognize when two answers are saying the same thing in different words, which is important for evaluating generative models where exact token matches may be less common.</w:t>
-      </w:r>
-    </w:p>
-    <w:p>
-      <w:pPr>
-        <w:rPr>
-          <w:lang w:val="en-US"/>
-        </w:rPr>
-      </w:pPr>
-      <w:r>
-        <w:rPr>
-          <w:lang w:val="en-US"/>
-        </w:rPr>
-        <w:t>     This works by encoding both the predicted answer and the gold answer into dense vector representations using the SentenceTransformer model, and then computing the cosine similarity between these two vectors.</w:t>
-      </w:r>
-    </w:p>
-    <w:p>
-      <w:pPr>
-        <w:rPr>
-          <w:lang w:val="en-US"/>
-        </w:rPr>
-      </w:pPr>
-      <w:r>
-        <w:rPr>
-          <w:lang w:val="en-US"/>
-        </w:rPr>
-        <w:t>    Works better than simple token overlap metrics like F1 because it can capture semantic equivalence even when there are few or no shared tokens, as long as the overall meaning is similar.</w:t>
-      </w:r>
-    </w:p>
-    <w:p>
-      <w:pPr>
-        <w:rPr>
-          <w:lang w:val="en-US"/>
-        </w:rPr>
-      </w:pPr>
-      <w:r>
-        <w:rPr>
-          <w:lang w:val="en-US"/>
-        </w:rPr>
-        <w:t>    However, it may not be as interpretable as token-based metrics and can sometimes give high similarity scores to answers that are semantically related but not actually correct. Therefore, it's best used in conjunction with other metrics like F1 for a more comprehensive evaluation</w:t>
-      </w:r>
-    </w:p>
-    <w:p>
-      <w:pPr>
-        <w:rPr>
-          <w:lang w:val="en-US"/>
-        </w:rPr>
-      </w:pPr>
-      <w:r>
-        <w:rPr>
-          <w:lang w:val="en-US"/>
-        </w:rPr>
-        <w:t>    More useful for larger answers where there is more content to capture semantic meaning, and less useful for very short answers where token overlap may be more indicative of correctness.</w:t>
-      </w:r>
-    </w:p>
-    <w:p>
-      <w:pPr>
-        <w:rPr>
-          <w:lang w:val="en-US"/>
-        </w:rPr>
-      </w:pPr>
-      <w:r>
-        <w:rPr>
-          <w:lang w:val="en-US"/>
-        </w:rPr>
-        <w:t>    :param pred: Answer generated by the RAG system for a given question from K-chunks. This is generated by a LLM (Google Flan-T5-Base) using retrieved K chunks as context.</w:t>
-      </w:r>
-    </w:p>
-    <w:p>
-      <w:pPr>
-        <w:rPr>
-          <w:lang w:val="en-US"/>
-        </w:rPr>
-      </w:pPr>
-      <w:r>
-        <w:rPr>
-          <w:lang w:val="en-US"/>
-        </w:rPr>
-        <w:t>    :param gold: ground truth from a set of questions with known answers. Questions are generatred using SLM (Google Flan-T5-Base) supplying random retrieved chunks as context</w:t>
-      </w:r>
-    </w:p>
-    <w:p>
-      <w:pPr>
-        <w:rPr>
-          <w:lang w:val="en-US"/>
-        </w:rPr>
-      </w:pPr>
-      <w:r>
-        <w:rPr>
-          <w:lang w:val="en-US"/>
-        </w:rPr>
-        <w:t xml:space="preserve">    ground truth answers are answers generated by the same model (Flan-T5-Base) with the same question but with gold retrieved chunks as context. This way we have a "best possible answer" for each question </w:t>
-      </w:r>
-    </w:p>
-    <w:p>
-      <w:pPr>
-        <w:rPr>
-          <w:lang w:val="en-US"/>
-        </w:rPr>
-      </w:pPr>
-      <w:r>
-        <w:rPr>
-          <w:lang w:val="en-US"/>
-        </w:rPr>
-        <w:t>    that is still generated by the same model and not human annotated, which would be unfairly harsh.</w:t>
-      </w:r>
-    </w:p>
-    <w:p>
-      <w:pPr>
+        <w:t>answer-</w:t>
+      </w:r>
+      <w:r>
         <w:rPr>
           <w:b/>
           <w:bCs/>
           <w:lang w:val="en-US"/>
         </w:rPr>
-      </w:pPr>
+        <w:t>quality</w:t>
+      </w:r>
       <w:r>
         <w:rPr>
           <w:b/>
           <w:bCs/>
           <w:lang w:val="en-US"/>
         </w:rPr>
-        <w:t>2. F1 score:</w:t>
-      </w:r>
-    </w:p>
-    <w:p>
-      <w:pPr>
-        <w:rPr>
-          <w:lang w:val="en-US"/>
-        </w:rPr>
-      </w:pPr>
-      <w:r>
-        <w:rPr>
-          <w:lang w:val="en-US"/>
-        </w:rPr>
-        <w:t>F1 score between ground truth and predicted answer based on token overlap after normalization. (answer-level evaluation</w:t>
-      </w:r>
-      <w:r>
-        <w:rPr>
-          <w:lang w:val="en-US"/>
-        </w:rPr>
-        <w:t>.</w:t>
-      </w:r>
-    </w:p>
-    <w:p>
-      <w:pPr>
-        <w:rPr>
-          <w:lang w:val="en-US"/>
-        </w:rPr>
-      </w:pPr>
-      <w:r>
-        <w:rPr>
-          <w:lang w:val="en-US"/>
-        </w:rPr>
-        <w:t>    :param pred: Answer generated by the RAG system for a given question. This is generated by a LLM (Google Flan-T5-Base) using retrieved K chunks as context.</w:t>
-      </w:r>
-    </w:p>
-    <w:p>
-      <w:pPr>
-        <w:rPr>
-          <w:lang w:val="en-US"/>
-        </w:rPr>
-      </w:pPr>
-      <w:r>
-        <w:rPr>
-          <w:lang w:val="en-US"/>
-        </w:rPr>
-        <w:t>    :param gold: ground truth from a set of questions with known answers. Questions are generated using SLM (Google Flan-T5-Base) supplying random retrieved chunks as context</w:t>
-      </w:r>
-    </w:p>
-    <w:p>
-      <w:pPr>
-        <w:rPr>
-          <w:lang w:val="en-US"/>
-        </w:rPr>
-      </w:pPr>
-      <w:r>
-        <w:rPr>
-          <w:lang w:val="en-US"/>
-        </w:rPr>
-        <w:t xml:space="preserve">    ground truth answers are answers generated by the same model (Flan-T5-Base) with the same question but with gold retrieved chunks as context. This way we have a "best possible answer" for each question </w:t>
-      </w:r>
-    </w:p>
-    <w:p>
-      <w:pPr>
-        <w:rPr>
-          <w:lang w:val="en-US"/>
-        </w:rPr>
-      </w:pPr>
-      <w:r>
-        <w:rPr>
-          <w:lang w:val="en-US"/>
-        </w:rPr>
-        <w:t>    that is still generated by the same model and not human annotated, which would be unfairly harsh.</w:t>
-      </w:r>
-    </w:p>
-    <w:p>
-      <w:pPr>
-        <w:rPr>
-          <w:lang w:val="en-US"/>
-        </w:rPr>
-      </w:pPr>
-      <w:r>
-        <w:rPr>
-          <w:lang w:val="en-US"/>
-        </w:rPr>
-        <w:t>    The random questions and answers generated ensure no human bias, and when compared with the RAG generated answer, we can see how close the RAG system gets to the best possible answer at k chunks that the model can generate given perfect retrieval.</w:t>
-      </w:r>
-    </w:p>
-    <w:p>
-      <w:pPr>
-        <w:rPr>
-          <w:lang w:val="en-US"/>
-        </w:rPr>
-      </w:pPr>
-      <w:r>
-        <w:rPr>
-          <w:lang w:val="en-US"/>
-        </w:rPr>
-        <w:lastRenderedPageBreak/>
-        <w:t>    Overlap of tokens is computed after normalization which includes: Lowercasing, stop</w:t>
-      </w:r>
-      <w:r>
-        <w:rPr>
-          <w:lang w:val="en-US"/>
-        </w:rPr>
         <w:t xml:space="preserve"> </w:t>
       </w:r>
-      <w:r>
-        <w:rPr>
-          <w:lang w:val="en-US"/>
-        </w:rPr>
-        <w:t>word removal, stemming, and punctuation removal. This is to ensure that we are comparing the core content of the answers rather than surface-level differences.</w:t>
-      </w:r>
-    </w:p>
-    <w:p>
-      <w:pPr>
-        <w:rPr>
-          <w:lang w:val="en-US"/>
-        </w:rPr>
-      </w:pPr>
+      <w:proofErr w:type="gramStart"/>
       <w:r>
         <w:rPr>
           <w:b/>
           <w:bCs/>
           <w:lang w:val="en-US"/>
         </w:rPr>
-        <w:t>Retrieval level:</w:t>
-      </w:r>
-      <w:r>
-        <w:rPr>
-          <w:lang w:val="en-US"/>
-        </w:rPr>
-        <w:t xml:space="preserve"> Given the predicted answer and chunks check how relevant and grounded the answers are with the retrieved chunks . Higher score means more grounded, less chance of hallucination.</w:t>
-      </w:r>
-    </w:p>
-    <w:p>
-      <w:pPr>
-        <w:rPr>
-          <w:lang w:val="en-US"/>
-        </w:rPr>
-      </w:pPr>
-    </w:p>
-    <w:p>
-      <w:pPr>
-        <w:rPr>
-          <w:lang w:val="en-US"/>
-        </w:rPr>
-      </w:pPr>
+        <w:t>evaluation</w:t>
+      </w:r>
+      <w:r>
+        <w:rPr>
+          <w:lang w:val="en-US"/>
+        </w:rPr>
+        <w:t xml:space="preserve"> :</w:t>
+      </w:r>
+      <w:proofErr w:type="gramEnd"/>
+      <w:r>
+        <w:rPr>
+          <w:lang w:val="en-US"/>
+        </w:rPr>
+        <w:t xml:space="preserve"> Set of 100 questions generated with randomly selected chunks and ground truth answers generated by the same SLM (Google-FLAN)</w:t>
+      </w:r>
+    </w:p>
+    <w:p>
+      <w:pPr>
+        <w:pStyle w:val="Subtitle"/>
+      </w:pPr>
+    </w:p>
+    <w:p>
+      <w:pPr>
+        <w:rPr>
+          <w:lang w:val="en-US"/>
+        </w:rPr>
+      </w:pPr>
+      <w:r>
+        <w:rPr>
+          <w:lang w:val="en-US"/>
+        </w:rPr>
+        <w:t>1.</w:t>
+      </w:r>
       <w:r>
         <w:rPr>
           <w:b/>
           <w:bCs/>
           <w:lang w:val="en-US"/>
         </w:rPr>
-        <w:t xml:space="preserve">1. </w:t>
-      </w:r>
-      <w:r>
+        <w:t>Semantic similarity</w:t>
+      </w:r>
+      <w:r>
+        <w:rPr>
+          <w:lang w:val="en-US"/>
+        </w:rPr>
+        <w:t xml:space="preserve"> between predicted and gold </w:t>
+      </w:r>
+      <w:proofErr w:type="gramStart"/>
+      <w:r>
+        <w:rPr>
+          <w:lang w:val="en-US"/>
+        </w:rPr>
+        <w:t>answer</w:t>
+      </w:r>
+      <w:proofErr w:type="gramEnd"/>
+      <w:r>
+        <w:rPr>
+          <w:lang w:val="en-US"/>
+        </w:rPr>
+        <w:t xml:space="preserve"> using cosine similarity of sentence embeddings from a pre-trained model (all-MiniLM-L6-v2). </w:t>
+      </w:r>
+    </w:p>
+    <w:p>
+      <w:pPr>
+        <w:rPr>
+          <w:lang w:val="en-US"/>
+        </w:rPr>
+      </w:pPr>
+      <w:r>
+        <w:rPr>
+          <w:lang w:val="en-US"/>
+        </w:rPr>
+        <w:t xml:space="preserve">    This captures the overall semantic closeness of the generated answer to the ground truth answer, beyond just </w:t>
+      </w:r>
+      <w:proofErr w:type="gramStart"/>
+      <w:r>
+        <w:rPr>
+          <w:lang w:val="en-US"/>
+        </w:rPr>
+        <w:t>token</w:t>
+      </w:r>
+      <w:proofErr w:type="gramEnd"/>
+      <w:r>
+        <w:rPr>
+          <w:lang w:val="en-US"/>
+        </w:rPr>
+        <w:t xml:space="preserve"> overlap. It can recognize when two answers are saying the same thing in different words, which is important for evaluating generative models where exact token matches may be less common.</w:t>
+      </w:r>
+    </w:p>
+    <w:p>
+      <w:pPr>
+        <w:rPr>
+          <w:lang w:val="en-US"/>
+        </w:rPr>
+      </w:pPr>
+      <w:r>
+        <w:rPr>
+          <w:lang w:val="en-US"/>
+        </w:rPr>
+        <w:t xml:space="preserve">     This works by encoding both the predicted answer and the gold answer into dense vector representations using the </w:t>
+      </w:r>
+      <w:proofErr w:type="spellStart"/>
+      <w:r>
+        <w:rPr>
+          <w:lang w:val="en-US"/>
+        </w:rPr>
+        <w:t>SentenceTransformer</w:t>
+      </w:r>
+      <w:proofErr w:type="spellEnd"/>
+      <w:r>
+        <w:rPr>
+          <w:lang w:val="en-US"/>
+        </w:rPr>
+        <w:t xml:space="preserve"> </w:t>
+      </w:r>
+      <w:proofErr w:type="gramStart"/>
+      <w:r>
+        <w:rPr>
+          <w:lang w:val="en-US"/>
+        </w:rPr>
+        <w:t>model, and</w:t>
+      </w:r>
+      <w:proofErr w:type="gramEnd"/>
+      <w:r>
+        <w:rPr>
+          <w:lang w:val="en-US"/>
+        </w:rPr>
+        <w:t xml:space="preserve"> then computing the cosine similarity between these two vectors.</w:t>
+      </w:r>
+    </w:p>
+    <w:p>
+      <w:pPr>
+        <w:rPr>
+          <w:lang w:val="en-US"/>
+        </w:rPr>
+      </w:pPr>
+      <w:r>
+        <w:rPr>
+          <w:lang w:val="en-US"/>
+        </w:rPr>
+        <w:t xml:space="preserve">    Works better than simple token overlap metrics like F1 because it can capture semantic equivalence even when there are few or no shared tokens, </w:t>
+      </w:r>
+      <w:proofErr w:type="gramStart"/>
+      <w:r>
+        <w:rPr>
+          <w:lang w:val="en-US"/>
+        </w:rPr>
+        <w:t>as long as</w:t>
+      </w:r>
+      <w:proofErr w:type="gramEnd"/>
+      <w:r>
+        <w:rPr>
+          <w:lang w:val="en-US"/>
+        </w:rPr>
+        <w:t xml:space="preserve"> the overall meaning is similar.</w:t>
+      </w:r>
+    </w:p>
+    <w:p>
+      <w:pPr>
+        <w:rPr>
+          <w:lang w:val="en-US"/>
+        </w:rPr>
+      </w:pPr>
+      <w:r>
+        <w:rPr>
+          <w:lang w:val="en-US"/>
+        </w:rPr>
+        <w:t>    However, it may not be as interpretable as token-based metrics and can sometimes give high similarity scores to answers that are semantically related but not actually correct. Therefore, it's best used in conjunction with other metrics like F1 for a more comprehensive evaluation</w:t>
+      </w:r>
+    </w:p>
+    <w:p>
+      <w:pPr>
+        <w:rPr>
+          <w:lang w:val="en-US"/>
+        </w:rPr>
+      </w:pPr>
+      <w:r>
+        <w:rPr>
+          <w:lang w:val="en-US"/>
+        </w:rPr>
+        <w:t>    More useful for larger answers where there is more content to capture semantic meaning, and less useful for very short answers where token overlap may be more indicative of correctness.</w:t>
+      </w:r>
+    </w:p>
+    <w:p>
+      <w:pPr>
+        <w:rPr>
+          <w:lang w:val="en-US"/>
+        </w:rPr>
+      </w:pPr>
+      <w:r>
+        <w:rPr>
+          <w:lang w:val="en-US"/>
+        </w:rPr>
+        <w:t xml:space="preserve">    </w:t>
+      </w:r>
+      <w:proofErr w:type="gramStart"/>
+      <w:r>
+        <w:rPr>
+          <w:lang w:val="en-US"/>
+        </w:rPr>
+        <w:t>:param</w:t>
+      </w:r>
+      <w:proofErr w:type="gramEnd"/>
+      <w:r>
+        <w:rPr>
+          <w:lang w:val="en-US"/>
+        </w:rPr>
+        <w:t xml:space="preserve"> pred: Answer generated by the RAG system for a given question from K-chunks. This is generated by a LLM (Google Flan-T5-Base) using retrieved K chunks as context.</w:t>
+      </w:r>
+    </w:p>
+    <w:p>
+      <w:pPr>
+        <w:rPr>
+          <w:lang w:val="en-US"/>
+        </w:rPr>
+      </w:pPr>
+      <w:r>
+        <w:rPr>
+          <w:lang w:val="en-US"/>
+        </w:rPr>
+        <w:t xml:space="preserve">    </w:t>
+      </w:r>
+      <w:proofErr w:type="gramStart"/>
+      <w:r>
+        <w:rPr>
+          <w:lang w:val="en-US"/>
+        </w:rPr>
+        <w:t>:param</w:t>
+      </w:r>
+      <w:proofErr w:type="gramEnd"/>
+      <w:r>
+        <w:rPr>
+          <w:lang w:val="en-US"/>
+        </w:rPr>
+        <w:t xml:space="preserve"> gold: ground truth from a set of questions with known answers. Questions are </w:t>
+      </w:r>
+      <w:proofErr w:type="spellStart"/>
+      <w:r>
+        <w:rPr>
+          <w:lang w:val="en-US"/>
+        </w:rPr>
+        <w:t>generatred</w:t>
+      </w:r>
+      <w:proofErr w:type="spellEnd"/>
+      <w:r>
+        <w:rPr>
+          <w:lang w:val="en-US"/>
+        </w:rPr>
+        <w:t xml:space="preserve"> using SLM (Google Flan-T5-Base) supplying random retrieved chunks as context</w:t>
+      </w:r>
+    </w:p>
+    <w:p>
+      <w:pPr>
+        <w:rPr>
+          <w:lang w:val="en-US"/>
+        </w:rPr>
+      </w:pPr>
+      <w:r>
+        <w:rPr>
+          <w:lang w:val="en-US"/>
+        </w:rPr>
+        <w:t xml:space="preserve">    ground truth answers are answers generated by the same model (Flan-T5-Base) with the same question but with gold retrieved chunks as context. This way we have </w:t>
+      </w:r>
+      <w:proofErr w:type="gramStart"/>
+      <w:r>
+        <w:rPr>
+          <w:lang w:val="en-US"/>
+        </w:rPr>
+        <w:t>a "</w:t>
+      </w:r>
+      <w:proofErr w:type="gramEnd"/>
+      <w:r>
+        <w:rPr>
+          <w:lang w:val="en-US"/>
+        </w:rPr>
+        <w:t xml:space="preserve">best possible answer" for each question </w:t>
+      </w:r>
+    </w:p>
+    <w:p>
+      <w:pPr>
+        <w:rPr>
+          <w:lang w:val="en-US"/>
+        </w:rPr>
+      </w:pPr>
+      <w:r>
+        <w:rPr>
+          <w:lang w:val="en-US"/>
+        </w:rPr>
+        <w:t>    that is still generated by the same model and not human annotated, which would be unfairly harsh.</w:t>
+      </w:r>
+    </w:p>
+    <w:p>
+      <w:pPr>
         <w:rPr>
           <w:b/>
           <w:bCs/>
           <w:lang w:val="en-US"/>
         </w:rPr>
-        <w:t>NDCG@K</w:t>
-      </w:r>
-      <w:r>
-        <w:rPr>
-          <w:lang w:val="en-US"/>
-        </w:rPr>
-        <w:t xml:space="preserve"> based on relevance scores computed from token overlap between the generated answer and the retrieved chunk text. (retrieval-level evaluation)</w:t>
-      </w:r>
-    </w:p>
-    <w:p>
-      <w:pPr>
-        <w:rPr>
-          <w:lang w:val="en-US"/>
-        </w:rPr>
-      </w:pPr>
-      <w:r>
-        <w:rPr>
-          <w:lang w:val="en-US"/>
-        </w:rPr>
-        <w:t>    Advantage over precision@k is that it gives more weight to chunks that are more relevant (have higher token overlap) rather than treating all supporting chunks equally.</w:t>
-      </w:r>
-      <w:r>
-        <w:rPr>
-          <w:lang w:val="en-US"/>
-        </w:rPr>
-        <w:t xml:space="preserve"> That is NDCG@K score also gives feedback of the ranking quality.</w:t>
-      </w:r>
-      <w:r>
-        <w:rPr>
-          <w:lang w:val="en-US"/>
-        </w:rPr>
-        <w:t xml:space="preserve"> </w:t>
-      </w:r>
-    </w:p>
-    <w:p>
-      <w:pPr>
-        <w:rPr>
-          <w:lang w:val="en-US"/>
-        </w:rPr>
-      </w:pPr>
-      <w:r>
-        <w:rPr>
-          <w:lang w:val="en-US"/>
-        </w:rPr>
-        <w:t>    This way we can capture not just whether a chunk supports the answer, but how strongly it supports it based on content overlap.</w:t>
-      </w:r>
-    </w:p>
-    <w:p>
-      <w:pPr>
-        <w:rPr>
-          <w:lang w:val="en-US"/>
-        </w:rPr>
-      </w:pPr>
-      <w:r>
-        <w:rPr>
-          <w:lang w:val="en-US"/>
-        </w:rPr>
-        <w:t>    # Sort by rank (in case input isn't sorted)</w:t>
-      </w:r>
-    </w:p>
-    <w:p>
-      <w:pPr>
-        <w:rPr>
-          <w:lang w:val="en-US"/>
-        </w:rPr>
-      </w:pPr>
-      <w:r>
-        <w:rPr>
-          <w:lang w:val="en-US"/>
-        </w:rPr>
-        <w:t>    # 1. remove stopwords from answer and chunk text</w:t>
-      </w:r>
-    </w:p>
-    <w:p>
-      <w:pPr>
-        <w:rPr>
-          <w:lang w:val="en-US"/>
-        </w:rPr>
-      </w:pPr>
-      <w:r>
-        <w:rPr>
-          <w:lang w:val="en-US"/>
-        </w:rPr>
-        <w:t>    # 2. use PorterStemmer to stem tokens</w:t>
-      </w:r>
-    </w:p>
-    <w:p>
-      <w:pPr>
-        <w:rPr>
-          <w:lang w:val="en-US"/>
-        </w:rPr>
-      </w:pPr>
-      <w:r>
-        <w:rPr>
-          <w:lang w:val="en-US"/>
-        </w:rPr>
-        <w:t>    # 2. compute relevance score based on overlap</w:t>
-      </w:r>
-    </w:p>
-    <w:p>
-      <w:pPr>
-        <w:rPr>
-          <w:lang w:val="en-US"/>
-        </w:rPr>
-      </w:pPr>
-      <w:r>
-        <w:rPr>
-          <w:lang w:val="en-US"/>
-        </w:rPr>
-        <w:t>    # 3. compute DCG and IDCG</w:t>
-      </w:r>
-    </w:p>
-    <w:p>
-      <w:pPr>
-        <w:rPr>
-          <w:lang w:val="en-US"/>
-        </w:rPr>
-      </w:pPr>
-      <w:r>
-        <w:rPr>
-          <w:lang w:val="en-US"/>
-        </w:rPr>
-        <w:t>2</w:t>
-      </w:r>
+      </w:pPr>
       <w:r>
         <w:rPr>
           <w:b/>
           <w:bCs/>
           <w:lang w:val="en-US"/>
         </w:rPr>
-        <w:t>. precision@k</w:t>
-      </w:r>
-      <w:r>
-        <w:rPr>
-          <w:lang w:val="en-US"/>
-        </w:rPr>
-        <w:t xml:space="preserve"> for supporting chunks in the top-K retrieved chunks.(retrieval-level evaluation)</w:t>
-      </w:r>
-    </w:p>
-    <w:p>
-      <w:pPr>
-        <w:rPr>
-          <w:lang w:val="en-US"/>
-        </w:rPr>
-      </w:pPr>
-      <w:r>
-        <w:rPr>
-          <w:lang w:val="en-US"/>
-        </w:rPr>
-        <w:t>    Here we check how many of the top-K retrieved chunks are actually supporting the answer (based on token overlap) and compute precision accordingly.(count of supporting chunks in top-K / K)</w:t>
+        <w:t>2. F1 score:</w:t>
+      </w:r>
+    </w:p>
+    <w:p>
+      <w:pPr>
+        <w:rPr>
+          <w:lang w:val="en-US"/>
+        </w:rPr>
+      </w:pPr>
+      <w:r>
+        <w:rPr>
+          <w:lang w:val="en-US"/>
+        </w:rPr>
+        <w:t>F1 score between ground truth and predicted answer based on token overlap after normalization. (</w:t>
+      </w:r>
+      <w:proofErr w:type="gramStart"/>
+      <w:r>
+        <w:rPr>
+          <w:lang w:val="en-US"/>
+        </w:rPr>
+        <w:t>answer</w:t>
+      </w:r>
+      <w:proofErr w:type="gramEnd"/>
+      <w:r>
+        <w:rPr>
+          <w:lang w:val="en-US"/>
+        </w:rPr>
+        <w:t>-level evaluation</w:t>
       </w:r>
       <w:r>
         <w:rPr>
@@ -3561,57 +3779,710 @@
         <w:rPr>
           <w:lang w:val="en-US"/>
         </w:rPr>
-        <w:t>This answers the question “Are all the chunks returned relevant?” if yes its 1. It does not consider the ranking of the chunk and treats all the chunks equally. We use this to check especially at lower K (k&lt;5), if this is less, then it’s possible that 1 or more returned chunks are totally irrelevant</w:t>
-      </w:r>
-    </w:p>
-    <w:p>
-      <w:pPr>
-        <w:rPr>
-          <w:lang w:val="en-US"/>
-        </w:rPr>
-      </w:pPr>
-      <w:r>
-        <w:rPr>
-          <w:lang w:val="en-US"/>
-        </w:rPr>
-        <w:t>    :param ranked_chunk_ids: List of chunk IDs in descending order of relevance.</w:t>
-      </w:r>
-    </w:p>
-    <w:p>
-      <w:pPr>
-        <w:rPr>
-          <w:lang w:val="en-US"/>
-        </w:rPr>
-      </w:pPr>
-      <w:r>
-        <w:rPr>
-          <w:lang w:val="en-US"/>
-        </w:rPr>
-        <w:t>    :param supporting_chunk_ids: Set of chunk IDs that support the answer.</w:t>
-      </w:r>
-    </w:p>
-    <w:p>
-      <w:pPr>
-        <w:rPr>
-          <w:lang w:val="en-US"/>
-        </w:rPr>
-      </w:pPr>
-      <w:r>
-        <w:rPr>
-          <w:lang w:val="en-US"/>
-        </w:rPr>
-        <w:t>    :param k: Number of top chunks to consider for precision calculation.</w:t>
-      </w:r>
-    </w:p>
-    <w:p>
-      <w:pPr>
-        <w:rPr>
-          <w:lang w:val="en-US"/>
-        </w:rPr>
-      </w:pPr>
-    </w:p>
-    <w:p>
-      <w:pPr>
+        <w:t xml:space="preserve">    </w:t>
+      </w:r>
+      <w:proofErr w:type="gramStart"/>
+      <w:r>
+        <w:rPr>
+          <w:lang w:val="en-US"/>
+        </w:rPr>
+        <w:t>:param</w:t>
+      </w:r>
+      <w:proofErr w:type="gramEnd"/>
+      <w:r>
+        <w:rPr>
+          <w:lang w:val="en-US"/>
+        </w:rPr>
+        <w:t xml:space="preserve"> pred: Answer generated by the RAG system for a given question. This is generated by a LLM (Google Flan-T5-Base) using retrieved K chunks as context.</w:t>
+      </w:r>
+    </w:p>
+    <w:p>
+      <w:pPr>
+        <w:rPr>
+          <w:lang w:val="en-US"/>
+        </w:rPr>
+      </w:pPr>
+      <w:r>
+        <w:rPr>
+          <w:lang w:val="en-US"/>
+        </w:rPr>
+        <w:t xml:space="preserve">    </w:t>
+      </w:r>
+      <w:proofErr w:type="gramStart"/>
+      <w:r>
+        <w:rPr>
+          <w:lang w:val="en-US"/>
+        </w:rPr>
+        <w:t>:param</w:t>
+      </w:r>
+      <w:proofErr w:type="gramEnd"/>
+      <w:r>
+        <w:rPr>
+          <w:lang w:val="en-US"/>
+        </w:rPr>
+        <w:t xml:space="preserve"> gold: ground truth from a set of questions with known answers. Questions are generated using SLM (Google Flan-T5-Base) supplying random retrieved chunks as context</w:t>
+      </w:r>
+    </w:p>
+    <w:p>
+      <w:pPr>
+        <w:rPr>
+          <w:lang w:val="en-US"/>
+        </w:rPr>
+      </w:pPr>
+      <w:r>
+        <w:rPr>
+          <w:lang w:val="en-US"/>
+        </w:rPr>
+        <w:t xml:space="preserve">    ground truth answers are answers generated by the same model (Flan-T5-Base) with the same question but with gold retrieved chunks as context. This way we have </w:t>
+      </w:r>
+      <w:proofErr w:type="gramStart"/>
+      <w:r>
+        <w:rPr>
+          <w:lang w:val="en-US"/>
+        </w:rPr>
+        <w:t>a "</w:t>
+      </w:r>
+      <w:proofErr w:type="gramEnd"/>
+      <w:r>
+        <w:rPr>
+          <w:lang w:val="en-US"/>
+        </w:rPr>
+        <w:t xml:space="preserve">best possible answer" for each question </w:t>
+      </w:r>
+    </w:p>
+    <w:p>
+      <w:pPr>
+        <w:rPr>
+          <w:lang w:val="en-US"/>
+        </w:rPr>
+      </w:pPr>
+      <w:r>
+        <w:rPr>
+          <w:lang w:val="en-US"/>
+        </w:rPr>
+        <w:t>    that is still generated by the same model and not human annotated, which would be unfairly harsh.</w:t>
+      </w:r>
+    </w:p>
+    <w:p>
+      <w:pPr>
+        <w:rPr>
+          <w:lang w:val="en-US"/>
+        </w:rPr>
+      </w:pPr>
+      <w:r>
+        <w:rPr>
+          <w:lang w:val="en-US"/>
+        </w:rPr>
+        <w:t>    The random questions and answers generated ensure no human bias, and when compared with the RAG generated answer, we can see how close the RAG system gets to the best possible answer at k chunks that the model can generate given perfect retrieval.</w:t>
+      </w:r>
+    </w:p>
+    <w:p>
+      <w:pPr>
+        <w:rPr>
+          <w:lang w:val="en-US"/>
+        </w:rPr>
+      </w:pPr>
+      <w:r>
+        <w:rPr>
+          <w:lang w:val="en-US"/>
+        </w:rPr>
+        <w:lastRenderedPageBreak/>
+        <w:t xml:space="preserve">    Overlap of tokens is computed after normalization which </w:t>
+      </w:r>
+      <w:proofErr w:type="gramStart"/>
+      <w:r>
+        <w:rPr>
+          <w:lang w:val="en-US"/>
+        </w:rPr>
+        <w:t>includes:</w:t>
+      </w:r>
+      <w:proofErr w:type="gramEnd"/>
+      <w:r>
+        <w:rPr>
+          <w:lang w:val="en-US"/>
+        </w:rPr>
+        <w:t xml:space="preserve"> Lowercasing, stop</w:t>
+      </w:r>
+      <w:r>
+        <w:rPr>
+          <w:lang w:val="en-US"/>
+        </w:rPr>
+        <w:t xml:space="preserve"> </w:t>
+      </w:r>
+      <w:r>
+        <w:rPr>
+          <w:lang w:val="en-US"/>
+        </w:rPr>
+        <w:t xml:space="preserve">word removal, stemming, and punctuation removal. This is to ensure that we </w:t>
+      </w:r>
+      <w:proofErr w:type="gramStart"/>
+      <w:r>
+        <w:rPr>
+          <w:lang w:val="en-US"/>
+        </w:rPr>
+        <w:t>are comparing</w:t>
+      </w:r>
+      <w:proofErr w:type="gramEnd"/>
+      <w:r>
+        <w:rPr>
+          <w:lang w:val="en-US"/>
+        </w:rPr>
+        <w:t xml:space="preserve"> the core content of the answers rather than surface-level differences.</w:t>
+      </w:r>
+    </w:p>
+    <w:p>
+      <w:pPr>
+        <w:rPr>
+          <w:lang w:val="en-US"/>
+        </w:rPr>
+      </w:pPr>
+      <w:r>
+        <w:rPr>
+          <w:b/>
+          <w:bCs/>
+          <w:lang w:val="en-US"/>
+        </w:rPr>
+        <w:t>Retrieval level:</w:t>
+      </w:r>
+      <w:r>
+        <w:rPr>
+          <w:lang w:val="en-US"/>
+        </w:rPr>
+        <w:t xml:space="preserve"> Given the predicted answer and chunks check how relevant and grounded the answers are with the retrieved </w:t>
+      </w:r>
+      <w:proofErr w:type="gramStart"/>
+      <w:r>
+        <w:rPr>
+          <w:lang w:val="en-US"/>
+        </w:rPr>
+        <w:t>chunks .</w:t>
+      </w:r>
+      <w:proofErr w:type="gramEnd"/>
+      <w:r>
+        <w:rPr>
+          <w:lang w:val="en-US"/>
+        </w:rPr>
+        <w:t xml:space="preserve"> Higher score means more grounded, less chance of hallucination.</w:t>
+      </w:r>
+    </w:p>
+    <w:p>
+      <w:pPr>
+        <w:rPr>
+          <w:b/>
+          <w:bCs/>
+          <w:lang w:val="en-US"/>
+        </w:rPr>
+      </w:pPr>
+      <w:r>
+        <w:rPr>
+          <w:b/>
+          <w:bCs/>
+          <w:color w:val="44546A" w:themeColor="text2"/>
+          <w:lang w:val="en-US"/>
+        </w:rPr>
+        <w:t xml:space="preserve">Answer quality: </w:t>
+      </w:r>
+      <w:r>
+        <w:rPr>
+          <w:b/>
+          <w:bCs/>
+          <w:lang w:val="en-US"/>
+        </w:rPr>
+        <w:t>Average of Semantic similarity and F1 score for answer quality gives a good understanding of answer quality, with respect to ground truth, also avoids too much penalization from F1 score for not using exact word</w:t>
+      </w:r>
+    </w:p>
+    <w:p>
+      <w:pPr>
+        <w:rPr>
+          <w:lang w:val="en-US"/>
+        </w:rPr>
+      </w:pPr>
+      <w:r>
+        <w:rPr>
+          <w:b/>
+          <w:bCs/>
+          <w:lang w:val="en-US"/>
+        </w:rPr>
+        <w:t xml:space="preserve">1. </w:t>
+      </w:r>
+      <w:r>
+        <w:rPr>
+          <w:b/>
+          <w:bCs/>
+          <w:lang w:val="en-US"/>
+        </w:rPr>
+        <w:t>NDCG@K</w:t>
+      </w:r>
+      <w:r>
+        <w:rPr>
+          <w:lang w:val="en-US"/>
+        </w:rPr>
+        <w:t xml:space="preserve"> based on relevance scores computed from token overlap between the generated answer and the retrieved chunk text. (retrieval-level evaluation)</w:t>
+      </w:r>
+    </w:p>
+    <w:p>
+      <w:pPr>
+        <w:rPr>
+          <w:lang w:val="en-US"/>
+        </w:rPr>
+      </w:pPr>
+      <w:r>
+        <w:rPr>
+          <w:lang w:val="en-US"/>
+        </w:rPr>
+        <w:t xml:space="preserve">    Advantage over </w:t>
+      </w:r>
+      <w:proofErr w:type="spellStart"/>
+      <w:proofErr w:type="gramStart"/>
+      <w:r>
+        <w:rPr>
+          <w:lang w:val="en-US"/>
+        </w:rPr>
+        <w:t>precision@k</w:t>
+      </w:r>
+      <w:proofErr w:type="spellEnd"/>
+      <w:proofErr w:type="gramEnd"/>
+      <w:r>
+        <w:rPr>
+          <w:lang w:val="en-US"/>
+        </w:rPr>
+        <w:t xml:space="preserve"> is that it gives more weight to chunks that are more relevant (have higher token overlap) rather than treating all supporting chunks equally.</w:t>
+      </w:r>
+      <w:r>
+        <w:rPr>
+          <w:lang w:val="en-US"/>
+        </w:rPr>
+        <w:t xml:space="preserve"> That is NDCG@K score also gives feedback of the ranking quality.</w:t>
+      </w:r>
+      <w:r>
+        <w:rPr>
+          <w:lang w:val="en-US"/>
+        </w:rPr>
+        <w:t xml:space="preserve"> </w:t>
+      </w:r>
+    </w:p>
+    <w:p>
+      <w:pPr>
+        <w:rPr>
+          <w:lang w:val="en-US"/>
+        </w:rPr>
+      </w:pPr>
+      <w:r>
+        <w:rPr>
+          <w:lang w:val="en-US"/>
+        </w:rPr>
+        <w:t>    This way we can capture not just whether a chunk supports the answer, but how strongly it supports it based on content overlap.</w:t>
+      </w:r>
+    </w:p>
+    <w:p>
+      <w:pPr>
+        <w:rPr>
+          <w:lang w:val="en-US"/>
+        </w:rPr>
+      </w:pPr>
+      <w:r>
+        <w:rPr>
+          <w:lang w:val="en-US"/>
+        </w:rPr>
+        <w:t>    # Sort by rank (in case input isn't sorted)</w:t>
+      </w:r>
+    </w:p>
+    <w:p>
+      <w:pPr>
+        <w:rPr>
+          <w:lang w:val="en-US"/>
+        </w:rPr>
+      </w:pPr>
+      <w:r>
+        <w:rPr>
+          <w:lang w:val="en-US"/>
+        </w:rPr>
+        <w:t xml:space="preserve">    # 1. remove </w:t>
+      </w:r>
+      <w:proofErr w:type="spellStart"/>
+      <w:r>
+        <w:rPr>
+          <w:lang w:val="en-US"/>
+        </w:rPr>
+        <w:t>stopwords</w:t>
+      </w:r>
+      <w:proofErr w:type="spellEnd"/>
+      <w:r>
+        <w:rPr>
+          <w:lang w:val="en-US"/>
+        </w:rPr>
+        <w:t xml:space="preserve"> from answer and chunk text</w:t>
+      </w:r>
+    </w:p>
+    <w:p>
+      <w:pPr>
+        <w:rPr>
+          <w:lang w:val="en-US"/>
+        </w:rPr>
+      </w:pPr>
+      <w:r>
+        <w:rPr>
+          <w:lang w:val="en-US"/>
+        </w:rPr>
+        <w:t xml:space="preserve">    # 2. use </w:t>
+      </w:r>
+      <w:proofErr w:type="spellStart"/>
+      <w:r>
+        <w:rPr>
+          <w:lang w:val="en-US"/>
+        </w:rPr>
+        <w:t>PorterStemmer</w:t>
+      </w:r>
+      <w:proofErr w:type="spellEnd"/>
+      <w:r>
+        <w:rPr>
+          <w:lang w:val="en-US"/>
+        </w:rPr>
+        <w:t xml:space="preserve"> to stem tokens</w:t>
+      </w:r>
+    </w:p>
+    <w:p>
+      <w:pPr>
+        <w:rPr>
+          <w:lang w:val="en-US"/>
+        </w:rPr>
+      </w:pPr>
+      <w:r>
+        <w:rPr>
+          <w:lang w:val="en-US"/>
+        </w:rPr>
+        <w:t xml:space="preserve">    # 2. </w:t>
+      </w:r>
+      <w:proofErr w:type="gramStart"/>
+      <w:r>
+        <w:rPr>
+          <w:lang w:val="en-US"/>
+        </w:rPr>
+        <w:t>compute</w:t>
+      </w:r>
+      <w:proofErr w:type="gramEnd"/>
+      <w:r>
+        <w:rPr>
+          <w:lang w:val="en-US"/>
+        </w:rPr>
+        <w:t xml:space="preserve"> relevance score based on overlap</w:t>
+      </w:r>
+    </w:p>
+    <w:p>
+      <w:pPr>
+        <w:rPr>
+          <w:lang w:val="en-US"/>
+        </w:rPr>
+      </w:pPr>
+      <w:r>
+        <w:rPr>
+          <w:lang w:val="en-US"/>
+        </w:rPr>
+        <w:t xml:space="preserve">    # 3. </w:t>
+      </w:r>
+      <w:proofErr w:type="gramStart"/>
+      <w:r>
+        <w:rPr>
+          <w:lang w:val="en-US"/>
+        </w:rPr>
+        <w:t>compute</w:t>
+      </w:r>
+      <w:proofErr w:type="gramEnd"/>
+      <w:r>
+        <w:rPr>
+          <w:lang w:val="en-US"/>
+        </w:rPr>
+        <w:t xml:space="preserve"> DCG and IDCG</w:t>
+      </w:r>
+    </w:p>
+    <w:p>
+      <w:pPr>
+        <w:rPr>
+          <w:lang w:val="en-US"/>
+        </w:rPr>
+      </w:pPr>
+      <w:r>
+        <w:rPr>
+          <w:lang w:val="en-US"/>
+        </w:rPr>
+        <w:t>2</w:t>
+      </w:r>
+      <w:r>
+        <w:rPr>
+          <w:b/>
+          <w:bCs/>
+          <w:lang w:val="en-US"/>
+        </w:rPr>
+        <w:t xml:space="preserve">. </w:t>
+      </w:r>
+      <w:proofErr w:type="spellStart"/>
+      <w:proofErr w:type="gramStart"/>
+      <w:r>
+        <w:rPr>
+          <w:b/>
+          <w:bCs/>
+          <w:lang w:val="en-US"/>
+        </w:rPr>
+        <w:t>precision@k</w:t>
+      </w:r>
+      <w:proofErr w:type="spellEnd"/>
+      <w:proofErr w:type="gramEnd"/>
+      <w:r>
+        <w:rPr>
+          <w:lang w:val="en-US"/>
+        </w:rPr>
+        <w:t xml:space="preserve"> for supporting chunks in the </w:t>
+      </w:r>
+      <w:proofErr w:type="gramStart"/>
+      <w:r>
+        <w:rPr>
+          <w:lang w:val="en-US"/>
+        </w:rPr>
+        <w:t>top-K</w:t>
+      </w:r>
+      <w:proofErr w:type="gramEnd"/>
+      <w:r>
+        <w:rPr>
+          <w:lang w:val="en-US"/>
+        </w:rPr>
+        <w:t xml:space="preserve"> retrieved </w:t>
+      </w:r>
+      <w:proofErr w:type="gramStart"/>
+      <w:r>
+        <w:rPr>
+          <w:lang w:val="en-US"/>
+        </w:rPr>
+        <w:t>chunks.(</w:t>
+      </w:r>
+      <w:proofErr w:type="gramEnd"/>
+      <w:r>
+        <w:rPr>
+          <w:lang w:val="en-US"/>
+        </w:rPr>
+        <w:t>retrieval-level evaluation)</w:t>
+      </w:r>
+    </w:p>
+    <w:p>
+      <w:pPr>
+        <w:rPr>
+          <w:lang w:val="en-US"/>
+        </w:rPr>
+      </w:pPr>
+      <w:r>
+        <w:rPr>
+          <w:lang w:val="en-US"/>
+        </w:rPr>
+        <w:t xml:space="preserve">    Here we check how many of the </w:t>
+      </w:r>
+      <w:proofErr w:type="gramStart"/>
+      <w:r>
+        <w:rPr>
+          <w:lang w:val="en-US"/>
+        </w:rPr>
+        <w:t>top-K</w:t>
+      </w:r>
+      <w:proofErr w:type="gramEnd"/>
+      <w:r>
+        <w:rPr>
+          <w:lang w:val="en-US"/>
+        </w:rPr>
+        <w:t xml:space="preserve"> retrieved chunks are </w:t>
+      </w:r>
+      <w:proofErr w:type="gramStart"/>
+      <w:r>
+        <w:rPr>
+          <w:lang w:val="en-US"/>
+        </w:rPr>
+        <w:t>actually supporting</w:t>
+      </w:r>
+      <w:proofErr w:type="gramEnd"/>
+      <w:r>
+        <w:rPr>
+          <w:lang w:val="en-US"/>
+        </w:rPr>
+        <w:t xml:space="preserve"> the answer (based on token overlap) and compute precision </w:t>
+      </w:r>
+      <w:proofErr w:type="gramStart"/>
+      <w:r>
+        <w:rPr>
+          <w:lang w:val="en-US"/>
+        </w:rPr>
+        <w:t>accordingly.(</w:t>
+      </w:r>
+      <w:proofErr w:type="gramEnd"/>
+      <w:r>
+        <w:rPr>
+          <w:lang w:val="en-US"/>
+        </w:rPr>
+        <w:t xml:space="preserve">count of supporting chunks in </w:t>
+      </w:r>
+      <w:proofErr w:type="gramStart"/>
+      <w:r>
+        <w:rPr>
+          <w:lang w:val="en-US"/>
+        </w:rPr>
+        <w:t>top-K</w:t>
+      </w:r>
+      <w:proofErr w:type="gramEnd"/>
+      <w:r>
+        <w:rPr>
+          <w:lang w:val="en-US"/>
+        </w:rPr>
+        <w:t xml:space="preserve"> / K)</w:t>
+      </w:r>
+      <w:r>
+        <w:rPr>
+          <w:lang w:val="en-US"/>
+        </w:rPr>
+        <w:t>.</w:t>
+      </w:r>
+    </w:p>
+    <w:p>
+      <w:pPr>
+        <w:rPr>
+          <w:lang w:val="en-US"/>
+        </w:rPr>
+      </w:pPr>
+      <w:r>
+        <w:rPr>
+          <w:lang w:val="en-US"/>
+        </w:rPr>
+        <w:t xml:space="preserve">This answers the question “Are all the chunks returned relevant?” if </w:t>
+      </w:r>
+      <w:proofErr w:type="gramStart"/>
+      <w:r>
+        <w:rPr>
+          <w:lang w:val="en-US"/>
+        </w:rPr>
+        <w:t>yes</w:t>
+      </w:r>
+      <w:proofErr w:type="gramEnd"/>
+      <w:r>
+        <w:rPr>
+          <w:lang w:val="en-US"/>
+        </w:rPr>
+        <w:t xml:space="preserve"> its 1. It does not consider the ranking of the chunk and treats all the chunks equally. We use this to check especially at lower K (k&lt;5), if this is less, then it’s possible that 1 or more returned chunks are totally irrelevant</w:t>
+      </w:r>
+    </w:p>
+    <w:p>
+      <w:pPr>
+        <w:rPr>
+          <w:lang w:val="en-US"/>
+        </w:rPr>
+      </w:pPr>
+      <w:r>
+        <w:rPr>
+          <w:lang w:val="en-US"/>
+        </w:rPr>
+        <w:t xml:space="preserve">    </w:t>
+      </w:r>
+      <w:proofErr w:type="gramStart"/>
+      <w:r>
+        <w:rPr>
+          <w:lang w:val="en-US"/>
+        </w:rPr>
+        <w:t>:param</w:t>
+      </w:r>
+      <w:proofErr w:type="gramEnd"/>
+      <w:r>
+        <w:rPr>
+          <w:lang w:val="en-US"/>
+        </w:rPr>
+        <w:t xml:space="preserve"> </w:t>
+      </w:r>
+      <w:proofErr w:type="spellStart"/>
+      <w:r>
+        <w:rPr>
+          <w:lang w:val="en-US"/>
+        </w:rPr>
+        <w:t>ranked_chunk_ids</w:t>
+      </w:r>
+      <w:proofErr w:type="spellEnd"/>
+      <w:r>
+        <w:rPr>
+          <w:lang w:val="en-US"/>
+        </w:rPr>
+        <w:t>: List of chunk IDs in descending order of relevance.</w:t>
+      </w:r>
+    </w:p>
+    <w:p>
+      <w:pPr>
+        <w:rPr>
+          <w:lang w:val="en-US"/>
+        </w:rPr>
+      </w:pPr>
+      <w:r>
+        <w:rPr>
+          <w:lang w:val="en-US"/>
+        </w:rPr>
+        <w:t xml:space="preserve">    </w:t>
+      </w:r>
+      <w:proofErr w:type="gramStart"/>
+      <w:r>
+        <w:rPr>
+          <w:lang w:val="en-US"/>
+        </w:rPr>
+        <w:t>:param</w:t>
+      </w:r>
+      <w:proofErr w:type="gramEnd"/>
+      <w:r>
+        <w:rPr>
+          <w:lang w:val="en-US"/>
+        </w:rPr>
+        <w:t xml:space="preserve"> </w:t>
+      </w:r>
+      <w:proofErr w:type="spellStart"/>
+      <w:r>
+        <w:rPr>
+          <w:lang w:val="en-US"/>
+        </w:rPr>
+        <w:t>supporting_chunk_ids</w:t>
+      </w:r>
+      <w:proofErr w:type="spellEnd"/>
+      <w:r>
+        <w:rPr>
+          <w:lang w:val="en-US"/>
+        </w:rPr>
+        <w:t>: Set of chunk IDs that support the answer.</w:t>
+      </w:r>
+    </w:p>
+    <w:p>
+      <w:pPr>
+        <w:rPr>
+          <w:lang w:val="en-US"/>
+        </w:rPr>
+      </w:pPr>
+      <w:r>
+        <w:rPr>
+          <w:lang w:val="en-US"/>
+        </w:rPr>
+        <w:t xml:space="preserve">    </w:t>
+      </w:r>
+      <w:proofErr w:type="gramStart"/>
+      <w:r>
+        <w:rPr>
+          <w:lang w:val="en-US"/>
+        </w:rPr>
+        <w:t>:param</w:t>
+      </w:r>
+      <w:proofErr w:type="gramEnd"/>
+      <w:r>
+        <w:rPr>
+          <w:lang w:val="en-US"/>
+        </w:rPr>
+        <w:t xml:space="preserve"> k: Number of top chunks to consider for precision calculation.</w:t>
+      </w:r>
+    </w:p>
+    <w:p>
+      <w:pPr>
+        <w:rPr>
+          <w:lang w:val="en-US"/>
+        </w:rPr>
+      </w:pPr>
+    </w:p>
+    <w:p>
+      <w:pPr>
+        <w:pStyle w:val="Heading5"/>
         <w:rPr>
           <w:lang w:val="en-US"/>
         </w:rPr>
@@ -3678,7 +4549,47 @@
         <w:rPr>
           <w:lang w:val="en-US"/>
         </w:rPr>
-        <w:t>For Retrieval quality , we use precision@k to understand the over all quality of retrieved k-chunks. The more chunks we retrieve and supply to SLM involves more cost in terms of time, resource and tokens used. Given different values of K we try to determine at what K precision tends to 1. Here it seems 3 -5 is a good number</w:t>
+        <w:t xml:space="preserve">For Retrieval </w:t>
+      </w:r>
+      <w:proofErr w:type="gramStart"/>
+      <w:r>
+        <w:rPr>
+          <w:lang w:val="en-US"/>
+        </w:rPr>
+        <w:t>quality ,</w:t>
+      </w:r>
+      <w:proofErr w:type="gramEnd"/>
+      <w:r>
+        <w:rPr>
+          <w:lang w:val="en-US"/>
+        </w:rPr>
+        <w:t xml:space="preserve"> we use </w:t>
+      </w:r>
+      <w:proofErr w:type="spellStart"/>
+      <w:r>
+        <w:rPr>
+          <w:lang w:val="en-US"/>
+        </w:rPr>
+        <w:t>precision@k</w:t>
+      </w:r>
+      <w:proofErr w:type="spellEnd"/>
+      <w:r>
+        <w:rPr>
+          <w:lang w:val="en-US"/>
+        </w:rPr>
+        <w:t xml:space="preserve"> to understand the </w:t>
+      </w:r>
+      <w:r>
+        <w:rPr>
+          <w:lang w:val="en-US"/>
+        </w:rPr>
+        <w:t>overall</w:t>
+      </w:r>
+      <w:r>
+        <w:rPr>
+          <w:lang w:val="en-US"/>
+        </w:rPr>
+        <w:t xml:space="preserve"> quality of retrieved k-chunks. The more chunks we retrieve and supply to SLM involves more cost in terms of time, resource and tokens used. Given different values of K we try to determine at what K precision tends to 1. Here it seems 3 -5 is a good number</w:t>
       </w:r>
     </w:p>
     <w:p>
@@ -3697,7 +4608,21 @@
         <w:rPr>
           <w:lang w:val="en-US"/>
         </w:rPr>
-        <w:t>, it does not account for the ranking, which NDCG@k does, this helped, when tweaking the RRF calculation especially for hybrid retrieval</w:t>
+        <w:t xml:space="preserve">, it does not account for the ranking, which </w:t>
+      </w:r>
+      <w:proofErr w:type="spellStart"/>
+      <w:r>
+        <w:rPr>
+          <w:lang w:val="en-US"/>
+        </w:rPr>
+        <w:t>NDCG@k</w:t>
+      </w:r>
+      <w:proofErr w:type="spellEnd"/>
+      <w:r>
+        <w:rPr>
+          <w:lang w:val="en-US"/>
+        </w:rPr>
+        <w:t xml:space="preserve"> does, this helped, when tweaking the RRF calculation especially for hybrid retrieval</w:t>
       </w:r>
     </w:p>
     <w:p>
@@ -3805,7 +4730,49 @@
         <w:rPr>
           <w:lang w:val="en-US"/>
         </w:rPr>
-        <w:t xml:space="preserve">Histogram view by ID, for group of 10 questions, question set between 50-60 has poor answer quality. Highest being at the end, 90-100 seem to return high answer quality average of  0.7. Here the average gives equal weightage to both F1, which is actual word match, </w:t>
+        <w:t xml:space="preserve">Histogram view by ID, for group of 10 questions, question set between 50-60 has poor answer quality. Highest being at the end, 90-100 seem to </w:t>
+      </w:r>
+      <w:proofErr w:type="gramStart"/>
+      <w:r>
+        <w:rPr>
+          <w:lang w:val="en-US"/>
+        </w:rPr>
+        <w:t>return</w:t>
+      </w:r>
+      <w:proofErr w:type="gramEnd"/>
+      <w:r>
+        <w:rPr>
+          <w:lang w:val="en-US"/>
+        </w:rPr>
+        <w:t xml:space="preserve"> high answer quality average </w:t>
+      </w:r>
+      <w:proofErr w:type="gramStart"/>
+      <w:r>
+        <w:rPr>
+          <w:lang w:val="en-US"/>
+        </w:rPr>
+        <w:t>of  0.7.</w:t>
+      </w:r>
+      <w:proofErr w:type="gramEnd"/>
+      <w:r>
+        <w:rPr>
+          <w:lang w:val="en-US"/>
+        </w:rPr>
+        <w:t xml:space="preserve"> Here the average gives equal weightage to </w:t>
+      </w:r>
+      <w:proofErr w:type="gramStart"/>
+      <w:r>
+        <w:rPr>
+          <w:lang w:val="en-US"/>
+        </w:rPr>
+        <w:t>both F1</w:t>
+      </w:r>
+      <w:proofErr w:type="gramEnd"/>
+      <w:r>
+        <w:rPr>
+          <w:lang w:val="en-US"/>
+        </w:rPr>
+        <w:t xml:space="preserve">, which is actual word match, </w:t>
       </w:r>
       <w:r>
         <w:rPr>
@@ -3817,7 +4784,35 @@
         <w:rPr>
           <w:lang w:val="en-US"/>
         </w:rPr>
-        <w:t xml:space="preserve"> similarity, tries to get similar meaning, where not exactly the same word exists. F1 score is generally lower. So we consider Answer quality avg score &gt; 4/10 as good, &gt;7/10 as excellent</w:t>
+        <w:t xml:space="preserve"> similarity, tries to get similar meaning, where not </w:t>
+      </w:r>
+      <w:proofErr w:type="gramStart"/>
+      <w:r>
+        <w:rPr>
+          <w:lang w:val="en-US"/>
+        </w:rPr>
+        <w:t>exactly the same</w:t>
+      </w:r>
+      <w:proofErr w:type="gramEnd"/>
+      <w:r>
+        <w:rPr>
+          <w:lang w:val="en-US"/>
+        </w:rPr>
+        <w:t xml:space="preserve"> word exists. F1 score is generally lower. </w:t>
+      </w:r>
+      <w:proofErr w:type="gramStart"/>
+      <w:r>
+        <w:rPr>
+          <w:lang w:val="en-US"/>
+        </w:rPr>
+        <w:t>So</w:t>
+      </w:r>
+      <w:proofErr w:type="gramEnd"/>
+      <w:r>
+        <w:rPr>
+          <w:lang w:val="en-US"/>
+        </w:rPr>
+        <w:t xml:space="preserve"> we consider Answer quality avg score &gt; 4/10 as good, &gt;7/10 as excellent</w:t>
       </w:r>
     </w:p>
     <w:p>
@@ -3908,6 +4903,7 @@
         </w:rPr>
         <w:t xml:space="preserve"> 10 questions at 0.8 is the lowest. Precision is lowest at 0.733 for question set 30-40. NDCG is at 0.975 for the same set, so it suggests that relevance is higher in the top 1 or 2 ranked chunks, and some lower ranks are not relevant, </w:t>
       </w:r>
+      <w:proofErr w:type="gramStart"/>
       <w:r>
         <w:rPr>
           <w:b/>
@@ -3916,7 +4912,18 @@
           <w:iCs/>
           <w:lang w:val="en-US"/>
         </w:rPr>
-        <w:t>So we default to 3</w:t>
+        <w:t>So</w:t>
+      </w:r>
+      <w:proofErr w:type="gramEnd"/>
+      <w:r>
+        <w:rPr>
+          <w:b/>
+          <w:bCs/>
+          <w:i/>
+          <w:iCs/>
+          <w:lang w:val="en-US"/>
+        </w:rPr>
+        <w:t xml:space="preserve"> we default to 3</w:t>
       </w:r>
       <w:r>
         <w:rPr>
@@ -4241,17 +5248,80 @@
       </w:r>
     </w:p>
     <w:p>
-      <w:r>
+      <w:pPr>
+        <w:rPr>
+          <w:i/>
+          <w:iCs/>
+        </w:rPr>
+      </w:pPr>
+      <w:r>
+        <w:rPr>
+          <w:i/>
+          <w:iCs/>
+        </w:rPr>
         <w:t xml:space="preserve">If we keep k hybrid = 3, k sparse and k dense at </w:t>
       </w:r>
-      <w:r>
+      <w:proofErr w:type="gramStart"/>
+      <w:r>
+        <w:rPr>
+          <w:i/>
+          <w:iCs/>
+        </w:rPr>
         <w:t>3</w:t>
       </w:r>
       <w:r>
-        <w:t xml:space="preserve"> , the semantic similarity and AnswerF1 does slightly better. So we use these values for our hybrid retrieval solution.</w:t>
-      </w:r>
-      <w:r>
-        <w:t xml:space="preserve"> Also precion@3 and NDCG@3 is the highest</w:t>
+        <w:rPr>
+          <w:i/>
+          <w:iCs/>
+        </w:rPr>
+        <w:t xml:space="preserve"> ,</w:t>
+      </w:r>
+      <w:proofErr w:type="gramEnd"/>
+      <w:r>
+        <w:rPr>
+          <w:i/>
+          <w:iCs/>
+        </w:rPr>
+        <w:t xml:space="preserve"> the semantic similarity and AnswerF1 does slightly better. </w:t>
+      </w:r>
+      <w:proofErr w:type="gramStart"/>
+      <w:r>
+        <w:rPr>
+          <w:i/>
+          <w:iCs/>
+        </w:rPr>
+        <w:t>So</w:t>
+      </w:r>
+      <w:proofErr w:type="gramEnd"/>
+      <w:r>
+        <w:rPr>
+          <w:i/>
+          <w:iCs/>
+        </w:rPr>
+        <w:t xml:space="preserve"> we use these values for our hybrid retrieval solution.</w:t>
+      </w:r>
+      <w:r>
+        <w:rPr>
+          <w:i/>
+          <w:iCs/>
+        </w:rPr>
+        <w:t xml:space="preserve"> </w:t>
+      </w:r>
+      <w:proofErr w:type="gramStart"/>
+      <w:r>
+        <w:rPr>
+          <w:i/>
+          <w:iCs/>
+        </w:rPr>
+        <w:t>Also</w:t>
+      </w:r>
+      <w:proofErr w:type="gramEnd"/>
+      <w:r>
+        <w:rPr>
+          <w:i/>
+          <w:iCs/>
+        </w:rPr>
+        <w:t xml:space="preserve"> precion@3 and NDCG@3 is the highest</w:t>
       </w:r>
     </w:p>
     <w:p/>
@@ -4304,6 +5374,46 @@
       <w:r>
         <w:t>Basic check for valid question/query input implemented.</w:t>
       </w:r>
+      <w:r>
+        <w:t xml:space="preserve"> </w:t>
+      </w:r>
+    </w:p>
+    <w:p>
+      <w:pPr>
+        <w:rPr>
+          <w:lang w:val="en-US"/>
+        </w:rPr>
+      </w:pPr>
+      <w:r>
+        <w:t>Implementation at (</w:t>
+      </w:r>
+      <w:proofErr w:type="spellStart"/>
+      <w:r>
+        <w:t>src</w:t>
+      </w:r>
+      <w:proofErr w:type="spellEnd"/>
+      <w:proofErr w:type="gramStart"/>
+      <w:r>
+        <w:t>\evaluation\eval_MRR.py</w:t>
+      </w:r>
+      <w:r>
+        <w:t xml:space="preserve">)  </w:t>
+      </w:r>
+      <w:r>
+        <w:rPr>
+          <w:rFonts w:ascii="Consolas" w:hAnsi="Consolas"/>
+          <w:lang w:val="en-US"/>
+        </w:rPr>
+        <w:t>is</w:t>
+      </w:r>
+      <w:proofErr w:type="gramEnd"/>
+      <w:r>
+        <w:rPr>
+          <w:rFonts w:ascii="Consolas" w:hAnsi="Consolas"/>
+          <w:lang w:val="en-US"/>
+        </w:rPr>
+        <w:t>_valid_question_strict</w:t>
+      </w:r>
     </w:p>
     <w:p>
       <w:r>
@@ -4319,8 +5429,13 @@
       <w:r>
         <w:t xml:space="preserve">2. </w:t>
       </w:r>
-      <w:r>
-        <w:t xml:space="preserve">qchecker based on </w:t>
+      <w:proofErr w:type="spellStart"/>
+      <w:r>
+        <w:t>qchecker</w:t>
+      </w:r>
+      <w:proofErr w:type="spellEnd"/>
+      <w:r>
+        <w:t xml:space="preserve"> based on </w:t>
       </w:r>
       <w:r>
         <w:rPr>
@@ -4334,18 +5449,58 @@
         </w:rPr>
         <w:t xml:space="preserve"> with following prompt:</w:t>
       </w:r>
-    </w:p>
-    <w:p>
-      <w:pPr>
-        <w:rPr>
-          <w:lang w:val="en-US"/>
-        </w:rPr>
-      </w:pPr>
-      <w:r>
-        <w:rPr>
-          <w:lang w:val="en-US"/>
-        </w:rPr>
-        <w:t>If the question is invalid it fails in 1. Itself, else we pass it to LM. FLAN is being used with STRICT command here, however if for some VALID question we see it return “no” added it to VALID example in the prompt, a few example as below</w:t>
+      <w:r>
+        <w:rPr>
+          <w:lang w:val="en-US"/>
+        </w:rPr>
+        <w:t xml:space="preserve"> (</w:t>
+      </w:r>
+      <w:proofErr w:type="spellStart"/>
+      <w:r>
+        <w:rPr>
+          <w:lang w:val="en-US"/>
+        </w:rPr>
+        <w:t>src</w:t>
+      </w:r>
+      <w:proofErr w:type="spellEnd"/>
+      <w:r>
+        <w:rPr>
+          <w:lang w:val="en-US"/>
+        </w:rPr>
+        <w:t>\retrieval\qchecker.py</w:t>
+      </w:r>
+      <w:r>
+        <w:rPr>
+          <w:lang w:val="en-US"/>
+        </w:rPr>
+        <w:t>)</w:t>
+      </w:r>
+    </w:p>
+    <w:p>
+      <w:pPr>
+        <w:rPr>
+          <w:lang w:val="en-US"/>
+        </w:rPr>
+      </w:pPr>
+      <w:r>
+        <w:rPr>
+          <w:lang w:val="en-US"/>
+        </w:rPr>
+        <w:t xml:space="preserve">If the question is invalid it fails in 1. Itself, else we pass it to LM. FLAN is being used with STRICT command here, however if for some VALID question we see it return “no” added it to VALID example in the prompt, a few </w:t>
+      </w:r>
+      <w:proofErr w:type="gramStart"/>
+      <w:r>
+        <w:rPr>
+          <w:lang w:val="en-US"/>
+        </w:rPr>
+        <w:t>example</w:t>
+      </w:r>
+      <w:proofErr w:type="gramEnd"/>
+      <w:r>
+        <w:rPr>
+          <w:lang w:val="en-US"/>
+        </w:rPr>
+        <w:t xml:space="preserve"> as below</w:t>
       </w:r>
     </w:p>
     <w:p>
@@ -4389,7 +5544,18 @@
           <w:lang w:val="en-US"/>
         </w:rPr>
         <w:noBreakHyphen/>
-        <w:t>formed question.</w:t>
+        <w:t xml:space="preserve">formed </w:t>
+      </w:r>
+      <w:proofErr w:type="gramStart"/>
+      <w:r>
+        <w:rPr>
+          <w:rFonts w:ascii="Consolas" w:eastAsia="Times New Roman" w:hAnsi="Consolas" w:cs="Times New Roman"/>
+          <w:color w:val="CE9178"/>
+          <w:sz w:val="21"/>
+          <w:szCs w:val="21"/>
+          <w:lang w:val="en-US"/>
+        </w:rPr>
+        <w:t>question.</w:t>
       </w:r>
       <w:r>
         <w:rPr>
@@ -4401,6 +5567,7 @@
         </w:rPr>
         <w:t>\n\n</w:t>
       </w:r>
+      <w:proofErr w:type="gramEnd"/>
       <w:r>
         <w:rPr>
           <w:rFonts w:ascii="Consolas" w:eastAsia="Times New Roman" w:hAnsi="Consolas" w:cs="Times New Roman"/>
@@ -4665,7 +5832,18 @@
           <w:szCs w:val="21"/>
           <w:lang w:val="en-US"/>
         </w:rPr>
-        <w:t>"- Start with a question word (e.g. what, why, how) or an auxiliary verb (e.g. is, can)</w:t>
+        <w:t xml:space="preserve">"- Start with a question word (e.g. what, why, how) or an auxiliary verb (e.g. is, </w:t>
+      </w:r>
+      <w:proofErr w:type="gramStart"/>
+      <w:r>
+        <w:rPr>
+          <w:rFonts w:ascii="Consolas" w:eastAsia="Times New Roman" w:hAnsi="Consolas" w:cs="Times New Roman"/>
+          <w:color w:val="CE9178"/>
+          <w:sz w:val="21"/>
+          <w:szCs w:val="21"/>
+          <w:lang w:val="en-US"/>
+        </w:rPr>
+        <w:t>can)</w:t>
       </w:r>
       <w:r>
         <w:rPr>
@@ -4675,7 +5853,18 @@
           <w:szCs w:val="21"/>
           <w:lang w:val="en-US"/>
         </w:rPr>
-        <w:t>\n</w:t>
+        <w:t>\</w:t>
+      </w:r>
+      <w:proofErr w:type="gramEnd"/>
+      <w:r>
+        <w:rPr>
+          <w:rFonts w:ascii="Consolas" w:eastAsia="Times New Roman" w:hAnsi="Consolas" w:cs="Times New Roman"/>
+          <w:color w:val="D7BA7D"/>
+          <w:sz w:val="21"/>
+          <w:szCs w:val="21"/>
+          <w:lang w:val="en-US"/>
+        </w:rPr>
+        <w:t>n</w:t>
       </w:r>
       <w:r>
         <w:rPr>
@@ -4718,7 +5907,18 @@
           <w:szCs w:val="21"/>
           <w:lang w:val="en-US"/>
         </w:rPr>
-        <w:t>"- Starts with Explain, Define, Compare, or Contrast are also valid question starters.</w:t>
+        <w:t xml:space="preserve">"- Starts with Explain, Define, Compare, or Contrast are also valid question </w:t>
+      </w:r>
+      <w:proofErr w:type="gramStart"/>
+      <w:r>
+        <w:rPr>
+          <w:rFonts w:ascii="Consolas" w:eastAsia="Times New Roman" w:hAnsi="Consolas" w:cs="Times New Roman"/>
+          <w:color w:val="CE9178"/>
+          <w:sz w:val="21"/>
+          <w:szCs w:val="21"/>
+          <w:lang w:val="en-US"/>
+        </w:rPr>
+        <w:t>starters.</w:t>
       </w:r>
       <w:r>
         <w:rPr>
@@ -4730,6 +5930,7 @@
         </w:rPr>
         <w:t>\n\n</w:t>
       </w:r>
+      <w:proofErr w:type="gramEnd"/>
       <w:r>
         <w:rPr>
           <w:rFonts w:ascii="Consolas" w:eastAsia="Times New Roman" w:hAnsi="Consolas" w:cs="Times New Roman"/>
@@ -4824,7 +6025,18 @@
           <w:szCs w:val="21"/>
           <w:lang w:val="en-US"/>
         </w:rPr>
-        <w:t>"- What is hybrid RAG?</w:t>
+        <w:t xml:space="preserve">"- What is hybrid </w:t>
+      </w:r>
+      <w:proofErr w:type="gramStart"/>
+      <w:r>
+        <w:rPr>
+          <w:rFonts w:ascii="Consolas" w:eastAsia="Times New Roman" w:hAnsi="Consolas" w:cs="Times New Roman"/>
+          <w:color w:val="CE9178"/>
+          <w:sz w:val="21"/>
+          <w:szCs w:val="21"/>
+          <w:lang w:val="en-US"/>
+        </w:rPr>
+        <w:t>RAG?</w:t>
       </w:r>
       <w:r>
         <w:rPr>
@@ -4834,7 +6046,18 @@
           <w:szCs w:val="21"/>
           <w:lang w:val="en-US"/>
         </w:rPr>
-        <w:t>\n</w:t>
+        <w:t>\</w:t>
+      </w:r>
+      <w:proofErr w:type="gramEnd"/>
+      <w:r>
+        <w:rPr>
+          <w:rFonts w:ascii="Consolas" w:eastAsia="Times New Roman" w:hAnsi="Consolas" w:cs="Times New Roman"/>
+          <w:color w:val="D7BA7D"/>
+          <w:sz w:val="21"/>
+          <w:szCs w:val="21"/>
+          <w:lang w:val="en-US"/>
+        </w:rPr>
+        <w:t>n</w:t>
       </w:r>
       <w:r>
         <w:rPr>
@@ -4877,7 +6100,18 @@
           <w:szCs w:val="21"/>
           <w:lang w:val="en-US"/>
         </w:rPr>
-        <w:t>"- How does BM25 scoring work?</w:t>
+        <w:t xml:space="preserve">"- How does BM25 scoring </w:t>
+      </w:r>
+      <w:proofErr w:type="gramStart"/>
+      <w:r>
+        <w:rPr>
+          <w:rFonts w:ascii="Consolas" w:eastAsia="Times New Roman" w:hAnsi="Consolas" w:cs="Times New Roman"/>
+          <w:color w:val="CE9178"/>
+          <w:sz w:val="21"/>
+          <w:szCs w:val="21"/>
+          <w:lang w:val="en-US"/>
+        </w:rPr>
+        <w:t>work?</w:t>
       </w:r>
       <w:r>
         <w:rPr>
@@ -4889,6 +6123,7 @@
         </w:rPr>
         <w:t>\n\n</w:t>
       </w:r>
+      <w:proofErr w:type="gramEnd"/>
       <w:r>
         <w:rPr>
           <w:rFonts w:ascii="Consolas" w:eastAsia="Times New Roman" w:hAnsi="Consolas" w:cs="Times New Roman"/>
@@ -5056,7 +6291,18 @@
           <w:szCs w:val="21"/>
           <w:lang w:val="en-US"/>
         </w:rPr>
-        <w:t>"- Compare and contrast dense and sparse retrieval methods.</w:t>
+        <w:t xml:space="preserve">"- Compare and contrast dense and sparse retrieval </w:t>
+      </w:r>
+      <w:proofErr w:type="gramStart"/>
+      <w:r>
+        <w:rPr>
+          <w:rFonts w:ascii="Consolas" w:eastAsia="Times New Roman" w:hAnsi="Consolas" w:cs="Times New Roman"/>
+          <w:color w:val="CE9178"/>
+          <w:sz w:val="21"/>
+          <w:szCs w:val="21"/>
+          <w:lang w:val="en-US"/>
+        </w:rPr>
+        <w:t>methods.</w:t>
       </w:r>
       <w:r>
         <w:rPr>
@@ -5068,6 +6314,7 @@
         </w:rPr>
         <w:t>\n\n</w:t>
       </w:r>
+      <w:proofErr w:type="gramEnd"/>
       <w:r>
         <w:rPr>
           <w:rFonts w:ascii="Consolas" w:eastAsia="Times New Roman" w:hAnsi="Consolas" w:cs="Times New Roman"/>
@@ -5162,8 +6409,20 @@
           <w:szCs w:val="21"/>
           <w:lang w:val="en-US"/>
         </w:rPr>
-        <w:t>"- Hello world ?</w:t>
-      </w:r>
+        <w:t xml:space="preserve">"- Hello </w:t>
+      </w:r>
+      <w:proofErr w:type="gramStart"/>
+      <w:r>
+        <w:rPr>
+          <w:rFonts w:ascii="Consolas" w:eastAsia="Times New Roman" w:hAnsi="Consolas" w:cs="Times New Roman"/>
+          <w:color w:val="CE9178"/>
+          <w:sz w:val="21"/>
+          <w:szCs w:val="21"/>
+          <w:lang w:val="en-US"/>
+        </w:rPr>
+        <w:t>world ?</w:t>
+      </w:r>
+      <w:proofErr w:type="gramEnd"/>
       <w:r>
         <w:rPr>
           <w:rFonts w:ascii="Consolas" w:eastAsia="Times New Roman" w:hAnsi="Consolas" w:cs="Times New Roman"/>
@@ -5268,7 +6527,18 @@
           <w:szCs w:val="21"/>
           <w:lang w:val="en-US"/>
         </w:rPr>
-        <w:t>"- How are you doing today?</w:t>
+        <w:t xml:space="preserve">"- How are you doing </w:t>
+      </w:r>
+      <w:proofErr w:type="gramStart"/>
+      <w:r>
+        <w:rPr>
+          <w:rFonts w:ascii="Consolas" w:eastAsia="Times New Roman" w:hAnsi="Consolas" w:cs="Times New Roman"/>
+          <w:color w:val="CE9178"/>
+          <w:sz w:val="21"/>
+          <w:szCs w:val="21"/>
+          <w:lang w:val="en-US"/>
+        </w:rPr>
+        <w:t>today?</w:t>
       </w:r>
       <w:r>
         <w:rPr>
@@ -5278,7 +6548,18 @@
           <w:szCs w:val="21"/>
           <w:lang w:val="en-US"/>
         </w:rPr>
-        <w:t>\n</w:t>
+        <w:t>\</w:t>
+      </w:r>
+      <w:proofErr w:type="gramEnd"/>
+      <w:r>
+        <w:rPr>
+          <w:rFonts w:ascii="Consolas" w:eastAsia="Times New Roman" w:hAnsi="Consolas" w:cs="Times New Roman"/>
+          <w:color w:val="D7BA7D"/>
+          <w:sz w:val="21"/>
+          <w:szCs w:val="21"/>
+          <w:lang w:val="en-US"/>
+        </w:rPr>
+        <w:t>n</w:t>
       </w:r>
       <w:r>
         <w:rPr>
@@ -5321,7 +6602,18 @@
           <w:szCs w:val="21"/>
           <w:lang w:val="en-US"/>
         </w:rPr>
-        <w:t>"- Greetings, how are you?</w:t>
+        <w:t xml:space="preserve">"- Greetings, how are </w:t>
+      </w:r>
+      <w:proofErr w:type="gramStart"/>
+      <w:r>
+        <w:rPr>
+          <w:rFonts w:ascii="Consolas" w:eastAsia="Times New Roman" w:hAnsi="Consolas" w:cs="Times New Roman"/>
+          <w:color w:val="CE9178"/>
+          <w:sz w:val="21"/>
+          <w:szCs w:val="21"/>
+          <w:lang w:val="en-US"/>
+        </w:rPr>
+        <w:t>you?</w:t>
       </w:r>
       <w:r>
         <w:rPr>
@@ -5331,7 +6623,18 @@
           <w:szCs w:val="21"/>
           <w:lang w:val="en-US"/>
         </w:rPr>
-        <w:t>\n</w:t>
+        <w:t>\</w:t>
+      </w:r>
+      <w:proofErr w:type="gramEnd"/>
+      <w:r>
+        <w:rPr>
+          <w:rFonts w:ascii="Consolas" w:eastAsia="Times New Roman" w:hAnsi="Consolas" w:cs="Times New Roman"/>
+          <w:color w:val="D7BA7D"/>
+          <w:sz w:val="21"/>
+          <w:szCs w:val="21"/>
+          <w:lang w:val="en-US"/>
+        </w:rPr>
+        <w:t>n</w:t>
       </w:r>
       <w:r>
         <w:rPr>
@@ -5374,7 +6677,18 @@
           <w:szCs w:val="21"/>
           <w:lang w:val="en-US"/>
         </w:rPr>
-        <w:t>"- Hello, can you help me?</w:t>
+        <w:t xml:space="preserve">"- Hello, can you help </w:t>
+      </w:r>
+      <w:proofErr w:type="gramStart"/>
+      <w:r>
+        <w:rPr>
+          <w:rFonts w:ascii="Consolas" w:eastAsia="Times New Roman" w:hAnsi="Consolas" w:cs="Times New Roman"/>
+          <w:color w:val="CE9178"/>
+          <w:sz w:val="21"/>
+          <w:szCs w:val="21"/>
+          <w:lang w:val="en-US"/>
+        </w:rPr>
+        <w:t>me?</w:t>
       </w:r>
       <w:r>
         <w:rPr>
@@ -5386,6 +6700,7 @@
         </w:rPr>
         <w:t>\n\n</w:t>
       </w:r>
+      <w:proofErr w:type="gramEnd"/>
       <w:r>
         <w:rPr>
           <w:rFonts w:ascii="Consolas" w:eastAsia="Times New Roman" w:hAnsi="Consolas" w:cs="Times New Roman"/>
@@ -5472,6 +6787,7 @@
         </w:rPr>
         <w:t xml:space="preserve">        </w:t>
       </w:r>
+      <w:proofErr w:type="spellStart"/>
       <w:r>
         <w:rPr>
           <w:rFonts w:ascii="Consolas" w:eastAsia="Times New Roman" w:hAnsi="Consolas" w:cs="Times New Roman"/>
@@ -5490,7 +6806,18 @@
           <w:szCs w:val="21"/>
           <w:lang w:val="en-US"/>
         </w:rPr>
-        <w:t xml:space="preserve">"Text: </w:t>
+        <w:t>"Text</w:t>
+      </w:r>
+      <w:proofErr w:type="spellEnd"/>
+      <w:r>
+        <w:rPr>
+          <w:rFonts w:ascii="Consolas" w:eastAsia="Times New Roman" w:hAnsi="Consolas" w:cs="Times New Roman"/>
+          <w:color w:val="CE9178"/>
+          <w:sz w:val="21"/>
+          <w:szCs w:val="21"/>
+          <w:lang w:val="en-US"/>
+        </w:rPr>
+        <w:t xml:space="preserve">: </w:t>
       </w:r>
       <w:r>
         <w:rPr>
@@ -5601,12 +6928,33 @@
           <w:lang w:val="en-US"/>
         </w:rPr>
       </w:pPr>
-      <w:r>
-        <w:rPr>
-          <w:lang w:val="en-US"/>
-        </w:rPr>
-        <w:lastRenderedPageBreak/>
-        <w:t>Incase for some valid questions the LM responds no, then add to the valid prompt. Also from testing if some invalid questions are not detected, adding them in the INVALID example prompt helps the LM identify it as invalid</w:t>
+      <w:proofErr w:type="spellStart"/>
+      <w:r>
+        <w:rPr>
+          <w:lang w:val="en-US"/>
+        </w:rPr>
+        <w:t>Incase</w:t>
+      </w:r>
+      <w:proofErr w:type="spellEnd"/>
+      <w:r>
+        <w:rPr>
+          <w:lang w:val="en-US"/>
+        </w:rPr>
+        <w:t xml:space="preserve"> for some valid questions the LM responds no, then add to the valid prompt. </w:t>
+      </w:r>
+      <w:proofErr w:type="gramStart"/>
+      <w:r>
+        <w:rPr>
+          <w:lang w:val="en-US"/>
+        </w:rPr>
+        <w:t>Also</w:t>
+      </w:r>
+      <w:proofErr w:type="gramEnd"/>
+      <w:r>
+        <w:rPr>
+          <w:lang w:val="en-US"/>
+        </w:rPr>
+        <w:t xml:space="preserve"> from testing if some invalid questions are not detected, adding them in the INVALID example prompt helps the LM identify it as invalid</w:t>
       </w:r>
     </w:p>
     <w:p>
@@ -5791,6 +7139,11 @@
           </wp:inline>
         </w:drawing>
       </w:r>
+    </w:p>
+    <w:p>
+      <w:pPr>
+        <w:pStyle w:val="Heading2"/>
+      </w:pPr>
     </w:p>
     <w:p>
       <w:pPr>
@@ -5880,6 +7233,532 @@
         </w:drawing>
       </w:r>
     </w:p>
+    <w:p>
+      <w:pPr>
+        <w:pStyle w:val="Heading2"/>
+      </w:pPr>
+      <w:r>
+        <w:t>LLM as Judge implementation:</w:t>
+      </w:r>
+    </w:p>
+    <w:p>
+      <w:r>
+        <w:t>Due to resource constraint we attempted to implement our own LLM assisted automatic judging model as follows</w:t>
+      </w:r>
+    </w:p>
+    <w:p>
+      <w:r>
+        <w:t>src</w:t>
+      </w:r>
+      <w:proofErr w:type="gramStart"/>
+      <w:r>
+        <w:t>\evaluation\llm_as_judge.py</w:t>
+      </w:r>
+      <w:r>
+        <w:t xml:space="preserve"> :</w:t>
+      </w:r>
+      <w:proofErr w:type="gramEnd"/>
+    </w:p>
+    <w:p>
+      <w:pPr>
+        <w:rPr>
+          <w:lang w:val="en-US"/>
+        </w:rPr>
+      </w:pPr>
+      <w:proofErr w:type="spellStart"/>
+      <w:r>
+        <w:rPr>
+          <w:lang w:val="en-US"/>
+        </w:rPr>
+        <w:t>llm_as_judge</w:t>
+      </w:r>
+      <w:proofErr w:type="spellEnd"/>
+      <w:r>
+        <w:rPr>
+          <w:lang w:val="en-US"/>
+        </w:rPr>
+        <w:t xml:space="preserve"> using </w:t>
+      </w:r>
+      <w:r>
+        <w:rPr>
+          <w:lang w:val="en-US"/>
+        </w:rPr>
+        <w:t>google/flan-t5-</w:t>
+      </w:r>
+      <w:proofErr w:type="gramStart"/>
+      <w:r>
+        <w:rPr>
+          <w:lang w:val="en-US"/>
+        </w:rPr>
+        <w:t>base</w:t>
+      </w:r>
+      <w:r>
+        <w:rPr>
+          <w:lang w:val="en-US"/>
+        </w:rPr>
+        <w:t xml:space="preserve"> ,</w:t>
+      </w:r>
+      <w:proofErr w:type="gramEnd"/>
+      <w:r>
+        <w:rPr>
+          <w:lang w:val="en-US"/>
+        </w:rPr>
+        <w:t xml:space="preserve">  </w:t>
+      </w:r>
+      <w:proofErr w:type="gramStart"/>
+      <w:r>
+        <w:rPr>
+          <w:lang w:val="en-US"/>
+        </w:rPr>
+        <w:t>Generate</w:t>
+      </w:r>
+      <w:proofErr w:type="gramEnd"/>
+      <w:r>
+        <w:rPr>
+          <w:lang w:val="en-US"/>
+        </w:rPr>
+        <w:t xml:space="preserve"> n questions based on random chunks, with sample answer.</w:t>
+      </w:r>
+    </w:p>
+    <w:p>
+      <w:pPr>
+        <w:rPr>
+          <w:lang w:val="en-US"/>
+        </w:rPr>
+      </w:pPr>
+      <w:r>
+        <w:rPr>
+          <w:lang w:val="en-US"/>
+        </w:rPr>
+        <w:t xml:space="preserve">Using the n evaluation questions, we supply these to our hybrid retrieval system </w:t>
+      </w:r>
+      <w:proofErr w:type="spellStart"/>
+      <w:r>
+        <w:rPr>
+          <w:lang w:val="en-US"/>
+        </w:rPr>
+        <w:t>retrieve_</w:t>
+      </w:r>
+      <w:proofErr w:type="gramStart"/>
+      <w:r>
+        <w:rPr>
+          <w:lang w:val="en-US"/>
+        </w:rPr>
+        <w:t>hybrid</w:t>
+      </w:r>
+      <w:proofErr w:type="spellEnd"/>
+      <w:r>
+        <w:rPr>
+          <w:lang w:val="en-US"/>
+        </w:rPr>
+        <w:t>(</w:t>
+      </w:r>
+      <w:proofErr w:type="gramEnd"/>
+      <w:r>
+        <w:rPr>
+          <w:lang w:val="en-US"/>
+        </w:rPr>
+        <w:t xml:space="preserve">query, dense, sparse, </w:t>
+      </w:r>
+      <w:proofErr w:type="spellStart"/>
+      <w:r>
+        <w:rPr>
+          <w:lang w:val="en-US"/>
+        </w:rPr>
+        <w:t>top_n</w:t>
+      </w:r>
+      <w:proofErr w:type="spellEnd"/>
+      <w:r>
+        <w:rPr>
+          <w:lang w:val="en-US"/>
+        </w:rPr>
+        <w:t>=3</w:t>
+      </w:r>
+      <w:proofErr w:type="gramStart"/>
+      <w:r>
+        <w:rPr>
+          <w:lang w:val="en-US"/>
+        </w:rPr>
+        <w:t>)</w:t>
+      </w:r>
+      <w:r>
+        <w:rPr>
+          <w:lang w:val="en-US"/>
+        </w:rPr>
+        <w:t>, and</w:t>
+      </w:r>
+      <w:proofErr w:type="gramEnd"/>
+      <w:r>
+        <w:rPr>
+          <w:lang w:val="en-US"/>
+        </w:rPr>
+        <w:t xml:space="preserve"> use the retried chunks to augment the supplied question and supply to </w:t>
+      </w:r>
+      <w:r>
+        <w:rPr>
+          <w:lang w:val="en-US"/>
+        </w:rPr>
+        <w:t>google/flan-t5-base</w:t>
+      </w:r>
+      <w:r>
+        <w:rPr>
+          <w:lang w:val="en-US"/>
+        </w:rPr>
+        <w:t xml:space="preserve"> to generate responses.</w:t>
+      </w:r>
+    </w:p>
+    <w:p>
+      <w:pPr>
+        <w:rPr>
+          <w:lang w:val="en-US"/>
+        </w:rPr>
+      </w:pPr>
+      <w:r>
+        <w:rPr>
+          <w:lang w:val="en-US"/>
+        </w:rPr>
+        <w:lastRenderedPageBreak/>
+        <w:t>These generated responses are evaluated for semantic similarity, by calculating cosine similarity between word embeddings between golden answer and generated response.</w:t>
+      </w:r>
+    </w:p>
+    <w:p>
+      <w:pPr>
+        <w:rPr>
+          <w:lang w:val="en-US"/>
+        </w:rPr>
+      </w:pPr>
+      <w:proofErr w:type="gramStart"/>
+      <w:r>
+        <w:rPr>
+          <w:lang w:val="en-US"/>
+        </w:rPr>
+        <w:t>Also</w:t>
+      </w:r>
+      <w:proofErr w:type="gramEnd"/>
+      <w:r>
+        <w:rPr>
+          <w:lang w:val="en-US"/>
+        </w:rPr>
+        <w:t xml:space="preserve"> NDCG value for the retrieved chunks to generate response is calculated.</w:t>
+      </w:r>
+    </w:p>
+    <w:p>
+      <w:pPr>
+        <w:rPr>
+          <w:lang w:val="en-US"/>
+        </w:rPr>
+      </w:pPr>
+      <w:r>
+        <w:rPr>
+          <w:lang w:val="en-US"/>
+        </w:rPr>
+        <w:t xml:space="preserve">Score for </w:t>
+      </w:r>
+      <w:r>
+        <w:rPr>
+          <w:lang w:val="en-US"/>
+        </w:rPr>
+        <w:t xml:space="preserve">response </w:t>
+      </w:r>
+      <w:proofErr w:type="gramStart"/>
+      <w:r>
+        <w:rPr>
+          <w:lang w:val="en-US"/>
+        </w:rPr>
+        <w:t xml:space="preserve">is </w:t>
+      </w:r>
+      <w:r>
+        <w:rPr>
+          <w:lang w:val="en-US"/>
+        </w:rPr>
+        <w:t xml:space="preserve"> </w:t>
+      </w:r>
+      <w:proofErr w:type="spellStart"/>
+      <w:r>
+        <w:rPr>
+          <w:lang w:val="en-US"/>
+        </w:rPr>
+        <w:t>semantic</w:t>
+      </w:r>
+      <w:proofErr w:type="gramEnd"/>
+      <w:r>
+        <w:rPr>
+          <w:lang w:val="en-US"/>
+        </w:rPr>
+        <w:t>_score</w:t>
+      </w:r>
+      <w:proofErr w:type="spellEnd"/>
+      <w:r>
+        <w:rPr>
+          <w:lang w:val="en-US"/>
+        </w:rPr>
+        <w:t>*</w:t>
+      </w:r>
+      <w:proofErr w:type="spellStart"/>
+      <w:r>
+        <w:rPr>
+          <w:lang w:val="en-US"/>
+        </w:rPr>
+        <w:t>NDCG_score</w:t>
+      </w:r>
+      <w:proofErr w:type="spellEnd"/>
+      <w:r>
+        <w:rPr>
+          <w:lang w:val="en-US"/>
+        </w:rPr>
+        <w:t>.</w:t>
+      </w:r>
+    </w:p>
+    <w:p>
+      <w:pPr>
+        <w:rPr>
+          <w:lang w:val="en-US"/>
+        </w:rPr>
+      </w:pPr>
+      <w:r>
+        <w:rPr>
+          <w:lang w:val="en-US"/>
+        </w:rPr>
+        <w:t>For n responses the average “score” is calculated.</w:t>
+      </w:r>
+    </w:p>
+    <w:p>
+      <w:pPr>
+        <w:rPr>
+          <w:lang w:val="en-US"/>
+        </w:rPr>
+      </w:pPr>
+    </w:p>
+    <w:p>
+      <w:pPr>
+        <w:rPr>
+          <w:lang w:val="en-US"/>
+        </w:rPr>
+      </w:pPr>
+      <w:r>
+        <w:rPr>
+          <w:lang w:val="en-US"/>
+        </w:rPr>
+        <w:drawing>
+          <wp:inline distT="0" distB="0" distL="0" distR="0" wp14:anchorId="417DA69F" wp14:editId="19F468E2">
+            <wp:extent cx="6949048" cy="692150"/>
+            <wp:effectExtent l="0" t="0" r="4445" b="0"/>
+            <wp:docPr id="1557430020" name="Picture 1"/>
+            <wp:cNvGraphicFramePr>
+              <a:graphicFrameLocks xmlns:a="http://schemas.openxmlformats.org/drawingml/2006/main" noChangeAspect="1"/>
+            </wp:cNvGraphicFramePr>
+            <a:graphic xmlns:a="http://schemas.openxmlformats.org/drawingml/2006/main">
+              <a:graphicData uri="http://schemas.openxmlformats.org/drawingml/2006/picture">
+                <pic:pic xmlns:pic="http://schemas.openxmlformats.org/drawingml/2006/picture">
+                  <pic:nvPicPr>
+                    <pic:cNvPr id="1557430020" name=""/>
+                    <pic:cNvPicPr/>
+                  </pic:nvPicPr>
+                  <pic:blipFill>
+                    <a:blip r:embed="rId26"/>
+                    <a:stretch>
+                      <a:fillRect/>
+                    </a:stretch>
+                  </pic:blipFill>
+                  <pic:spPr>
+                    <a:xfrm>
+                      <a:off x="0" y="0"/>
+                      <a:ext cx="6988681" cy="696098"/>
+                    </a:xfrm>
+                    <a:prstGeom prst="rect">
+                      <a:avLst/>
+                    </a:prstGeom>
+                  </pic:spPr>
+                </pic:pic>
+              </a:graphicData>
+            </a:graphic>
+          </wp:inline>
+        </w:drawing>
+      </w:r>
+    </w:p>
+    <w:p>
+      <w:pPr>
+        <w:rPr>
+          <w:lang w:val="en-US"/>
+        </w:rPr>
+      </w:pPr>
+      <w:r>
+        <w:rPr>
+          <w:lang w:val="en-US"/>
+        </w:rPr>
+        <w:drawing>
+          <wp:inline distT="0" distB="0" distL="0" distR="0" wp14:anchorId="077AFA2B" wp14:editId="14E5291D">
+            <wp:extent cx="6923253" cy="1104900"/>
+            <wp:effectExtent l="0" t="0" r="0" b="0"/>
+            <wp:docPr id="1901616590" name="Picture 1"/>
+            <wp:cNvGraphicFramePr>
+              <a:graphicFrameLocks xmlns:a="http://schemas.openxmlformats.org/drawingml/2006/main" noChangeAspect="1"/>
+            </wp:cNvGraphicFramePr>
+            <a:graphic xmlns:a="http://schemas.openxmlformats.org/drawingml/2006/main">
+              <a:graphicData uri="http://schemas.openxmlformats.org/drawingml/2006/picture">
+                <pic:pic xmlns:pic="http://schemas.openxmlformats.org/drawingml/2006/picture">
+                  <pic:nvPicPr>
+                    <pic:cNvPr id="1901616590" name=""/>
+                    <pic:cNvPicPr/>
+                  </pic:nvPicPr>
+                  <pic:blipFill>
+                    <a:blip r:embed="rId27"/>
+                    <a:stretch>
+                      <a:fillRect/>
+                    </a:stretch>
+                  </pic:blipFill>
+                  <pic:spPr>
+                    <a:xfrm>
+                      <a:off x="0" y="0"/>
+                      <a:ext cx="6929279" cy="1105862"/>
+                    </a:xfrm>
+                    <a:prstGeom prst="rect">
+                      <a:avLst/>
+                    </a:prstGeom>
+                  </pic:spPr>
+                </pic:pic>
+              </a:graphicData>
+            </a:graphic>
+          </wp:inline>
+        </w:drawing>
+      </w:r>
+    </w:p>
+    <w:p>
+      <w:pPr>
+        <w:rPr>
+          <w:lang w:val="en-US"/>
+        </w:rPr>
+      </w:pPr>
+      <w:r>
+        <w:rPr>
+          <w:lang w:val="en-US"/>
+        </w:rPr>
+        <w:drawing>
+          <wp:inline distT="0" distB="0" distL="0" distR="0" wp14:anchorId="6752F0CB" wp14:editId="5628E84B">
+            <wp:extent cx="6750050" cy="752475"/>
+            <wp:effectExtent l="0" t="0" r="0" b="9525"/>
+            <wp:docPr id="1445067019" name="Picture 1"/>
+            <wp:cNvGraphicFramePr>
+              <a:graphicFrameLocks xmlns:a="http://schemas.openxmlformats.org/drawingml/2006/main" noChangeAspect="1"/>
+            </wp:cNvGraphicFramePr>
+            <a:graphic xmlns:a="http://schemas.openxmlformats.org/drawingml/2006/main">
+              <a:graphicData uri="http://schemas.openxmlformats.org/drawingml/2006/picture">
+                <pic:pic xmlns:pic="http://schemas.openxmlformats.org/drawingml/2006/picture">
+                  <pic:nvPicPr>
+                    <pic:cNvPr id="1445067019" name=""/>
+                    <pic:cNvPicPr/>
+                  </pic:nvPicPr>
+                  <pic:blipFill>
+                    <a:blip r:embed="rId28"/>
+                    <a:stretch>
+                      <a:fillRect/>
+                    </a:stretch>
+                  </pic:blipFill>
+                  <pic:spPr>
+                    <a:xfrm>
+                      <a:off x="0" y="0"/>
+                      <a:ext cx="6750104" cy="752481"/>
+                    </a:xfrm>
+                    <a:prstGeom prst="rect">
+                      <a:avLst/>
+                    </a:prstGeom>
+                  </pic:spPr>
+                </pic:pic>
+              </a:graphicData>
+            </a:graphic>
+          </wp:inline>
+        </w:drawing>
+      </w:r>
+    </w:p>
+    <w:p>
+      <w:pPr>
+        <w:rPr>
+          <w:lang w:val="en-US"/>
+        </w:rPr>
+      </w:pPr>
+      <w:r>
+        <w:rPr>
+          <w:lang w:val="en-US"/>
+        </w:rPr>
+        <w:drawing>
+          <wp:inline distT="0" distB="0" distL="0" distR="0" wp14:anchorId="5A4C4C58" wp14:editId="5143CFBF">
+            <wp:extent cx="6984597" cy="641350"/>
+            <wp:effectExtent l="0" t="0" r="6985" b="6350"/>
+            <wp:docPr id="2046047526" name="Picture 1"/>
+            <wp:cNvGraphicFramePr>
+              <a:graphicFrameLocks xmlns:a="http://schemas.openxmlformats.org/drawingml/2006/main" noChangeAspect="1"/>
+            </wp:cNvGraphicFramePr>
+            <a:graphic xmlns:a="http://schemas.openxmlformats.org/drawingml/2006/main">
+              <a:graphicData uri="http://schemas.openxmlformats.org/drawingml/2006/picture">
+                <pic:pic xmlns:pic="http://schemas.openxmlformats.org/drawingml/2006/picture">
+                  <pic:nvPicPr>
+                    <pic:cNvPr id="2046047526" name=""/>
+                    <pic:cNvPicPr/>
+                  </pic:nvPicPr>
+                  <pic:blipFill>
+                    <a:blip r:embed="rId29"/>
+                    <a:stretch>
+                      <a:fillRect/>
+                    </a:stretch>
+                  </pic:blipFill>
+                  <pic:spPr>
+                    <a:xfrm>
+                      <a:off x="0" y="0"/>
+                      <a:ext cx="6990547" cy="641896"/>
+                    </a:xfrm>
+                    <a:prstGeom prst="rect">
+                      <a:avLst/>
+                    </a:prstGeom>
+                  </pic:spPr>
+                </pic:pic>
+              </a:graphicData>
+            </a:graphic>
+          </wp:inline>
+        </w:drawing>
+      </w:r>
+      <w:r>
+        <w:rPr>
+          <w:lang w:val="en-US"/>
+        </w:rPr>
+        <w:t xml:space="preserve"> </w:t>
+      </w:r>
+    </w:p>
+    <w:p>
+      <w:pPr>
+        <w:rPr>
+          <w:lang w:val="en-US"/>
+        </w:rPr>
+      </w:pPr>
+    </w:p>
+    <w:p>
+      <w:pPr>
+        <w:rPr>
+          <w:lang w:val="en-US"/>
+        </w:rPr>
+      </w:pPr>
+    </w:p>
+    <w:p>
+      <w:pPr>
+        <w:rPr>
+          <w:lang w:val="en-US"/>
+        </w:rPr>
+      </w:pPr>
+    </w:p>
+    <w:p>
+      <w:pPr>
+        <w:rPr>
+          <w:lang w:val="en-US"/>
+        </w:rPr>
+      </w:pPr>
+    </w:p>
+    <w:p>
+      <w:pPr>
+        <w:rPr>
+          <w:lang w:val="en-US"/>
+        </w:rPr>
+      </w:pPr>
+    </w:p>
+    <w:p/>
     <w:p>
       <w:pPr>
         <w:spacing w:before="100" w:beforeAutospacing="1" w:after="100" w:afterAutospacing="1" w:line="240" w:lineRule="auto"/>
@@ -6713,6 +8592,26 @@
       <w:color w:val="2F5496" w:themeColor="accent1" w:themeShade="BF"/>
     </w:rPr>
   </w:style>
+  <w:style w:type="paragraph" w:styleId="Heading5">
+    <w:name w:val="heading 5"/>
+    <w:basedOn w:val="Normal"/>
+    <w:next w:val="Normal"/>
+    <w:link w:val="Heading5Char"/>
+    <w:uiPriority w:val="9"/>
+    <w:unhideWhenUsed/>
+    <w:qFormat/>
+    <w:rsid w:val="00B367DD"/>
+    <w:pPr>
+      <w:keepNext/>
+      <w:keepLines/>
+      <w:spacing w:before="40" w:after="0"/>
+      <w:outlineLvl w:val="4"/>
+    </w:pPr>
+    <w:rPr>
+      <w:rFonts w:asciiTheme="majorHAnsi" w:eastAsiaTheme="majorEastAsia" w:hAnsiTheme="majorHAnsi" w:cstheme="majorBidi"/>
+      <w:color w:val="2F5496" w:themeColor="accent1" w:themeShade="BF"/>
+    </w:rPr>
+  </w:style>
   <w:style w:type="character" w:default="1" w:styleId="DefaultParagraphFont">
     <w:name w:val="Default Paragraph Font"/>
     <w:uiPriority w:val="1"/>
@@ -6904,6 +8803,17 @@
       <w:rFonts w:asciiTheme="majorHAnsi" w:eastAsiaTheme="majorEastAsia" w:hAnsiTheme="majorHAnsi" w:cstheme="majorBidi"/>
       <w:i/>
       <w:iCs/>
+      <w:color w:val="2F5496" w:themeColor="accent1" w:themeShade="BF"/>
+    </w:rPr>
+  </w:style>
+  <w:style w:type="character" w:customStyle="1" w:styleId="Heading5Char">
+    <w:name w:val="Heading 5 Char"/>
+    <w:basedOn w:val="DefaultParagraphFont"/>
+    <w:link w:val="Heading5"/>
+    <w:uiPriority w:val="9"/>
+    <w:rsid w:val="00B367DD"/>
+    <w:rPr>
+      <w:rFonts w:asciiTheme="majorHAnsi" w:eastAsiaTheme="majorEastAsia" w:hAnsiTheme="majorHAnsi" w:cstheme="majorBidi"/>
       <w:color w:val="2F5496" w:themeColor="accent1" w:themeShade="BF"/>
     </w:rPr>
   </w:style>

</xml_diff>